<commit_message>
[FIX] Validacion CFA v1.0
</commit_message>
<xml_diff>
--- a/fuentes/631101_CF5_DU.docx
+++ b/fuentes/631101_CF5_DU.docx
@@ -1,6 +1,6 @@
 
 <file path=word/document.xml><?xml version="1.0" encoding="utf-8"?>
-<w:document xmlns:wpc="http://schemas.microsoft.com/office/word/2010/wordprocessingCanvas" xmlns:cx="http://schemas.microsoft.com/office/drawing/2014/chartex" xmlns:cx1="http://schemas.microsoft.com/office/drawing/2015/9/8/chartex" xmlns:cx2="http://schemas.microsoft.com/office/drawing/2015/10/21/chartex" xmlns:cx3="http://schemas.microsoft.com/office/drawing/2016/5/9/chartex" xmlns:cx4="http://schemas.microsoft.com/office/drawing/2016/5/10/chartex" xmlns:cx5="http://schemas.microsoft.com/office/drawing/2016/5/11/chartex" xmlns:cx6="http://schemas.microsoft.com/office/drawing/2016/5/12/chartex" xmlns:cx7="http://schemas.microsoft.com/office/drawing/2016/5/13/chartex" xmlns:cx8="http://schemas.microsoft.com/office/drawing/2016/5/14/chartex" xmlns:mc="http://schemas.openxmlformats.org/markup-compatibility/2006" xmlns:aink="http://schemas.microsoft.com/office/drawing/2016/ink" xmlns:am3d="http://schemas.microsoft.com/office/drawing/2017/model3d" xmlns:o="urn:schemas-microsoft-com:office:office" xmlns:r="http://schemas.openxmlformats.org/officeDocument/2006/relationships" xmlns:m="http://schemas.openxmlformats.org/officeDocument/2006/math" xmlns:v="urn:schemas-microsoft-com:vml" xmlns:wp14="http://schemas.microsoft.com/office/word/2010/wordprocessingDrawing" xmlns:wp="http://schemas.openxmlformats.org/drawingml/2006/wordprocessingDrawing" xmlns:w10="urn:schemas-microsoft-com:office:word" xmlns:w="http://schemas.openxmlformats.org/wordprocessingml/2006/main" xmlns:w14="http://schemas.microsoft.com/office/word/2010/wordml" xmlns:w15="http://schemas.microsoft.com/office/word/2012/wordml" xmlns:w16cex="http://schemas.microsoft.com/office/word/2018/wordml/cex" xmlns:w16cid="http://schemas.microsoft.com/office/word/2016/wordml/cid" xmlns:w16="http://schemas.microsoft.com/office/word/2018/wordml" xmlns:w16sdtdh="http://schemas.microsoft.com/office/word/2020/wordml/sdtdatahash" xmlns:w16se="http://schemas.microsoft.com/office/word/2015/wordml/symex" xmlns:wpg="http://schemas.microsoft.com/office/word/2010/wordprocessingGroup" xmlns:wpi="http://schemas.microsoft.com/office/word/2010/wordprocessingInk" xmlns:wne="http://schemas.microsoft.com/office/word/2006/wordml" xmlns:wps="http://schemas.microsoft.com/office/word/2010/wordprocessingShape" mc:Ignorable="w14 w15 w16se w16cid w16 w16cex w16sdtdh wp14">
+<w:document xmlns:wpc="http://schemas.microsoft.com/office/word/2010/wordprocessingCanvas" xmlns:cx="http://schemas.microsoft.com/office/drawing/2014/chartex" xmlns:cx1="http://schemas.microsoft.com/office/drawing/2015/9/8/chartex" xmlns:cx2="http://schemas.microsoft.com/office/drawing/2015/10/21/chartex" xmlns:cx3="http://schemas.microsoft.com/office/drawing/2016/5/9/chartex" xmlns:cx4="http://schemas.microsoft.com/office/drawing/2016/5/10/chartex" xmlns:cx5="http://schemas.microsoft.com/office/drawing/2016/5/11/chartex" xmlns:cx6="http://schemas.microsoft.com/office/drawing/2016/5/12/chartex" xmlns:cx7="http://schemas.microsoft.com/office/drawing/2016/5/13/chartex" xmlns:cx8="http://schemas.microsoft.com/office/drawing/2016/5/14/chartex" xmlns:mc="http://schemas.openxmlformats.org/markup-compatibility/2006" xmlns:aink="http://schemas.microsoft.com/office/drawing/2016/ink" xmlns:am3d="http://schemas.microsoft.com/office/drawing/2017/model3d" xmlns:o="urn:schemas-microsoft-com:office:office" xmlns:r="http://schemas.openxmlformats.org/officeDocument/2006/relationships" xmlns:m="http://schemas.openxmlformats.org/officeDocument/2006/math" xmlns:v="urn:schemas-microsoft-com:vml" xmlns:wp14="http://schemas.microsoft.com/office/word/2010/wordprocessingDrawing" xmlns:wp="http://schemas.openxmlformats.org/drawingml/2006/wordprocessingDrawing" xmlns:w10="urn:schemas-microsoft-com:office:word" xmlns:w="http://schemas.openxmlformats.org/wordprocessingml/2006/main" xmlns:w14="http://schemas.microsoft.com/office/word/2010/wordml" xmlns:w15="http://schemas.microsoft.com/office/word/2012/wordml" xmlns:w16cex="http://schemas.microsoft.com/office/word/2018/wordml/cex" xmlns:w16cid="http://schemas.microsoft.com/office/word/2016/wordml/cid" xmlns:w16="http://schemas.microsoft.com/office/word/2018/wordml" xmlns:w16sdtdh="http://schemas.microsoft.com/office/word/2020/wordml/sdtdatahash" xmlns:w16se="http://schemas.microsoft.com/office/word/2015/wordml/symex" xmlns:wpg="http://schemas.microsoft.com/office/word/2010/wordprocessingGroup" xmlns:wpi="http://schemas.microsoft.com/office/word/2010/wordprocessingInk" xmlns:wne="http://schemas.microsoft.com/office/word/2006/wordml" xmlns:wps="http://schemas.microsoft.com/office/word/2010/wordprocessingShape" xmlns:a="http://schemas.openxmlformats.org/drawingml/2006/main" xmlns:adec="http://schemas.microsoft.com/office/drawing/2017/decorative" xmlns:pic="http://schemas.openxmlformats.org/drawingml/2006/picture" xmlns:a14="http://schemas.microsoft.com/office/drawing/2010/main" mc:Ignorable="w14 w15 w16se w16cid w16 w16cex w16sdtdh wp14">
   <w:body>
     <w:p>
       <w:r>
@@ -203,7 +203,7 @@
           </mc:Choice>
           <mc:Fallback>
             <w:pict>
-              <v:rect w14:anchorId="393B4CD3" id="Rectángulo 3" o:spid="_x0000_s1026" alt="&quot;&quot;" style="position:absolute;margin-left:-55.65pt;margin-top:26.95pt;width:613.85pt;height:165.5pt;z-index:-251655168;visibility:visible;mso-wrap-style:square;mso-height-percent:0;mso-wrap-distance-left:9pt;mso-wrap-distance-top:0;mso-wrap-distance-right:9pt;mso-wrap-distance-bottom:0;mso-position-horizontal:absolute;mso-position-horizontal-relative:text;mso-position-vertical:absolute;mso-position-vertical-relative:text;mso-height-percent:0;mso-height-relative:margin;v-text-anchor:middle" o:gfxdata="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" fillcolor="#00314d" stroked="f" strokeweight="1pt"/>
+              <v:rect id="Rectángulo 3" style="position:absolute;margin-left:-55.65pt;margin-top:26.95pt;width:613.85pt;height:165.5pt;z-index:-251655168;visibility:visible;mso-wrap-style:square;mso-height-percent:0;mso-wrap-distance-left:9pt;mso-wrap-distance-top:0;mso-wrap-distance-right:9pt;mso-wrap-distance-bottom:0;mso-position-horizontal:absolute;mso-position-horizontal-relative:text;mso-position-vertical:absolute;mso-position-vertical-relative:text;mso-height-percent:0;mso-height-relative:margin;v-text-anchor:middle" alt="&quot;&quot;" o:spid="_x0000_s1026" fillcolor="#00314d" stroked="f" strokeweight="1pt" w14:anchorId="393B4CD3" o:gfxdata="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"/>
             </w:pict>
           </mc:Fallback>
         </mc:AlternateContent>
@@ -321,11 +321,11 @@
           </mc:Choice>
           <mc:Fallback>
             <w:pict>
-              <v:shapetype w14:anchorId="2E2DABF6" id="_x0000_t202" coordsize="21600,21600" o:spt="202" path="m,l,21600r21600,l21600,xe">
+              <v:shapetype id="_x0000_t202" coordsize="21600,21600" o:spt="202" path="m,l,21600r21600,l21600,xe" w14:anchorId="2E2DABF6">
                 <v:stroke joinstyle="miter"/>
                 <v:path gradientshapeok="t" o:connecttype="rect"/>
               </v:shapetype>
-              <v:shape id="Cuadro de texto 2" o:spid="_x0000_s1026" type="#_x0000_t202" alt="&quot;&quot;" style="position:absolute;left:0;text-align:left;margin-left:486.1pt;margin-top:36.3pt;width:537.3pt;height:115.5pt;z-index:251663360;visibility:visible;mso-wrap-style:square;mso-width-percent:0;mso-height-percent:0;mso-wrap-distance-left:9pt;mso-wrap-distance-top:3.6pt;mso-wrap-distance-right:9pt;mso-wrap-distance-bottom:3.6pt;mso-position-horizontal:right;mso-position-horizontal-relative:margin;mso-position-vertical:absolute;mso-position-vertical-relative:text;mso-width-percent:0;mso-height-percent:0;mso-width-relative:margin;mso-height-relative:margin;v-text-anchor:top" o:gfxdata="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" filled="f" stroked="f">
+              <v:shape id="Cuadro de texto 2" style="position:absolute;left:0;text-align:left;margin-left:486.1pt;margin-top:36.3pt;width:537.3pt;height:115.5pt;z-index:251663360;visibility:visible;mso-wrap-style:square;mso-width-percent:0;mso-height-percent:0;mso-wrap-distance-left:9pt;mso-wrap-distance-top:3.6pt;mso-wrap-distance-right:9pt;mso-wrap-distance-bottom:3.6pt;mso-position-horizontal:right;mso-position-horizontal-relative:margin;mso-position-vertical:absolute;mso-position-vertical-relative:text;mso-width-percent:0;mso-height-percent:0;mso-width-relative:margin;mso-height-relative:margin;v-text-anchor:top" alt="&quot;&quot;" o:spid="_x0000_s1026" filled="f" stroked="f" type="#_x0000_t202" o:gfxdata="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">
                 <v:textbox>
                   <w:txbxContent>
                     <w:p>
@@ -534,26 +534,32 @@
     </w:p>
     <w:sdt>
       <w:sdtPr>
-        <w:rPr>
-          <w:rFonts w:asciiTheme="minorHAnsi" w:eastAsiaTheme="minorHAnsi" w:hAnsiTheme="minorHAnsi" w:cstheme="minorBidi"/>
-          <w:b w:val="0"/>
-          <w:color w:val="auto"/>
-          <w:kern w:val="2"/>
-          <w:sz w:val="28"/>
-          <w:szCs w:val="22"/>
-          <w:lang w:val="es-ES" w:eastAsia="en-US"/>
-          <w14:ligatures w14:val="standardContextual"/>
-        </w:rPr>
         <w:id w:val="-1852639233"/>
         <w:docPartObj>
           <w:docPartGallery w:val="Table of Contents"/>
           <w:docPartUnique/>
         </w:docPartObj>
+        <w:rPr>
+          <w:rFonts w:ascii="Calibri" w:hAnsi="Calibri" w:eastAsia="Calibri" w:cs="Arial" w:asciiTheme="minorAscii" w:hAnsiTheme="minorAscii" w:eastAsiaTheme="minorAscii" w:cstheme="minorBidi"/>
+          <w:b w:val="0"/>
+          <w:bCs w:val="0"/>
+          <w:color w:val="auto"/>
+          <w:kern w:val="2"/>
+          <w:sz w:val="28"/>
+          <w:szCs w:val="28"/>
+          <w:lang w:val="es-ES" w:eastAsia="en-US"/>
+          <w14:ligatures w14:val="standardContextual"/>
+        </w:rPr>
       </w:sdtPr>
       <w:sdtEndPr>
         <w:rPr>
-          <w:rFonts w:cstheme="minorHAnsi"/>
-          <w:bCs/>
+          <w:rFonts w:ascii="Calibri" w:hAnsi="Calibri" w:eastAsia="Calibri" w:cs="Calibri" w:asciiTheme="minorAscii" w:hAnsiTheme="minorAscii" w:eastAsiaTheme="minorAscii" w:cstheme="minorAscii"/>
+          <w:b w:val="0"/>
+          <w:bCs w:val="0"/>
+          <w:color w:val="auto"/>
+          <w:sz w:val="28"/>
+          <w:szCs w:val="28"/>
+          <w:lang w:val="es-ES" w:eastAsia="en-US"/>
         </w:rPr>
       </w:sdtEndPr>
       <w:sdtContent>
@@ -610,7 +616,7 @@
             </w:rPr>
             <w:fldChar w:fldCharType="separate"/>
           </w:r>
-          <w:hyperlink w:anchor="_Toc216368838" w:history="1">
+          <w:hyperlink w:history="1" w:anchor="_Toc216368838">
             <w:r>
               <w:rPr>
                 <w:rStyle w:val="Hipervnculo"/>
@@ -684,7 +690,7 @@
               <w14:ligatures w14:val="none"/>
             </w:rPr>
           </w:pPr>
-          <w:hyperlink w:anchor="_Toc216368839" w:history="1">
+          <w:hyperlink w:history="1" w:anchor="_Toc216368839">
             <w:r>
               <w:rPr>
                 <w:rStyle w:val="Hipervnculo"/>
@@ -775,7 +781,7 @@
               <w14:ligatures w14:val="none"/>
             </w:rPr>
           </w:pPr>
-          <w:hyperlink w:anchor="_Toc216368840" w:history="1">
+          <w:hyperlink w:history="1" w:anchor="_Toc216368840">
             <w:r>
               <w:rPr>
                 <w:rStyle w:val="Hipervnculo"/>
@@ -862,7 +868,7 @@
               <w14:ligatures w14:val="none"/>
             </w:rPr>
           </w:pPr>
-          <w:hyperlink w:anchor="_Toc216368841" w:history="1">
+          <w:hyperlink w:history="1" w:anchor="_Toc216368841">
             <w:r>
               <w:rPr>
                 <w:rStyle w:val="Hipervnculo"/>
@@ -949,7 +955,7 @@
               <w14:ligatures w14:val="none"/>
             </w:rPr>
           </w:pPr>
-          <w:hyperlink w:anchor="_Toc216368842" w:history="1">
+          <w:hyperlink w:history="1" w:anchor="_Toc216368842">
             <w:r>
               <w:rPr>
                 <w:rStyle w:val="Hipervnculo"/>
@@ -1037,7 +1043,7 @@
               <w14:ligatures w14:val="none"/>
             </w:rPr>
           </w:pPr>
-          <w:hyperlink w:anchor="_Toc216368843" w:history="1">
+          <w:hyperlink w:history="1" w:anchor="_Toc216368843">
             <w:r>
               <w:rPr>
                 <w:rStyle w:val="Hipervnculo"/>
@@ -1128,7 +1134,7 @@
               <w14:ligatures w14:val="none"/>
             </w:rPr>
           </w:pPr>
-          <w:hyperlink w:anchor="_Toc216368845" w:history="1">
+          <w:hyperlink w:history="1" w:anchor="_Toc216368845">
             <w:r>
               <w:rPr>
                 <w:rStyle w:val="Hipervnculo"/>
@@ -1216,7 +1222,7 @@
               <w14:ligatures w14:val="none"/>
             </w:rPr>
           </w:pPr>
-          <w:hyperlink w:anchor="_Toc216368846" w:history="1">
+          <w:hyperlink w:history="1" w:anchor="_Toc216368846">
             <w:r>
               <w:rPr>
                 <w:rStyle w:val="Hipervnculo"/>
@@ -1307,7 +1313,7 @@
               <w14:ligatures w14:val="none"/>
             </w:rPr>
           </w:pPr>
-          <w:hyperlink w:anchor="_Toc216368848" w:history="1">
+          <w:hyperlink w:history="1" w:anchor="_Toc216368848">
             <w:r>
               <w:rPr>
                 <w:rStyle w:val="Hipervnculo"/>
@@ -1395,7 +1401,7 @@
               <w14:ligatures w14:val="none"/>
             </w:rPr>
           </w:pPr>
-          <w:hyperlink w:anchor="_Toc216368849" w:history="1">
+          <w:hyperlink w:history="1" w:anchor="_Toc216368849">
             <w:r>
               <w:rPr>
                 <w:rStyle w:val="Hipervnculo"/>
@@ -1491,7 +1497,7 @@
               <w14:ligatures w14:val="none"/>
             </w:rPr>
           </w:pPr>
-          <w:hyperlink w:anchor="_Toc216368850" w:history="1">
+          <w:hyperlink w:history="1" w:anchor="_Toc216368850">
             <w:r>
               <w:rPr>
                 <w:rStyle w:val="Hipervnculo"/>
@@ -1583,7 +1589,7 @@
               <w14:ligatures w14:val="none"/>
             </w:rPr>
           </w:pPr>
-          <w:hyperlink w:anchor="_Toc216368851" w:history="1">
+          <w:hyperlink w:history="1" w:anchor="_Toc216368851">
             <w:r>
               <w:rPr>
                 <w:rStyle w:val="Hipervnculo"/>
@@ -1674,7 +1680,7 @@
               <w14:ligatures w14:val="none"/>
             </w:rPr>
           </w:pPr>
-          <w:hyperlink w:anchor="_Toc216368855" w:history="1">
+          <w:hyperlink w:history="1" w:anchor="_Toc216368855">
             <w:r>
               <w:rPr>
                 <w:rStyle w:val="Hipervnculo"/>
@@ -1761,7 +1767,7 @@
               <w14:ligatures w14:val="none"/>
             </w:rPr>
           </w:pPr>
-          <w:hyperlink w:anchor="_Toc216368856" w:history="1">
+          <w:hyperlink w:history="1" w:anchor="_Toc216368856">
             <w:r>
               <w:rPr>
                 <w:rStyle w:val="Hipervnculo"/>
@@ -1834,7 +1840,7 @@
               <w14:ligatures w14:val="none"/>
             </w:rPr>
           </w:pPr>
-          <w:hyperlink w:anchor="_Toc216368857" w:history="1">
+          <w:hyperlink w:history="1" w:anchor="_Toc216368857">
             <w:r>
               <w:rPr>
                 <w:rStyle w:val="Hipervnculo"/>
@@ -1907,7 +1913,7 @@
               <w14:ligatures w14:val="none"/>
             </w:rPr>
           </w:pPr>
-          <w:hyperlink w:anchor="_Toc216368858" w:history="1">
+          <w:hyperlink w:history="1" w:anchor="_Toc216368858">
             <w:r>
               <w:rPr>
                 <w:rStyle w:val="Hipervnculo"/>
@@ -1980,12 +1986,12 @@
               <w14:ligatures w14:val="none"/>
             </w:rPr>
           </w:pPr>
-          <w:hyperlink w:anchor="_Toc216368859" w:history="1">
+          <w:hyperlink w:history="1" w:anchor="_Toc216368859">
             <w:r>
               <w:rPr>
                 <w:rStyle w:val="Hipervnculo"/>
                 <w:noProof/>
-                <w:bdr w:val="none" w:sz="0" w:space="0" w:color="auto" w:frame="1"/>
+                <w:bdr w:val="none" w:color="auto" w:sz="0" w:space="0" w:frame="1"/>
               </w:rPr>
               <w:t>Referencias bibliográficas</w:t>
             </w:r>
@@ -2054,7 +2060,7 @@
               <w14:ligatures w14:val="none"/>
             </w:rPr>
           </w:pPr>
-          <w:hyperlink w:anchor="_Toc216368860" w:history="1">
+          <w:hyperlink w:history="1" w:anchor="_Toc216368860">
             <w:r>
               <w:rPr>
                 <w:rStyle w:val="Hipervnculo"/>
@@ -2148,7 +2154,7 @@
         </w:numPr>
         <w:ind w:left="1068"/>
       </w:pPr>
-      <w:bookmarkStart w:id="0" w:name="_Toc216368838"/>
+      <w:bookmarkStart w:name="_Toc216368838" w:id="0"/>
       <w:r>
         <w:lastRenderedPageBreak/>
         <w:t>Introducción</w:t>
@@ -2316,7 +2322,7 @@
           <w:lang w:val="es-419" w:eastAsia="es-CO"/>
         </w:rPr>
       </w:pPr>
-      <w:hyperlink r:id="rId14" w:history="1">
+      <w:hyperlink w:history="1" r:id="rId14">
         <w:r>
           <w:rPr>
             <w:rStyle w:val="Hipervnculo"/>
@@ -2543,7 +2549,7 @@
       <w:pPr>
         <w:pStyle w:val="Ttulo1"/>
       </w:pPr>
-      <w:bookmarkStart w:id="1" w:name="_Toc216368839"/>
+      <w:bookmarkStart w:name="_Toc216368839" w:id="1"/>
       <w:r>
         <w:lastRenderedPageBreak/>
         <w:t>Proceso de ventas: conceptualización, etapas y herramientas</w:t>
@@ -3398,7 +3404,7 @@
       <w:pPr>
         <w:pStyle w:val="Ttulo2"/>
       </w:pPr>
-      <w:bookmarkStart w:id="2" w:name="_Toc216368840"/>
+      <w:bookmarkStart w:name="_Toc216368840" w:id="2"/>
       <w:r>
         <w:t>Herramientas clave para la gestión comercial</w:t>
       </w:r>
@@ -4101,55 +4107,8 @@
         </w:rPr>
       </w:pPr>
       <w:r>
-        <w:rPr>
-          <w:noProof/>
-          <w:lang w:eastAsia="es-CO"/>
-        </w:rPr>
-        <w:drawing>
-          <wp:inline distT="0" distB="0" distL="0" distR="0" wp14:anchorId="529D95A1" wp14:editId="0586A348">
-            <wp:extent cx="5655722" cy="3294993"/>
-            <wp:effectExtent l="0" t="0" r="2540" b="1270"/>
-            <wp:docPr id="36" name="Imagen 36" descr="El esquema representa el ciclo de la venta como un proceso continuo que inicia con la prospección de clientes potenciales y avanza hacia el acercamiento, la entrevista y la presentación o demostración del producto o servicio. Posteriormente, se desarrolla la etapa de negociación, seguida del cierre de la venta. Finalmente, se incluyen las acciones de posventa y relaciones de largo plazo (ALP), que permiten mantener la fidelización del cliente y generar referidos, lo cual retroalimenta nuevamente el ciclo. "/>
-            <wp:cNvGraphicFramePr>
-              <a:graphicFrameLocks xmlns:a="http://schemas.openxmlformats.org/drawingml/2006/main" noChangeAspect="1"/>
-            </wp:cNvGraphicFramePr>
-            <a:graphic xmlns:a="http://schemas.openxmlformats.org/drawingml/2006/main">
-              <a:graphicData uri="http://schemas.openxmlformats.org/drawingml/2006/picture">
-                <pic:pic xmlns:pic="http://schemas.openxmlformats.org/drawingml/2006/picture">
-                  <pic:nvPicPr>
-                    <pic:cNvPr id="36" name="Imagen 36" descr="El esquema representa el ciclo de la venta como un proceso continuo que inicia con la prospección de clientes potenciales y avanza hacia el acercamiento, la entrevista y la presentación o demostración del producto o servicio. Posteriormente, se desarrolla la etapa de negociación, seguida del cierre de la venta. Finalmente, se incluyen las acciones de posventa y relaciones de largo plazo (ALP), que permiten mantener la fidelización del cliente y generar referidos, lo cual retroalimenta nuevamente el ciclo. "/>
-                    <pic:cNvPicPr>
-                      <a:picLocks noChangeAspect="1" noChangeArrowheads="1"/>
-                    </pic:cNvPicPr>
-                  </pic:nvPicPr>
-                  <pic:blipFill>
-                    <a:blip r:embed="rId15">
-                      <a:extLst>
-                        <a:ext uri="{28A0092B-C50C-407E-A947-70E740481C1C}">
-                          <a14:useLocalDpi xmlns:a14="http://schemas.microsoft.com/office/drawing/2010/main" val="0"/>
-                        </a:ext>
-                      </a:extLst>
-                    </a:blip>
-                    <a:srcRect/>
-                    <a:stretch>
-                      <a:fillRect/>
-                    </a:stretch>
-                  </pic:blipFill>
-                  <pic:spPr bwMode="auto">
-                    <a:xfrm>
-                      <a:off x="0" y="0"/>
-                      <a:ext cx="5687259" cy="3313366"/>
-                    </a:xfrm>
-                    <a:prstGeom prst="rect">
-                      <a:avLst/>
-                    </a:prstGeom>
-                    <a:noFill/>
-                  </pic:spPr>
-                </pic:pic>
-              </a:graphicData>
-            </a:graphic>
-          </wp:inline>
-        </w:drawing>
+        <w:rPr/>
+        <w:t>&lt;img src="img/18.861588cd.svg" alt="La función de ventas se divide en tomadores de órdenes, creadores de órdenes y captadores de órdenes, donde cada grupo cumple roles específicos que van desde recibir pedidos y entregarlos, hasta generar nuevas oportunidades y apoyar la gestión comercial con representantes especializados. "&gt;</w:t>
       </w:r>
     </w:p>
     <w:p>
@@ -4583,7 +4542,7 @@
       <w:pPr>
         <w:pStyle w:val="Ttulo2"/>
       </w:pPr>
-      <w:bookmarkStart w:id="3" w:name="_Toc216368841"/>
+      <w:bookmarkStart w:name="_Toc216368841" w:id="3"/>
       <w:r>
         <w:lastRenderedPageBreak/>
         <w:t>Modalidades de ventas</w:t>
@@ -5107,7 +5066,7 @@
       <w:pPr>
         <w:pStyle w:val="Ttulo2"/>
       </w:pPr>
-      <w:bookmarkStart w:id="4" w:name="_Toc216368842"/>
+      <w:bookmarkStart w:name="_Toc216368842" w:id="4"/>
       <w:r>
         <w:t>Proceso de la venta</w:t>
       </w:r>
@@ -5368,7 +5327,7 @@
       <w:pPr>
         <w:pStyle w:val="Ttulo1"/>
       </w:pPr>
-      <w:bookmarkStart w:id="5" w:name="_Toc216368843"/>
+      <w:bookmarkStart w:name="_Toc216368843" w:id="5"/>
       <w:r>
         <w:lastRenderedPageBreak/>
         <w:t>Transacciones comerciales</w:t>
@@ -6544,7 +6503,7 @@
         <w:textAlignment w:val="baseline"/>
         <w:outlineLvl w:val="1"/>
         <w:rPr>
-          <w:rFonts w:ascii="Calibri" w:eastAsiaTheme="majorEastAsia" w:hAnsi="Calibri" w:cs="Calibri"/>
+          <w:rFonts w:ascii="Calibri" w:hAnsi="Calibri" w:cs="Calibri" w:eastAsiaTheme="majorEastAsia"/>
           <w:b/>
           <w:bCs/>
           <w:vanish/>
@@ -6557,14 +6516,14 @@
           <w14:ligatures w14:val="none"/>
         </w:rPr>
       </w:pPr>
-      <w:bookmarkStart w:id="6" w:name="_Toc216368844"/>
+      <w:bookmarkStart w:name="_Toc216368844" w:id="6"/>
       <w:bookmarkEnd w:id="6"/>
     </w:p>
     <w:p>
       <w:pPr>
         <w:pStyle w:val="Ttulo2"/>
       </w:pPr>
-      <w:bookmarkStart w:id="7" w:name="_Toc216368845"/>
+      <w:bookmarkStart w:name="_Toc216368845" w:id="7"/>
       <w:r>
         <w:t>Documentos comerciales</w:t>
       </w:r>
@@ -6904,7 +6863,7 @@
       <w:pPr>
         <w:pStyle w:val="Ttulo1"/>
       </w:pPr>
-      <w:bookmarkStart w:id="8" w:name="_Toc216368846"/>
+      <w:bookmarkStart w:name="_Toc216368846" w:id="8"/>
       <w:r>
         <w:lastRenderedPageBreak/>
         <w:t>Concepto de comunicación</w:t>
@@ -7378,6 +7337,8 @@
       <w:r>
         <w:rPr>
           <w:rStyle w:val="Extranjerismo"/>
+          <w:i w:val="1"/>
+          <w:iCs w:val="1"/>
           <w:lang w:val="es-CO" w:eastAsia="es-CO"/>
         </w:rPr>
         <w:t>podcasts</w:t>
@@ -7634,7 +7595,7 @@
         <w:textAlignment w:val="baseline"/>
         <w:outlineLvl w:val="1"/>
         <w:rPr>
-          <w:rFonts w:ascii="Calibri" w:eastAsiaTheme="majorEastAsia" w:hAnsi="Calibri" w:cs="Calibri"/>
+          <w:rFonts w:ascii="Calibri" w:hAnsi="Calibri" w:cs="Calibri" w:eastAsiaTheme="majorEastAsia"/>
           <w:b/>
           <w:bCs/>
           <w:vanish/>
@@ -7647,14 +7608,14 @@
           <w14:ligatures w14:val="none"/>
         </w:rPr>
       </w:pPr>
-      <w:bookmarkStart w:id="9" w:name="_Toc216368847"/>
+      <w:bookmarkStart w:name="_Toc216368847" w:id="9"/>
       <w:bookmarkEnd w:id="9"/>
     </w:p>
     <w:p>
       <w:pPr>
         <w:pStyle w:val="Ttulo2"/>
       </w:pPr>
-      <w:bookmarkStart w:id="10" w:name="_Toc216368848"/>
+      <w:bookmarkStart w:name="_Toc216368848" w:id="10"/>
       <w:r>
         <w:t>Medios de comunicación</w:t>
       </w:r>
@@ -7761,7 +7722,19 @@
         <w:rPr>
           <w:lang w:eastAsia="es-CO"/>
         </w:rPr>
-        <w:t>Existen divisiones de medios de comunicación generadas por la gestión del mercadeo. Es la comunicación que llega a un gran número de personas en un periodo de tiempo determinado; y los medios son</w:t>
+        <w:t xml:space="preserve">Existen divisiones de medios de comunicación generadas por la gestión del mercadeo. Es la comunicación que llega a un gran número de personas en un periodo de tiempo determinado; y </w:t>
+      </w:r>
+      <w:r>
+        <w:rPr>
+          <w:lang w:eastAsia="es-CO"/>
+        </w:rPr>
+        <w:t>los medios son</w:t>
+      </w:r>
+      <w:r>
+        <w:rPr>
+          <w:lang w:eastAsia="es-CO"/>
+        </w:rPr>
+        <w:t>:</w:t>
       </w:r>
     </w:p>
     <w:p>
@@ -8118,14 +8091,15 @@
         <w:pStyle w:val="Ttulo1"/>
         <w:rPr>
           <w:rStyle w:val="Extranjerismo"/>
-        </w:rPr>
-      </w:pPr>
-      <w:bookmarkStart w:id="11" w:name="_Toc216368849"/>
+          <w:lang w:val="es-419"/>
+        </w:rPr>
+      </w:pPr>
+      <w:bookmarkStart w:name="_Toc216368849" w:id="11"/>
       <w:r>
         <w:rPr>
           <w:rStyle w:val="Extranjerismo"/>
-        </w:rPr>
-        <w:lastRenderedPageBreak/>
+          <w:lang w:val="es-419"/>
+        </w:rPr>
         <w:t>Merchandising</w:t>
       </w:r>
       <w:bookmarkEnd w:id="11"/>
@@ -10663,7 +10637,7 @@
       <w:pPr>
         <w:pStyle w:val="Ttulo1"/>
       </w:pPr>
-      <w:bookmarkStart w:id="12" w:name="_Toc216368850"/>
+      <w:bookmarkStart w:name="_Toc216368850" w:id="12"/>
       <w:r>
         <w:lastRenderedPageBreak/>
         <w:t>Exhibición</w:t>
@@ -12044,7 +12018,7 @@
       <w:pPr>
         <w:pStyle w:val="Ttulo1"/>
       </w:pPr>
-      <w:bookmarkStart w:id="13" w:name="_Toc216368851"/>
+      <w:bookmarkStart w:name="_Toc216368851" w:id="13"/>
       <w:r>
         <w:lastRenderedPageBreak/>
         <w:t>Presentaciones</w:t>
@@ -12171,7 +12145,7 @@
           <w:lang w:val="es-419" w:eastAsia="es-CO"/>
         </w:rPr>
       </w:pPr>
-      <w:hyperlink r:id="rId18" w:history="1">
+      <w:hyperlink w:history="1" r:id="rId18">
         <w:r>
           <w:rPr>
             <w:rStyle w:val="Hipervnculo"/>
@@ -12691,7 +12665,7 @@
           <w:lang w:val="es-419" w:eastAsia="es-CO"/>
         </w:rPr>
       </w:pPr>
-      <w:hyperlink r:id="rId20" w:history="1">
+      <w:hyperlink w:history="1" r:id="rId20">
         <w:r>
           <w:rPr>
             <w:rStyle w:val="Hipervnculo"/>
@@ -12825,7 +12799,7 @@
         <w:textAlignment w:val="baseline"/>
         <w:outlineLvl w:val="1"/>
         <w:rPr>
-          <w:rFonts w:ascii="Calibri" w:eastAsiaTheme="majorEastAsia" w:hAnsi="Calibri" w:cs="Calibri"/>
+          <w:rFonts w:ascii="Calibri" w:hAnsi="Calibri" w:cs="Calibri" w:eastAsiaTheme="majorEastAsia"/>
           <w:b/>
           <w:bCs/>
           <w:vanish/>
@@ -12838,7 +12812,7 @@
           <w14:ligatures w14:val="none"/>
         </w:rPr>
       </w:pPr>
-      <w:bookmarkStart w:id="14" w:name="_Toc216368852"/>
+      <w:bookmarkStart w:name="_Toc216368852" w:id="14"/>
       <w:bookmarkEnd w:id="14"/>
     </w:p>
     <w:p>
@@ -12856,7 +12830,7 @@
         <w:textAlignment w:val="baseline"/>
         <w:outlineLvl w:val="1"/>
         <w:rPr>
-          <w:rFonts w:ascii="Calibri" w:eastAsiaTheme="majorEastAsia" w:hAnsi="Calibri" w:cs="Calibri"/>
+          <w:rFonts w:ascii="Calibri" w:hAnsi="Calibri" w:cs="Calibri" w:eastAsiaTheme="majorEastAsia"/>
           <w:b/>
           <w:bCs/>
           <w:vanish/>
@@ -12869,7 +12843,7 @@
           <w14:ligatures w14:val="none"/>
         </w:rPr>
       </w:pPr>
-      <w:bookmarkStart w:id="15" w:name="_Toc216368853"/>
+      <w:bookmarkStart w:name="_Toc216368853" w:id="15"/>
       <w:bookmarkEnd w:id="15"/>
     </w:p>
     <w:p>
@@ -12887,7 +12861,7 @@
         <w:textAlignment w:val="baseline"/>
         <w:outlineLvl w:val="1"/>
         <w:rPr>
-          <w:rFonts w:ascii="Calibri" w:eastAsiaTheme="majorEastAsia" w:hAnsi="Calibri" w:cs="Calibri"/>
+          <w:rFonts w:ascii="Calibri" w:hAnsi="Calibri" w:cs="Calibri" w:eastAsiaTheme="majorEastAsia"/>
           <w:b/>
           <w:bCs/>
           <w:vanish/>
@@ -12900,14 +12874,14 @@
           <w14:ligatures w14:val="none"/>
         </w:rPr>
       </w:pPr>
-      <w:bookmarkStart w:id="16" w:name="_Toc216368854"/>
+      <w:bookmarkStart w:name="_Toc216368854" w:id="16"/>
       <w:bookmarkEnd w:id="16"/>
     </w:p>
     <w:p>
       <w:pPr>
         <w:pStyle w:val="Ttulo2"/>
       </w:pPr>
-      <w:bookmarkStart w:id="17" w:name="_Toc216368855"/>
+      <w:bookmarkStart w:name="_Toc216368855" w:id="17"/>
       <w:r>
         <w:t>Lenguaje corporal</w:t>
       </w:r>
@@ -13117,7 +13091,7 @@
           <w:lang w:eastAsia="es-CO"/>
         </w:rPr>
       </w:pPr>
-      <w:hyperlink r:id="rId21" w:history="1">
+      <w:hyperlink w:history="1" r:id="rId21">
         <w:r>
           <w:rPr>
             <w:rStyle w:val="Hipervnculo"/>
@@ -13371,7 +13345,7 @@
         </w:numPr>
         <w:ind w:left="1068" w:hanging="360"/>
       </w:pPr>
-      <w:bookmarkStart w:id="18" w:name="_Toc216368856"/>
+      <w:bookmarkStart w:name="_Toc216368856" w:id="18"/>
       <w:r>
         <w:lastRenderedPageBreak/>
         <w:t>Síntesis</w:t>
@@ -13515,7 +13489,7 @@
         </w:numPr>
         <w:ind w:left="1068"/>
       </w:pPr>
-      <w:bookmarkStart w:id="19" w:name="_Toc216368857"/>
+      <w:bookmarkStart w:name="_Toc216368857" w:id="19"/>
       <w:r>
         <w:lastRenderedPageBreak/>
         <w:t>Material complementario</w:t>
@@ -13542,14 +13516,16 @@
         </w:trPr>
         <w:tc>
           <w:tcPr>
+            <w:cnfStyle w:val="000000000000" w:firstRow="0" w:lastRow="0" w:firstColumn="0" w:lastColumn="0" w:oddVBand="0" w:evenVBand="0" w:oddHBand="0" w:evenHBand="0" w:firstRowFirstColumn="0" w:firstRowLastColumn="0" w:lastRowFirstColumn="0" w:lastRowLastColumn="0"/>
             <w:tcW w:w="1980" w:type="dxa"/>
+            <w:tcMar/>
           </w:tcPr>
           <w:p>
             <w:pPr>
               <w:pStyle w:val="TextoTablas"/>
             </w:pPr>
-            <w:bookmarkStart w:id="20" w:name="_Hlk213875775"/>
-            <w:bookmarkStart w:id="21" w:name="_Hlk216363064"/>
+            <w:bookmarkStart w:name="_Hlk213875775" w:id="20"/>
+            <w:bookmarkStart w:name="_Hlk216363064" w:id="21"/>
             <w:r>
               <w:t>Tema</w:t>
             </w:r>
@@ -13557,7 +13533,9 @@
         </w:tc>
         <w:tc>
           <w:tcPr>
+            <w:cnfStyle w:val="000000000000" w:firstRow="0" w:lastRow="0" w:firstColumn="0" w:lastColumn="0" w:oddVBand="0" w:evenVBand="0" w:oddHBand="0" w:evenHBand="0" w:firstRowFirstColumn="0" w:firstRowLastColumn="0" w:lastRowFirstColumn="0" w:lastRowLastColumn="0"/>
             <w:tcW w:w="3544" w:type="dxa"/>
+            <w:tcMar/>
           </w:tcPr>
           <w:p>
             <w:pPr>
@@ -13570,7 +13548,9 @@
         </w:tc>
         <w:tc>
           <w:tcPr>
+            <w:cnfStyle w:val="000000000000" w:firstRow="0" w:lastRow="0" w:firstColumn="0" w:lastColumn="0" w:oddVBand="0" w:evenVBand="0" w:oddHBand="0" w:evenHBand="0" w:firstRowFirstColumn="0" w:firstRowLastColumn="0" w:lastRowFirstColumn="0" w:lastRowLastColumn="0"/>
             <w:tcW w:w="1984" w:type="dxa"/>
+            <w:tcMar/>
           </w:tcPr>
           <w:p>
             <w:pPr>
@@ -13583,7 +13563,9 @@
         </w:tc>
         <w:tc>
           <w:tcPr>
+            <w:cnfStyle w:val="000000000000" w:firstRow="0" w:lastRow="0" w:firstColumn="0" w:lastColumn="0" w:oddVBand="0" w:evenVBand="0" w:oddHBand="0" w:evenHBand="0" w:firstRowFirstColumn="0" w:firstRowLastColumn="0" w:lastRowFirstColumn="0" w:lastRowLastColumn="0"/>
             <w:tcW w:w="2567" w:type="dxa"/>
+            <w:tcMar/>
           </w:tcPr>
           <w:p>
             <w:pPr>
@@ -13603,18 +13585,22 @@
         </w:trPr>
         <w:tc>
           <w:tcPr>
+            <w:cnfStyle w:val="000000000000" w:firstRow="0" w:lastRow="0" w:firstColumn="0" w:lastColumn="0" w:oddVBand="0" w:evenVBand="0" w:oddHBand="0" w:evenHBand="0" w:firstRowFirstColumn="0" w:firstRowLastColumn="0" w:lastRowFirstColumn="0" w:lastRowLastColumn="0"/>
             <w:tcW w:w="1980" w:type="dxa"/>
+            <w:tcMar/>
           </w:tcPr>
           <w:p>
             <w:pPr>
               <w:pStyle w:val="TextoTablas"/>
               <w:rPr>
                 <w:rStyle w:val="Extranjerismo"/>
+                <w:lang w:val="es-419"/>
               </w:rPr>
             </w:pPr>
             <w:r>
               <w:rPr>
                 <w:rStyle w:val="Extranjerismo"/>
+                <w:lang w:val="es-419"/>
               </w:rPr>
               <w:t>Merchandising</w:t>
             </w:r>
@@ -13622,7 +13608,9 @@
         </w:tc>
         <w:tc>
           <w:tcPr>
+            <w:cnfStyle w:val="000000000000" w:firstRow="0" w:lastRow="0" w:firstColumn="0" w:lastColumn="0" w:oddVBand="0" w:evenVBand="0" w:oddHBand="0" w:evenHBand="0" w:firstRowFirstColumn="0" w:firstRowLastColumn="0" w:lastRowFirstColumn="0" w:lastRowLastColumn="0"/>
             <w:tcW w:w="3544" w:type="dxa"/>
+            <w:tcMar/>
           </w:tcPr>
           <w:p>
             <w:pPr>
@@ -13643,7 +13631,9 @@
         </w:tc>
         <w:tc>
           <w:tcPr>
+            <w:cnfStyle w:val="000000000000" w:firstRow="0" w:lastRow="0" w:firstColumn="0" w:lastColumn="0" w:oddVBand="0" w:evenVBand="0" w:oddHBand="0" w:evenHBand="0" w:firstRowFirstColumn="0" w:firstRowLastColumn="0" w:lastRowFirstColumn="0" w:lastRowLastColumn="0"/>
             <w:tcW w:w="1984" w:type="dxa"/>
+            <w:tcMar/>
           </w:tcPr>
           <w:p>
             <w:pPr>
@@ -13656,13 +13646,15 @@
         </w:tc>
         <w:tc>
           <w:tcPr>
+            <w:cnfStyle w:val="000000000000" w:firstRow="0" w:lastRow="0" w:firstColumn="0" w:lastColumn="0" w:oddVBand="0" w:evenVBand="0" w:oddHBand="0" w:evenHBand="0" w:firstRowFirstColumn="0" w:firstRowLastColumn="0" w:lastRowFirstColumn="0" w:lastRowLastColumn="0"/>
             <w:tcW w:w="2567" w:type="dxa"/>
+            <w:tcMar/>
           </w:tcPr>
           <w:p>
             <w:pPr>
               <w:pStyle w:val="TextoTablas"/>
             </w:pPr>
-            <w:hyperlink r:id="rId23" w:history="1">
+            <w:hyperlink w:history="1" r:id="rId23">
               <w:r>
                 <w:rPr>
                   <w:rStyle w:val="Hipervnculo"/>
@@ -13676,7 +13668,9 @@
       <w:tr>
         <w:tc>
           <w:tcPr>
+            <w:cnfStyle w:val="000000000000" w:firstRow="0" w:lastRow="0" w:firstColumn="0" w:lastColumn="0" w:oddVBand="0" w:evenVBand="0" w:oddHBand="0" w:evenHBand="0" w:firstRowFirstColumn="0" w:firstRowLastColumn="0" w:lastRowFirstColumn="0" w:lastRowLastColumn="0"/>
             <w:tcW w:w="1980" w:type="dxa"/>
+            <w:tcMar/>
           </w:tcPr>
           <w:p>
             <w:pPr>
@@ -13692,36 +13686,41 @@
         </w:tc>
         <w:tc>
           <w:tcPr>
+            <w:cnfStyle w:val="000000000000" w:firstRow="0" w:lastRow="0" w:firstColumn="0" w:lastColumn="0" w:oddVBand="0" w:evenVBand="0" w:oddHBand="0" w:evenHBand="0" w:firstRowFirstColumn="0" w:firstRowLastColumn="0" w:lastRowFirstColumn="0" w:lastRowLastColumn="0"/>
             <w:tcW w:w="3544" w:type="dxa"/>
+            <w:tcMar/>
           </w:tcPr>
           <w:p>
             <w:pPr>
               <w:pStyle w:val="TextoTablas"/>
             </w:pPr>
             <w:r>
+              <w:rPr/>
               <w:t xml:space="preserve">Apple. (2016). Apple – </w:t>
             </w:r>
-            <w:proofErr w:type="spellStart"/>
-            <w:r>
+            <w:r>
+              <w:rPr/>
               <w:t>september</w:t>
             </w:r>
-            <w:proofErr w:type="spellEnd"/>
-            <w:r>
+            <w:r>
+              <w:rPr/>
               <w:t xml:space="preserve"> </w:t>
             </w:r>
-            <w:proofErr w:type="spellStart"/>
-            <w:r>
+            <w:r>
+              <w:rPr/>
               <w:t>event</w:t>
             </w:r>
-            <w:proofErr w:type="spellEnd"/>
-            <w:r>
-              <w:t xml:space="preserve"> 2016.Z</w:t>
+            <w:r>
+              <w:rPr/>
+              <w:t xml:space="preserve"> 2016.</w:t>
             </w:r>
           </w:p>
         </w:tc>
         <w:tc>
           <w:tcPr>
+            <w:cnfStyle w:val="000000000000" w:firstRow="0" w:lastRow="0" w:firstColumn="0" w:lastColumn="0" w:oddVBand="0" w:evenVBand="0" w:oddHBand="0" w:evenHBand="0" w:firstRowFirstColumn="0" w:firstRowLastColumn="0" w:lastRowFirstColumn="0" w:lastRowLastColumn="0"/>
             <w:tcW w:w="1984" w:type="dxa"/>
+            <w:tcMar/>
           </w:tcPr>
           <w:p>
             <w:pPr>
@@ -13734,13 +13733,15 @@
         </w:tc>
         <w:tc>
           <w:tcPr>
+            <w:cnfStyle w:val="000000000000" w:firstRow="0" w:lastRow="0" w:firstColumn="0" w:lastColumn="0" w:oddVBand="0" w:evenVBand="0" w:oddHBand="0" w:evenHBand="0" w:firstRowFirstColumn="0" w:firstRowLastColumn="0" w:lastRowFirstColumn="0" w:lastRowLastColumn="0"/>
             <w:tcW w:w="2567" w:type="dxa"/>
+            <w:tcMar/>
           </w:tcPr>
           <w:p>
             <w:pPr>
               <w:pStyle w:val="TextoTablas"/>
             </w:pPr>
-            <w:hyperlink r:id="rId24" w:history="1">
+            <w:hyperlink w:history="1" r:id="rId24">
               <w:r>
                 <w:rPr>
                   <w:rStyle w:val="Hipervnculo"/>
@@ -13757,7 +13758,9 @@
         </w:trPr>
         <w:tc>
           <w:tcPr>
+            <w:cnfStyle w:val="000000000000" w:firstRow="0" w:lastRow="0" w:firstColumn="0" w:lastColumn="0" w:oddVBand="0" w:evenVBand="0" w:oddHBand="0" w:evenHBand="0" w:firstRowFirstColumn="0" w:firstRowLastColumn="0" w:lastRowFirstColumn="0" w:lastRowLastColumn="0"/>
             <w:tcW w:w="1980" w:type="dxa"/>
+            <w:tcMar/>
           </w:tcPr>
           <w:p>
             <w:pPr>
@@ -13773,41 +13776,45 @@
         </w:tc>
         <w:tc>
           <w:tcPr>
+            <w:cnfStyle w:val="000000000000" w:firstRow="0" w:lastRow="0" w:firstColumn="0" w:lastColumn="0" w:oddVBand="0" w:evenVBand="0" w:oddHBand="0" w:evenHBand="0" w:firstRowFirstColumn="0" w:firstRowLastColumn="0" w:lastRowFirstColumn="0" w:lastRowLastColumn="0"/>
             <w:tcW w:w="3544" w:type="dxa"/>
+            <w:tcMar/>
           </w:tcPr>
           <w:p>
             <w:pPr>
               <w:pStyle w:val="TextoTablas"/>
             </w:pPr>
             <w:r>
+              <w:rPr/>
               <w:t xml:space="preserve">TEDx </w:t>
             </w:r>
-            <w:proofErr w:type="spellStart"/>
-            <w:r>
+            <w:r>
+              <w:rPr/>
               <w:t>Talks</w:t>
             </w:r>
-            <w:proofErr w:type="spellEnd"/>
-            <w:r>
+            <w:r>
+              <w:rPr/>
               <w:t xml:space="preserve">. (2016). Hablando con </w:t>
             </w:r>
-            <w:proofErr w:type="spellStart"/>
-            <w:r>
+            <w:r>
+              <w:rPr/>
               <w:t>Julis</w:t>
             </w:r>
-            <w:proofErr w:type="spellEnd"/>
-            <w:r>
+            <w:r>
+              <w:rPr/>
               <w:t xml:space="preserve"> | Daniela Galindo | </w:t>
             </w:r>
-            <w:proofErr w:type="spellStart"/>
-            <w:r>
-              <w:t>TEDxUniversidadPiloto.Z</w:t>
-            </w:r>
-            <w:proofErr w:type="spellEnd"/>
+            <w:r>
+              <w:rPr/>
+              <w:t>TEDxUniversidadPiloto.</w:t>
+            </w:r>
           </w:p>
         </w:tc>
         <w:tc>
           <w:tcPr>
+            <w:cnfStyle w:val="000000000000" w:firstRow="0" w:lastRow="0" w:firstColumn="0" w:lastColumn="0" w:oddVBand="0" w:evenVBand="0" w:oddHBand="0" w:evenHBand="0" w:firstRowFirstColumn="0" w:firstRowLastColumn="0" w:lastRowFirstColumn="0" w:lastRowLastColumn="0"/>
             <w:tcW w:w="1984" w:type="dxa"/>
+            <w:tcMar/>
           </w:tcPr>
           <w:p>
             <w:pPr>
@@ -13820,13 +13827,15 @@
         </w:tc>
         <w:tc>
           <w:tcPr>
+            <w:cnfStyle w:val="000000000000" w:firstRow="0" w:lastRow="0" w:firstColumn="0" w:lastColumn="0" w:oddVBand="0" w:evenVBand="0" w:oddHBand="0" w:evenHBand="0" w:firstRowFirstColumn="0" w:firstRowLastColumn="0" w:lastRowFirstColumn="0" w:lastRowLastColumn="0"/>
             <w:tcW w:w="2567" w:type="dxa"/>
+            <w:tcMar/>
           </w:tcPr>
           <w:p>
             <w:pPr>
               <w:pStyle w:val="TextoTablas"/>
             </w:pPr>
-            <w:hyperlink r:id="rId25" w:history="1">
+            <w:hyperlink w:history="1" r:id="rId25">
               <w:r>
                 <w:rPr>
                   <w:rStyle w:val="Hipervnculo"/>
@@ -13946,7 +13955,7 @@
         </w:numPr>
         <w:ind w:left="1068"/>
       </w:pPr>
-      <w:bookmarkStart w:id="22" w:name="_Toc216368858"/>
+      <w:bookmarkStart w:name="_Toc216368858" w:id="22"/>
       <w:r>
         <w:lastRenderedPageBreak/>
         <w:t>Glosario</w:t>
@@ -14057,8 +14066,8 @@
       </w:pPr>
       <w:r>
         <w:rPr>
-          <w:b/>
-          <w:bCs/>
+          <w:b w:val="1"/>
+          <w:bCs w:val="1"/>
           <w:lang w:eastAsia="es-CO"/>
         </w:rPr>
         <w:t>Imagen corporativa: </w:t>
@@ -14067,7 +14076,19 @@
         <w:rPr>
           <w:lang w:eastAsia="es-CO"/>
         </w:rPr>
-        <w:t>imagen generalmente aceptada de lo que una compañía “significa”. la creación de una imagen corporativa es un ejercicio en la dirección de la percepción.</w:t>
+        <w:t xml:space="preserve">imagen generalmente aceptada de lo que una compañía “significa”. </w:t>
+      </w:r>
+      <w:r>
+        <w:rPr>
+          <w:lang w:eastAsia="es-CO"/>
+        </w:rPr>
+        <w:t>L</w:t>
+      </w:r>
+      <w:r>
+        <w:rPr>
+          <w:lang w:eastAsia="es-CO"/>
+        </w:rPr>
+        <w:t>a creación de una imagen corporativa es un ejercicio en la dirección de la percepción.</w:t>
       </w:r>
     </w:p>
     <w:p>
@@ -14129,6 +14150,48 @@
           <w:lang w:eastAsia="es-CO"/>
         </w:rPr>
       </w:pPr>
+      <w:r>
+        <w:rPr>
+          <w:rStyle w:val="Extranjerismo"/>
+          <w:b w:val="1"/>
+          <w:bCs w:val="1"/>
+          <w:lang w:val="es-CO" w:eastAsia="es-CO"/>
+        </w:rPr>
+        <w:t>Merchandising</w:t>
+      </w:r>
+      <w:r>
+        <w:rPr>
+          <w:b w:val="1"/>
+          <w:bCs w:val="1"/>
+          <w:lang w:eastAsia="es-CO"/>
+        </w:rPr>
+        <w:t> de gestión: </w:t>
+      </w:r>
+      <w:r>
+        <w:rPr>
+          <w:lang w:eastAsia="es-CO"/>
+        </w:rPr>
+        <w:t xml:space="preserve">acción de poner un producto estratégicamente para su fácil acceso y venta. </w:t>
+      </w:r>
+      <w:r>
+        <w:rPr>
+          <w:lang w:eastAsia="es-CO"/>
+        </w:rPr>
+        <w:t>P</w:t>
+      </w:r>
+      <w:r>
+        <w:rPr>
+          <w:lang w:eastAsia="es-CO"/>
+        </w:rPr>
+        <w:t>or ello hay que ajustar y gestionar correctamente el espacio.</w:t>
+      </w:r>
+    </w:p>
+    <w:p>
+      <w:pPr>
+        <w:rPr>
+          <w:lang w:eastAsia="es-CO"/>
+        </w:rPr>
+      </w:pPr>
       <w:proofErr w:type="spellStart"/>
       <w:r>
         <w:rPr>
@@ -14146,38 +14209,6 @@
           <w:bCs/>
           <w:lang w:eastAsia="es-CO"/>
         </w:rPr>
-        <w:t> de gestión: </w:t>
-      </w:r>
-      <w:r>
-        <w:rPr>
-          <w:lang w:eastAsia="es-CO"/>
-        </w:rPr>
-        <w:t>acción de poner un producto estratégicamente para su fácil acceso y venta. por ello hay que ajustar y gestionar correctamente el espacio.</w:t>
-      </w:r>
-    </w:p>
-    <w:p>
-      <w:pPr>
-        <w:rPr>
-          <w:lang w:eastAsia="es-CO"/>
-        </w:rPr>
-      </w:pPr>
-      <w:proofErr w:type="spellStart"/>
-      <w:r>
-        <w:rPr>
-          <w:rStyle w:val="Extranjerismo"/>
-          <w:b/>
-          <w:bCs/>
-          <w:lang w:val="es-CO" w:eastAsia="es-CO"/>
-        </w:rPr>
-        <w:t>Merchandising</w:t>
-      </w:r>
-      <w:proofErr w:type="spellEnd"/>
-      <w:r>
-        <w:rPr>
-          <w:b/>
-          <w:bCs/>
-          <w:lang w:eastAsia="es-CO"/>
-        </w:rPr>
         <w:t> estratégico: </w:t>
       </w:r>
       <w:r>
@@ -14195,11 +14226,10 @@
       </w:pPr>
       <w:r>
         <w:rPr>
-          <w:b/>
-          <w:bCs/>
-          <w:lang w:eastAsia="es-CO"/>
-        </w:rPr>
-        <w:lastRenderedPageBreak/>
+          <w:b w:val="1"/>
+          <w:bCs w:val="1"/>
+          <w:lang w:eastAsia="es-CO"/>
+        </w:rPr>
         <w:t>PLV: </w:t>
       </w:r>
       <w:r>
@@ -14208,7 +14238,6 @@
         </w:rPr>
         <w:t>publicidad en el lugar de venta que engloba expositores, carteles, </w:t>
       </w:r>
-      <w:proofErr w:type="spellStart"/>
       <w:r>
         <w:rPr>
           <w:rStyle w:val="Extranjerismo"/>
@@ -14216,14 +14245,24 @@
         </w:rPr>
         <w:t>displays</w:t>
       </w:r>
-      <w:proofErr w:type="spellEnd"/>
-      <w:r>
-        <w:rPr>
-          <w:lang w:eastAsia="es-CO"/>
-        </w:rPr>
-        <w:t> y otros elementos que sean portadores de un mensaje publicitario y estén colocados en un punto de venta. también se conoce como «POS </w:t>
-      </w:r>
-      <w:proofErr w:type="spellStart"/>
+      <w:r>
+        <w:rPr>
+          <w:lang w:eastAsia="es-CO"/>
+        </w:rPr>
+        <w:t xml:space="preserve"> y otros elementos que sean portadores de un mensaje publicitario y estén colocados en un punto de venta. </w:t>
+      </w:r>
+      <w:r>
+        <w:rPr>
+          <w:lang w:eastAsia="es-CO"/>
+        </w:rPr>
+        <w:t>T</w:t>
+      </w:r>
+      <w:r>
+        <w:rPr>
+          <w:lang w:eastAsia="es-CO"/>
+        </w:rPr>
+        <w:t>ambién se conoce como «POS </w:t>
+      </w:r>
       <w:r>
         <w:rPr>
           <w:rStyle w:val="Extranjerismo"/>
@@ -14231,7 +14270,6 @@
         </w:rPr>
         <w:t>display</w:t>
       </w:r>
-      <w:proofErr w:type="spellEnd"/>
       <w:r>
         <w:rPr>
           <w:lang w:eastAsia="es-CO"/>
@@ -14245,7 +14283,6 @@
         </w:rPr>
         <w:t xml:space="preserve">Point </w:t>
       </w:r>
-      <w:proofErr w:type="spellStart"/>
       <w:r>
         <w:rPr>
           <w:rStyle w:val="Extranjerismo"/>
@@ -14253,7 +14290,6 @@
         </w:rPr>
         <w:t>of</w:t>
       </w:r>
-      <w:proofErr w:type="spellEnd"/>
       <w:r>
         <w:rPr>
           <w:rStyle w:val="Extranjerismo"/>
@@ -14261,7 +14297,6 @@
         </w:rPr>
         <w:t xml:space="preserve"> Sale </w:t>
       </w:r>
-      <w:proofErr w:type="spellStart"/>
       <w:r>
         <w:rPr>
           <w:rStyle w:val="Extranjerismo"/>
@@ -14269,7 +14304,6 @@
         </w:rPr>
         <w:t>Display</w:t>
       </w:r>
-      <w:proofErr w:type="spellEnd"/>
       <w:r>
         <w:rPr>
           <w:lang w:eastAsia="es-CO"/>
@@ -14404,8 +14438,8 @@
       </w:pPr>
       <w:r>
         <w:rPr>
-          <w:b/>
-          <w:bCs/>
+          <w:b w:val="1"/>
+          <w:bCs w:val="1"/>
           <w:lang w:eastAsia="es-CO"/>
         </w:rPr>
         <w:t>Surtido: </w:t>
@@ -14414,7 +14448,19 @@
         <w:rPr>
           <w:lang w:eastAsia="es-CO"/>
         </w:rPr>
-        <w:t>conjunto de artículos que un establecimiento ofrece a la venta. se refiere a la variedad de artículos presentes en la sala de ventas, no a la cantidad de un producto en concreto.</w:t>
+        <w:t xml:space="preserve">conjunto de artículos que un establecimiento ofrece a la venta. </w:t>
+      </w:r>
+      <w:r>
+        <w:rPr>
+          <w:lang w:eastAsia="es-CO"/>
+        </w:rPr>
+        <w:t>S</w:t>
+      </w:r>
+      <w:r>
+        <w:rPr>
+          <w:lang w:eastAsia="es-CO"/>
+        </w:rPr>
+        <w:t>e refiere a la variedad de artículos presentes en la sala de ventas, no a la cantidad de un producto en concreto.</w:t>
       </w:r>
     </w:p>
     <w:p>
@@ -14579,13 +14625,13 @@
         </w:numPr>
         <w:ind w:left="1068"/>
         <w:rPr>
-          <w:bdr w:val="none" w:sz="0" w:space="0" w:color="auto" w:frame="1"/>
-        </w:rPr>
-      </w:pPr>
-      <w:bookmarkStart w:id="23" w:name="_Toc216368859"/>
-      <w:r>
-        <w:rPr>
-          <w:bdr w:val="none" w:sz="0" w:space="0" w:color="auto" w:frame="1"/>
+          <w:bdr w:val="none" w:color="auto" w:sz="0" w:space="0" w:frame="1"/>
+        </w:rPr>
+      </w:pPr>
+      <w:bookmarkStart w:name="_Toc216368859" w:id="23"/>
+      <w:r>
+        <w:rPr>
+          <w:bdr w:val="none" w:color="auto" w:sz="0" w:space="0" w:frame="1"/>
         </w:rPr>
         <w:lastRenderedPageBreak/>
         <w:t>Referencias bibliográficas</w:t>
@@ -14807,7 +14853,7 @@
         </w:rPr>
         <w:t xml:space="preserve"> </w:t>
       </w:r>
-      <w:hyperlink r:id="rId26" w:history="1">
+      <w:hyperlink w:history="1" r:id="rId26">
         <w:r>
           <w:rPr>
             <w:rStyle w:val="Hipervnculo"/>
@@ -14850,7 +14896,7 @@
         </w:rPr>
         <w:t xml:space="preserve"> </w:t>
       </w:r>
-      <w:hyperlink r:id="rId27" w:history="1">
+      <w:hyperlink w:history="1" r:id="rId27">
         <w:r>
           <w:rPr>
             <w:rStyle w:val="Hipervnculo"/>
@@ -14887,7 +14933,7 @@
         </w:rPr>
         <w:t xml:space="preserve"> </w:t>
       </w:r>
-      <w:hyperlink r:id="rId28" w:history="1">
+      <w:hyperlink w:history="1" r:id="rId28">
         <w:r>
           <w:rPr>
             <w:rStyle w:val="Hipervnculo"/>
@@ -14922,7 +14968,7 @@
         </w:numPr>
         <w:ind w:left="708"/>
       </w:pPr>
-      <w:bookmarkStart w:id="24" w:name="_Toc216368860"/>
+      <w:bookmarkStart w:name="_Toc216368860" w:id="24"/>
       <w:r>
         <w:lastRenderedPageBreak/>
         <w:t>Créditos</w:t>
@@ -14950,7 +14996,9 @@
         </w:trPr>
         <w:tc>
           <w:tcPr>
+            <w:cnfStyle w:val="000000000000" w:firstRow="0" w:lastRow="0" w:firstColumn="0" w:lastColumn="0" w:oddVBand="0" w:evenVBand="0" w:oddHBand="0" w:evenHBand="0" w:firstRowFirstColumn="0" w:firstRowLastColumn="0" w:lastRowFirstColumn="0" w:lastRowLastColumn="0"/>
             <w:tcW w:w="2724" w:type="dxa"/>
+            <w:tcMar/>
           </w:tcPr>
           <w:p>
             <w:pPr>
@@ -14963,7 +15011,9 @@
         </w:tc>
         <w:tc>
           <w:tcPr>
+            <w:cnfStyle w:val="000000000000" w:firstRow="0" w:lastRow="0" w:firstColumn="0" w:lastColumn="0" w:oddVBand="0" w:evenVBand="0" w:oddHBand="0" w:evenHBand="0" w:firstRowFirstColumn="0" w:firstRowLastColumn="0" w:lastRowFirstColumn="0" w:lastRowLastColumn="0"/>
             <w:tcW w:w="3139" w:type="dxa"/>
+            <w:tcMar/>
           </w:tcPr>
           <w:p>
             <w:pPr>
@@ -14976,7 +15026,9 @@
         </w:tc>
         <w:tc>
           <w:tcPr>
+            <w:cnfStyle w:val="000000000000" w:firstRow="0" w:lastRow="0" w:firstColumn="0" w:lastColumn="0" w:oddVBand="0" w:evenVBand="0" w:oddHBand="0" w:evenHBand="0" w:firstRowFirstColumn="0" w:firstRowLastColumn="0" w:lastRowFirstColumn="0" w:lastRowLastColumn="0"/>
             <w:tcW w:w="3821" w:type="dxa"/>
+            <w:tcMar/>
           </w:tcPr>
           <w:p>
             <w:pPr>
@@ -15001,7 +15053,9 @@
         </w:trPr>
         <w:tc>
           <w:tcPr>
+            <w:cnfStyle w:val="000000000000" w:firstRow="0" w:lastRow="0" w:firstColumn="0" w:lastColumn="0" w:oddVBand="0" w:evenVBand="0" w:oddHBand="0" w:evenHBand="0" w:firstRowFirstColumn="0" w:firstRowLastColumn="0" w:lastRowFirstColumn="0" w:lastRowLastColumn="0"/>
             <w:tcW w:w="2724" w:type="dxa"/>
+            <w:tcMar/>
           </w:tcPr>
           <w:p>
             <w:pPr>
@@ -15019,7 +15073,9 @@
         </w:tc>
         <w:tc>
           <w:tcPr>
+            <w:cnfStyle w:val="000000000000" w:firstRow="0" w:lastRow="0" w:firstColumn="0" w:lastColumn="0" w:oddVBand="0" w:evenVBand="0" w:oddHBand="0" w:evenHBand="0" w:firstRowFirstColumn="0" w:firstRowLastColumn="0" w:lastRowFirstColumn="0" w:lastRowLastColumn="0"/>
             <w:tcW w:w="3139" w:type="dxa"/>
+            <w:tcMar/>
           </w:tcPr>
           <w:p>
             <w:pPr>
@@ -15032,7 +15088,9 @@
         </w:tc>
         <w:tc>
           <w:tcPr>
+            <w:cnfStyle w:val="000000000000" w:firstRow="0" w:lastRow="0" w:firstColumn="0" w:lastColumn="0" w:oddVBand="0" w:evenVBand="0" w:oddHBand="0" w:evenHBand="0" w:firstRowFirstColumn="0" w:firstRowLastColumn="0" w:lastRowFirstColumn="0" w:lastRowLastColumn="0"/>
             <w:tcW w:w="3821" w:type="dxa"/>
+            <w:tcMar/>
           </w:tcPr>
           <w:p>
             <w:pPr>
@@ -15050,7 +15108,9 @@
         </w:trPr>
         <w:tc>
           <w:tcPr>
+            <w:cnfStyle w:val="000000000000" w:firstRow="0" w:lastRow="0" w:firstColumn="0" w:lastColumn="0" w:oddVBand="0" w:evenVBand="0" w:oddHBand="0" w:evenHBand="0" w:firstRowFirstColumn="0" w:firstRowLastColumn="0" w:lastRowFirstColumn="0" w:lastRowLastColumn="0"/>
             <w:tcW w:w="2724" w:type="dxa"/>
+            <w:tcMar/>
           </w:tcPr>
           <w:p>
             <w:pPr>
@@ -15063,7 +15123,9 @@
         </w:tc>
         <w:tc>
           <w:tcPr>
+            <w:cnfStyle w:val="000000000000" w:firstRow="0" w:lastRow="0" w:firstColumn="0" w:lastColumn="0" w:oddVBand="0" w:evenVBand="0" w:oddHBand="0" w:evenHBand="0" w:firstRowFirstColumn="0" w:firstRowLastColumn="0" w:lastRowFirstColumn="0" w:lastRowLastColumn="0"/>
             <w:tcW w:w="3139" w:type="dxa"/>
+            <w:tcMar/>
           </w:tcPr>
           <w:p>
             <w:pPr>
@@ -15076,7 +15138,9 @@
         </w:tc>
         <w:tc>
           <w:tcPr>
+            <w:cnfStyle w:val="000000000000" w:firstRow="0" w:lastRow="0" w:firstColumn="0" w:lastColumn="0" w:oddVBand="0" w:evenVBand="0" w:oddHBand="0" w:evenHBand="0" w:firstRowFirstColumn="0" w:firstRowLastColumn="0" w:lastRowFirstColumn="0" w:lastRowLastColumn="0"/>
             <w:tcW w:w="3821" w:type="dxa"/>
+            <w:tcMar/>
           </w:tcPr>
           <w:p>
             <w:pPr>
@@ -15095,7 +15159,9 @@
         </w:trPr>
         <w:tc>
           <w:tcPr>
+            <w:cnfStyle w:val="000000000000" w:firstRow="0" w:lastRow="0" w:firstColumn="0" w:lastColumn="0" w:oddVBand="0" w:evenVBand="0" w:oddHBand="0" w:evenHBand="0" w:firstRowFirstColumn="0" w:firstRowLastColumn="0" w:lastRowFirstColumn="0" w:lastRowLastColumn="0"/>
             <w:tcW w:w="2724" w:type="dxa"/>
+            <w:tcMar/>
           </w:tcPr>
           <w:p>
             <w:pPr>
@@ -15108,7 +15174,9 @@
         </w:tc>
         <w:tc>
           <w:tcPr>
+            <w:cnfStyle w:val="000000000000" w:firstRow="0" w:lastRow="0" w:firstColumn="0" w:lastColumn="0" w:oddVBand="0" w:evenVBand="0" w:oddHBand="0" w:evenHBand="0" w:firstRowFirstColumn="0" w:firstRowLastColumn="0" w:lastRowFirstColumn="0" w:lastRowLastColumn="0"/>
             <w:tcW w:w="3139" w:type="dxa"/>
+            <w:tcMar/>
           </w:tcPr>
           <w:p>
             <w:pPr>
@@ -15121,7 +15189,9 @@
         </w:tc>
         <w:tc>
           <w:tcPr>
+            <w:cnfStyle w:val="000000000000" w:firstRow="0" w:lastRow="0" w:firstColumn="0" w:lastColumn="0" w:oddVBand="0" w:evenVBand="0" w:oddHBand="0" w:evenHBand="0" w:firstRowFirstColumn="0" w:firstRowLastColumn="0" w:lastRowFirstColumn="0" w:lastRowLastColumn="0"/>
             <w:tcW w:w="3821" w:type="dxa"/>
+            <w:tcMar/>
           </w:tcPr>
           <w:p>
             <w:pPr>
@@ -15139,7 +15209,9 @@
         </w:trPr>
         <w:tc>
           <w:tcPr>
+            <w:cnfStyle w:val="000000000000" w:firstRow="0" w:lastRow="0" w:firstColumn="0" w:lastColumn="0" w:oddVBand="0" w:evenVBand="0" w:oddHBand="0" w:evenHBand="0" w:firstRowFirstColumn="0" w:firstRowLastColumn="0" w:lastRowFirstColumn="0" w:lastRowLastColumn="0"/>
             <w:tcW w:w="2724" w:type="dxa"/>
+            <w:tcMar/>
           </w:tcPr>
           <w:p>
             <w:pPr>
@@ -15152,7 +15224,9 @@
         </w:tc>
         <w:tc>
           <w:tcPr>
+            <w:cnfStyle w:val="000000000000" w:firstRow="0" w:lastRow="0" w:firstColumn="0" w:lastColumn="0" w:oddVBand="0" w:evenVBand="0" w:oddHBand="0" w:evenHBand="0" w:firstRowFirstColumn="0" w:firstRowLastColumn="0" w:lastRowFirstColumn="0" w:lastRowLastColumn="0"/>
             <w:tcW w:w="3139" w:type="dxa"/>
+            <w:tcMar/>
           </w:tcPr>
           <w:p>
             <w:pPr>
@@ -15165,7 +15239,9 @@
         </w:tc>
         <w:tc>
           <w:tcPr>
+            <w:cnfStyle w:val="000000000000" w:firstRow="0" w:lastRow="0" w:firstColumn="0" w:lastColumn="0" w:oddVBand="0" w:evenVBand="0" w:oddHBand="0" w:evenHBand="0" w:firstRowFirstColumn="0" w:firstRowLastColumn="0" w:lastRowFirstColumn="0" w:lastRowLastColumn="0"/>
             <w:tcW w:w="3821" w:type="dxa"/>
+            <w:tcMar/>
           </w:tcPr>
           <w:p>
             <w:pPr>
@@ -15184,7 +15260,9 @@
         </w:trPr>
         <w:tc>
           <w:tcPr>
+            <w:cnfStyle w:val="000000000000" w:firstRow="0" w:lastRow="0" w:firstColumn="0" w:lastColumn="0" w:oddVBand="0" w:evenVBand="0" w:oddHBand="0" w:evenHBand="0" w:firstRowFirstColumn="0" w:firstRowLastColumn="0" w:lastRowFirstColumn="0" w:lastRowLastColumn="0"/>
             <w:tcW w:w="2724" w:type="dxa"/>
+            <w:tcMar/>
           </w:tcPr>
           <w:p>
             <w:pPr>
@@ -15197,7 +15275,9 @@
         </w:tc>
         <w:tc>
           <w:tcPr>
+            <w:cnfStyle w:val="000000000000" w:firstRow="0" w:lastRow="0" w:firstColumn="0" w:lastColumn="0" w:oddVBand="0" w:evenVBand="0" w:oddHBand="0" w:evenHBand="0" w:firstRowFirstColumn="0" w:firstRowLastColumn="0" w:lastRowFirstColumn="0" w:lastRowLastColumn="0"/>
             <w:tcW w:w="3139" w:type="dxa"/>
+            <w:tcMar/>
           </w:tcPr>
           <w:p>
             <w:pPr>
@@ -15210,7 +15290,9 @@
         </w:tc>
         <w:tc>
           <w:tcPr>
+            <w:cnfStyle w:val="000000000000" w:firstRow="0" w:lastRow="0" w:firstColumn="0" w:lastColumn="0" w:oddVBand="0" w:evenVBand="0" w:oddHBand="0" w:evenHBand="0" w:firstRowFirstColumn="0" w:firstRowLastColumn="0" w:lastRowFirstColumn="0" w:lastRowLastColumn="0"/>
             <w:tcW w:w="3821" w:type="dxa"/>
+            <w:tcMar/>
           </w:tcPr>
           <w:p>
             <w:pPr>
@@ -15228,7 +15310,9 @@
         </w:trPr>
         <w:tc>
           <w:tcPr>
+            <w:cnfStyle w:val="000000000000" w:firstRow="0" w:lastRow="0" w:firstColumn="0" w:lastColumn="0" w:oddVBand="0" w:evenVBand="0" w:oddHBand="0" w:evenHBand="0" w:firstRowFirstColumn="0" w:firstRowLastColumn="0" w:lastRowFirstColumn="0" w:lastRowLastColumn="0"/>
             <w:tcW w:w="2724" w:type="dxa"/>
+            <w:tcMar/>
           </w:tcPr>
           <w:p>
             <w:pPr>
@@ -15241,14 +15325,25 @@
         </w:tc>
         <w:tc>
           <w:tcPr>
+            <w:cnfStyle w:val="000000000000" w:firstRow="0" w:lastRow="0" w:firstColumn="0" w:lastColumn="0" w:oddVBand="0" w:evenVBand="0" w:oddHBand="0" w:evenHBand="0" w:firstRowFirstColumn="0" w:firstRowLastColumn="0" w:lastRowFirstColumn="0" w:lastRowLastColumn="0"/>
             <w:tcW w:w="3139" w:type="dxa"/>
+            <w:tcMar/>
           </w:tcPr>
           <w:p>
             <w:pPr>
               <w:pStyle w:val="TextoTablas"/>
             </w:pPr>
             <w:r>
-              <w:t xml:space="preserve">Desarrollador </w:t>
+              <w:rPr/>
+              <w:t>Desarrollador</w:t>
+            </w:r>
+            <w:r>
+              <w:rPr/>
+              <w:t>a</w:t>
+            </w:r>
+            <w:r>
+              <w:rPr/>
+              <w:t xml:space="preserve"> </w:t>
             </w:r>
             <w:r>
               <w:rPr>
@@ -15281,13 +15376,16 @@
               <w:t>stack</w:t>
             </w:r>
             <w:r>
+              <w:rPr/>
               <w:t xml:space="preserve"> Junior</w:t>
             </w:r>
           </w:p>
         </w:tc>
         <w:tc>
           <w:tcPr>
+            <w:cnfStyle w:val="000000000000" w:firstRow="0" w:lastRow="0" w:firstColumn="0" w:lastColumn="0" w:oddVBand="0" w:evenVBand="0" w:oddHBand="0" w:evenHBand="0" w:firstRowFirstColumn="0" w:firstRowLastColumn="0" w:lastRowFirstColumn="0" w:lastRowLastColumn="0"/>
             <w:tcW w:w="3821" w:type="dxa"/>
+            <w:tcMar/>
           </w:tcPr>
           <w:p>
             <w:pPr>
@@ -15306,7 +15404,9 @@
         </w:trPr>
         <w:tc>
           <w:tcPr>
+            <w:cnfStyle w:val="000000000000" w:firstRow="0" w:lastRow="0" w:firstColumn="0" w:lastColumn="0" w:oddVBand="0" w:evenVBand="0" w:oddHBand="0" w:evenHBand="0" w:firstRowFirstColumn="0" w:firstRowLastColumn="0" w:lastRowFirstColumn="0" w:lastRowLastColumn="0"/>
             <w:tcW w:w="2724" w:type="dxa"/>
+            <w:tcMar/>
           </w:tcPr>
           <w:p>
             <w:pPr>
@@ -15319,20 +15419,41 @@
         </w:tc>
         <w:tc>
           <w:tcPr>
+            <w:cnfStyle w:val="000000000000" w:firstRow="0" w:lastRow="0" w:firstColumn="0" w:lastColumn="0" w:oddVBand="0" w:evenVBand="0" w:oddHBand="0" w:evenHBand="0" w:firstRowFirstColumn="0" w:firstRowLastColumn="0" w:lastRowFirstColumn="0" w:lastRowLastColumn="0"/>
             <w:tcW w:w="3139" w:type="dxa"/>
+            <w:tcMar/>
           </w:tcPr>
           <w:p>
             <w:pPr>
               <w:pStyle w:val="TextoTablas"/>
             </w:pPr>
             <w:r>
-              <w:t>Animador y producción audiovisual</w:t>
+              <w:rPr/>
+              <w:t>Animador</w:t>
+            </w:r>
+            <w:r>
+              <w:rPr/>
+              <w:t>a</w:t>
+            </w:r>
+            <w:r>
+              <w:rPr/>
+              <w:t xml:space="preserve"> y pr</w:t>
+            </w:r>
+            <w:r>
+              <w:rPr/>
+              <w:t xml:space="preserve">uctora </w:t>
+            </w:r>
+            <w:r>
+              <w:rPr/>
+              <w:t>audiovisual</w:t>
             </w:r>
           </w:p>
         </w:tc>
         <w:tc>
           <w:tcPr>
+            <w:cnfStyle w:val="000000000000" w:firstRow="0" w:lastRow="0" w:firstColumn="0" w:lastColumn="0" w:oddVBand="0" w:evenVBand="0" w:oddHBand="0" w:evenHBand="0" w:firstRowFirstColumn="0" w:firstRowLastColumn="0" w:lastRowFirstColumn="0" w:lastRowLastColumn="0"/>
             <w:tcW w:w="3821" w:type="dxa"/>
+            <w:tcMar/>
           </w:tcPr>
           <w:p>
             <w:pPr>
@@ -15350,7 +15471,9 @@
         </w:trPr>
         <w:tc>
           <w:tcPr>
+            <w:cnfStyle w:val="000000000000" w:firstRow="0" w:lastRow="0" w:firstColumn="0" w:lastColumn="0" w:oddVBand="0" w:evenVBand="0" w:oddHBand="0" w:evenHBand="0" w:firstRowFirstColumn="0" w:firstRowLastColumn="0" w:lastRowFirstColumn="0" w:lastRowLastColumn="0"/>
             <w:tcW w:w="2724" w:type="dxa"/>
+            <w:tcMar/>
           </w:tcPr>
           <w:p>
             <w:pPr>
@@ -15379,7 +15502,9 @@
         </w:tc>
         <w:tc>
           <w:tcPr>
+            <w:cnfStyle w:val="000000000000" w:firstRow="0" w:lastRow="0" w:firstColumn="0" w:lastColumn="0" w:oddVBand="0" w:evenVBand="0" w:oddHBand="0" w:evenHBand="0" w:firstRowFirstColumn="0" w:firstRowLastColumn="0" w:lastRowFirstColumn="0" w:lastRowLastColumn="0"/>
             <w:tcW w:w="3139" w:type="dxa"/>
+            <w:tcMar/>
           </w:tcPr>
           <w:p>
             <w:pPr>
@@ -15392,7 +15517,9 @@
         </w:tc>
         <w:tc>
           <w:tcPr>
+            <w:cnfStyle w:val="000000000000" w:firstRow="0" w:lastRow="0" w:firstColumn="0" w:lastColumn="0" w:oddVBand="0" w:evenVBand="0" w:oddHBand="0" w:evenHBand="0" w:firstRowFirstColumn="0" w:firstRowLastColumn="0" w:lastRowFirstColumn="0" w:lastRowLastColumn="0"/>
             <w:tcW w:w="3821" w:type="dxa"/>
+            <w:tcMar/>
           </w:tcPr>
           <w:p>
             <w:pPr>
@@ -15411,7 +15538,9 @@
         </w:trPr>
         <w:tc>
           <w:tcPr>
+            <w:cnfStyle w:val="000000000000" w:firstRow="0" w:lastRow="0" w:firstColumn="0" w:lastColumn="0" w:oddVBand="0" w:evenVBand="0" w:oddHBand="0" w:evenHBand="0" w:firstRowFirstColumn="0" w:firstRowLastColumn="0" w:lastRowFirstColumn="0" w:lastRowLastColumn="0"/>
             <w:tcW w:w="2724" w:type="dxa"/>
+            <w:tcMar/>
           </w:tcPr>
           <w:p>
             <w:pPr>
@@ -15424,7 +15553,9 @@
         </w:tc>
         <w:tc>
           <w:tcPr>
+            <w:cnfStyle w:val="000000000000" w:firstRow="0" w:lastRow="0" w:firstColumn="0" w:lastColumn="0" w:oddVBand="0" w:evenVBand="0" w:oddHBand="0" w:evenHBand="0" w:firstRowFirstColumn="0" w:firstRowLastColumn="0" w:lastRowFirstColumn="0" w:lastRowLastColumn="0"/>
             <w:tcW w:w="3139" w:type="dxa"/>
+            <w:tcMar/>
           </w:tcPr>
           <w:p>
             <w:pPr>
@@ -15437,7 +15568,9 @@
         </w:tc>
         <w:tc>
           <w:tcPr>
+            <w:cnfStyle w:val="000000000000" w:firstRow="0" w:lastRow="0" w:firstColumn="0" w:lastColumn="0" w:oddVBand="0" w:evenVBand="0" w:oddHBand="0" w:evenHBand="0" w:firstRowFirstColumn="0" w:firstRowLastColumn="0" w:lastRowFirstColumn="0" w:lastRowLastColumn="0"/>
             <w:tcW w:w="3821" w:type="dxa"/>
+            <w:tcMar/>
           </w:tcPr>
           <w:p>
             <w:pPr>
@@ -15460,7 +15593,7 @@
     <w:sectPr>
       <w:headerReference w:type="default" r:id="rId29"/>
       <w:footerReference w:type="default" r:id="rId30"/>
-      <w:pgSz w:w="12240" w:h="15840"/>
+      <w:pgSz w:w="12240" w:h="15840" w:orient="portrait"/>
       <w:pgMar w:top="1701" w:right="1134" w:bottom="1134" w:left="1134" w:header="709" w:footer="737" w:gutter="0"/>
       <w:pgNumType w:start="1"/>
       <w:cols w:space="708"/>
@@ -15524,7 +15657,7 @@
 </file>
 
 <file path=word/footer2.xml><?xml version="1.0" encoding="utf-8"?>
-<w:ftr xmlns:wpc="http://schemas.microsoft.com/office/word/2010/wordprocessingCanvas" xmlns:cx="http://schemas.microsoft.com/office/drawing/2014/chartex" xmlns:cx1="http://schemas.microsoft.com/office/drawing/2015/9/8/chartex" xmlns:cx2="http://schemas.microsoft.com/office/drawing/2015/10/21/chartex" xmlns:cx3="http://schemas.microsoft.com/office/drawing/2016/5/9/chartex" xmlns:cx4="http://schemas.microsoft.com/office/drawing/2016/5/10/chartex" xmlns:cx5="http://schemas.microsoft.com/office/drawing/2016/5/11/chartex" xmlns:cx6="http://schemas.microsoft.com/office/drawing/2016/5/12/chartex" xmlns:cx7="http://schemas.microsoft.com/office/drawing/2016/5/13/chartex" xmlns:cx8="http://schemas.microsoft.com/office/drawing/2016/5/14/chartex" xmlns:mc="http://schemas.openxmlformats.org/markup-compatibility/2006" xmlns:aink="http://schemas.microsoft.com/office/drawing/2016/ink" xmlns:am3d="http://schemas.microsoft.com/office/drawing/2017/model3d" xmlns:o="urn:schemas-microsoft-com:office:office" xmlns:r="http://schemas.openxmlformats.org/officeDocument/2006/relationships" xmlns:m="http://schemas.openxmlformats.org/officeDocument/2006/math" xmlns:v="urn:schemas-microsoft-com:vml" xmlns:wp14="http://schemas.microsoft.com/office/word/2010/wordprocessingDrawing" xmlns:wp="http://schemas.openxmlformats.org/drawingml/2006/wordprocessingDrawing" xmlns:w10="urn:schemas-microsoft-com:office:word" xmlns:w="http://schemas.openxmlformats.org/wordprocessingml/2006/main" xmlns:w14="http://schemas.microsoft.com/office/word/2010/wordml" xmlns:w15="http://schemas.microsoft.com/office/word/2012/wordml" xmlns:w16cex="http://schemas.microsoft.com/office/word/2018/wordml/cex" xmlns:w16cid="http://schemas.microsoft.com/office/word/2016/wordml/cid" xmlns:w16="http://schemas.microsoft.com/office/word/2018/wordml" xmlns:w16sdtdh="http://schemas.microsoft.com/office/word/2020/wordml/sdtdatahash" xmlns:w16se="http://schemas.microsoft.com/office/word/2015/wordml/symex" xmlns:wpg="http://schemas.microsoft.com/office/word/2010/wordprocessingGroup" xmlns:wpi="http://schemas.microsoft.com/office/word/2010/wordprocessingInk" xmlns:wne="http://schemas.microsoft.com/office/word/2006/wordml" xmlns:wps="http://schemas.microsoft.com/office/word/2010/wordprocessingShape" mc:Ignorable="w14 w15 w16se w16cid w16 w16cex w16sdtdh wp14">
+<w:ftr xmlns:wpc="http://schemas.microsoft.com/office/word/2010/wordprocessingCanvas" xmlns:cx="http://schemas.microsoft.com/office/drawing/2014/chartex" xmlns:cx1="http://schemas.microsoft.com/office/drawing/2015/9/8/chartex" xmlns:cx2="http://schemas.microsoft.com/office/drawing/2015/10/21/chartex" xmlns:cx3="http://schemas.microsoft.com/office/drawing/2016/5/9/chartex" xmlns:cx4="http://schemas.microsoft.com/office/drawing/2016/5/10/chartex" xmlns:cx5="http://schemas.microsoft.com/office/drawing/2016/5/11/chartex" xmlns:cx6="http://schemas.microsoft.com/office/drawing/2016/5/12/chartex" xmlns:cx7="http://schemas.microsoft.com/office/drawing/2016/5/13/chartex" xmlns:cx8="http://schemas.microsoft.com/office/drawing/2016/5/14/chartex" xmlns:mc="http://schemas.openxmlformats.org/markup-compatibility/2006" xmlns:aink="http://schemas.microsoft.com/office/drawing/2016/ink" xmlns:am3d="http://schemas.microsoft.com/office/drawing/2017/model3d" xmlns:o="urn:schemas-microsoft-com:office:office" xmlns:r="http://schemas.openxmlformats.org/officeDocument/2006/relationships" xmlns:m="http://schemas.openxmlformats.org/officeDocument/2006/math" xmlns:v="urn:schemas-microsoft-com:vml" xmlns:wp14="http://schemas.microsoft.com/office/word/2010/wordprocessingDrawing" xmlns:wp="http://schemas.openxmlformats.org/drawingml/2006/wordprocessingDrawing" xmlns:w10="urn:schemas-microsoft-com:office:word" xmlns:w="http://schemas.openxmlformats.org/wordprocessingml/2006/main" xmlns:w14="http://schemas.microsoft.com/office/word/2010/wordml" xmlns:w15="http://schemas.microsoft.com/office/word/2012/wordml" xmlns:w16cex="http://schemas.microsoft.com/office/word/2018/wordml/cex" xmlns:w16cid="http://schemas.microsoft.com/office/word/2016/wordml/cid" xmlns:w16="http://schemas.microsoft.com/office/word/2018/wordml" xmlns:w16sdtdh="http://schemas.microsoft.com/office/word/2020/wordml/sdtdatahash" xmlns:w16se="http://schemas.microsoft.com/office/word/2015/wordml/symex" xmlns:wpg="http://schemas.microsoft.com/office/word/2010/wordprocessingGroup" xmlns:wpi="http://schemas.microsoft.com/office/word/2010/wordprocessingInk" xmlns:wne="http://schemas.microsoft.com/office/word/2006/wordml" xmlns:wps="http://schemas.microsoft.com/office/word/2010/wordprocessingShape" xmlns:a="http://schemas.openxmlformats.org/drawingml/2006/main" xmlns:adec="http://schemas.microsoft.com/office/drawing/2017/decorative" mc:Ignorable="w14 w15 w16se w16cid w16 w16cex w16sdtdh wp14">
   <w:sdt>
     <w:sdtPr>
       <w:id w:val="-1465197936"/>
@@ -15624,11 +15757,11 @@
             </mc:Choice>
             <mc:Fallback>
               <w:pict>
-                <v:shapetype w14:anchorId="797C42AF" id="_x0000_t202" coordsize="21600,21600" o:spt="202" path="m,l,21600r21600,l21600,xe">
+                <v:shapetype id="_x0000_t202" coordsize="21600,21600" o:spt="202" path="m,l,21600r21600,l21600,xe" w14:anchorId="797C42AF">
                   <v:stroke joinstyle="miter"/>
                   <v:path gradientshapeok="t" o:connecttype="rect"/>
                 </v:shapetype>
-                <v:shape id="_x0000_s1027" type="#_x0000_t202" alt="&quot;&quot;" style="position:absolute;left:0;text-align:left;margin-left:16.1pt;margin-top:.65pt;width:455.15pt;height:41.4pt;z-index:251661312;visibility:visible;mso-wrap-style:square;mso-width-percent:0;mso-height-percent:0;mso-wrap-distance-left:9pt;mso-wrap-distance-top:3.6pt;mso-wrap-distance-right:9pt;mso-wrap-distance-bottom:3.6pt;mso-position-horizontal:absolute;mso-position-horizontal-relative:text;mso-position-vertical:absolute;mso-position-vertical-relative:text;mso-width-percent:0;mso-height-percent:0;mso-width-relative:margin;mso-height-relative:margin;v-text-anchor:top" o:gfxdata="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" stroked="f">
+                <v:shape id="_x0000_s1027" style="position:absolute;left:0;text-align:left;margin-left:16.1pt;margin-top:.65pt;width:455.15pt;height:41.4pt;z-index:251661312;visibility:visible;mso-wrap-style:square;mso-width-percent:0;mso-height-percent:0;mso-wrap-distance-left:9pt;mso-wrap-distance-top:3.6pt;mso-wrap-distance-right:9pt;mso-wrap-distance-bottom:3.6pt;mso-position-horizontal:absolute;mso-position-horizontal-relative:text;mso-position-vertical:absolute;mso-position-vertical-relative:text;mso-width-percent:0;mso-height-percent:0;mso-width-relative:margin;mso-height-relative:margin;v-text-anchor:top" alt="&quot;&quot;" stroked="f" type="#_x0000_t202" o:gfxdata="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">
                   <v:textbox>
                     <w:txbxContent>
                       <w:p>
@@ -15705,7 +15838,7 @@
 </file>
 
 <file path=word/header1.xml><?xml version="1.0" encoding="utf-8"?>
-<w:hdr xmlns:wpc="http://schemas.microsoft.com/office/word/2010/wordprocessingCanvas" xmlns:cx="http://schemas.microsoft.com/office/drawing/2014/chartex" xmlns:cx1="http://schemas.microsoft.com/office/drawing/2015/9/8/chartex" xmlns:cx2="http://schemas.microsoft.com/office/drawing/2015/10/21/chartex" xmlns:cx3="http://schemas.microsoft.com/office/drawing/2016/5/9/chartex" xmlns:cx4="http://schemas.microsoft.com/office/drawing/2016/5/10/chartex" xmlns:cx5="http://schemas.microsoft.com/office/drawing/2016/5/11/chartex" xmlns:cx6="http://schemas.microsoft.com/office/drawing/2016/5/12/chartex" xmlns:cx7="http://schemas.microsoft.com/office/drawing/2016/5/13/chartex" xmlns:cx8="http://schemas.microsoft.com/office/drawing/2016/5/14/chartex" xmlns:mc="http://schemas.openxmlformats.org/markup-compatibility/2006" xmlns:aink="http://schemas.microsoft.com/office/drawing/2016/ink" xmlns:am3d="http://schemas.microsoft.com/office/drawing/2017/model3d" xmlns:o="urn:schemas-microsoft-com:office:office" xmlns:r="http://schemas.openxmlformats.org/officeDocument/2006/relationships" xmlns:m="http://schemas.openxmlformats.org/officeDocument/2006/math" xmlns:v="urn:schemas-microsoft-com:vml" xmlns:wp14="http://schemas.microsoft.com/office/word/2010/wordprocessingDrawing" xmlns:wp="http://schemas.openxmlformats.org/drawingml/2006/wordprocessingDrawing" xmlns:w10="urn:schemas-microsoft-com:office:word" xmlns:w="http://schemas.openxmlformats.org/wordprocessingml/2006/main" xmlns:w14="http://schemas.microsoft.com/office/word/2010/wordml" xmlns:w15="http://schemas.microsoft.com/office/word/2012/wordml" xmlns:w16cex="http://schemas.microsoft.com/office/word/2018/wordml/cex" xmlns:w16cid="http://schemas.microsoft.com/office/word/2016/wordml/cid" xmlns:w16="http://schemas.microsoft.com/office/word/2018/wordml" xmlns:w16sdtdh="http://schemas.microsoft.com/office/word/2020/wordml/sdtdatahash" xmlns:w16se="http://schemas.microsoft.com/office/word/2015/wordml/symex" xmlns:wpg="http://schemas.microsoft.com/office/word/2010/wordprocessingGroup" xmlns:wpi="http://schemas.microsoft.com/office/word/2010/wordprocessingInk" xmlns:wne="http://schemas.microsoft.com/office/word/2006/wordml" xmlns:wps="http://schemas.microsoft.com/office/word/2010/wordprocessingShape" mc:Ignorable="w14 w15 w16se w16cid w16 w16cex w16sdtdh wp14">
+<w:hdr xmlns:wpc="http://schemas.microsoft.com/office/word/2010/wordprocessingCanvas" xmlns:cx="http://schemas.microsoft.com/office/drawing/2014/chartex" xmlns:cx1="http://schemas.microsoft.com/office/drawing/2015/9/8/chartex" xmlns:cx2="http://schemas.microsoft.com/office/drawing/2015/10/21/chartex" xmlns:cx3="http://schemas.microsoft.com/office/drawing/2016/5/9/chartex" xmlns:cx4="http://schemas.microsoft.com/office/drawing/2016/5/10/chartex" xmlns:cx5="http://schemas.microsoft.com/office/drawing/2016/5/11/chartex" xmlns:cx6="http://schemas.microsoft.com/office/drawing/2016/5/12/chartex" xmlns:cx7="http://schemas.microsoft.com/office/drawing/2016/5/13/chartex" xmlns:cx8="http://schemas.microsoft.com/office/drawing/2016/5/14/chartex" xmlns:mc="http://schemas.openxmlformats.org/markup-compatibility/2006" xmlns:aink="http://schemas.microsoft.com/office/drawing/2016/ink" xmlns:am3d="http://schemas.microsoft.com/office/drawing/2017/model3d" xmlns:o="urn:schemas-microsoft-com:office:office" xmlns:r="http://schemas.openxmlformats.org/officeDocument/2006/relationships" xmlns:m="http://schemas.openxmlformats.org/officeDocument/2006/math" xmlns:v="urn:schemas-microsoft-com:vml" xmlns:wp14="http://schemas.microsoft.com/office/word/2010/wordprocessingDrawing" xmlns:wp="http://schemas.openxmlformats.org/drawingml/2006/wordprocessingDrawing" xmlns:w10="urn:schemas-microsoft-com:office:word" xmlns:w="http://schemas.openxmlformats.org/wordprocessingml/2006/main" xmlns:w14="http://schemas.microsoft.com/office/word/2010/wordml" xmlns:w15="http://schemas.microsoft.com/office/word/2012/wordml" xmlns:w16cex="http://schemas.microsoft.com/office/word/2018/wordml/cex" xmlns:w16cid="http://schemas.microsoft.com/office/word/2016/wordml/cid" xmlns:w16="http://schemas.microsoft.com/office/word/2018/wordml" xmlns:w16sdtdh="http://schemas.microsoft.com/office/word/2020/wordml/sdtdatahash" xmlns:w16se="http://schemas.microsoft.com/office/word/2015/wordml/symex" xmlns:wpg="http://schemas.microsoft.com/office/word/2010/wordprocessingGroup" xmlns:wpi="http://schemas.microsoft.com/office/word/2010/wordprocessingInk" xmlns:wne="http://schemas.microsoft.com/office/word/2006/wordml" xmlns:wps="http://schemas.microsoft.com/office/word/2010/wordprocessingShape" xmlns:a="http://schemas.openxmlformats.org/drawingml/2006/main" xmlns:adec="http://schemas.microsoft.com/office/drawing/2017/decorative" xmlns:pic="http://schemas.openxmlformats.org/drawingml/2006/picture" xmlns:a14="http://schemas.microsoft.com/office/drawing/2010/main" xmlns:asvg="http://schemas.microsoft.com/office/drawing/2016/SVG/main" mc:Ignorable="w14 w15 w16se w16cid w16 w16cex w16sdtdh wp14">
   <w:p>
     <w:pPr>
       <w:pStyle w:val="Encabezado"/>
@@ -15810,7 +15943,7 @@
         <w:ind w:left="360" w:hanging="360"/>
       </w:pPr>
       <w:rPr>
-        <w:rFonts w:ascii="Symbol" w:hAnsi="Symbol" w:hint="default"/>
+        <w:rFonts w:hint="default" w:ascii="Symbol" w:hAnsi="Symbol"/>
       </w:rPr>
     </w:lvl>
   </w:abstractNum>
@@ -15827,7 +15960,7 @@
         <w:ind w:left="1080" w:hanging="360"/>
       </w:pPr>
       <w:rPr>
-        <w:rFonts w:ascii="Symbol" w:hAnsi="Symbol" w:hint="default"/>
+        <w:rFonts w:hint="default" w:ascii="Symbol" w:hAnsi="Symbol"/>
       </w:rPr>
     </w:lvl>
     <w:lvl w:ilvl="1" w:tplc="240A0003" w:tentative="1">
@@ -15839,7 +15972,7 @@
         <w:ind w:left="1800" w:hanging="360"/>
       </w:pPr>
       <w:rPr>
-        <w:rFonts w:ascii="Courier New" w:hAnsi="Courier New" w:cs="Courier New" w:hint="default"/>
+        <w:rFonts w:hint="default" w:ascii="Courier New" w:hAnsi="Courier New" w:cs="Courier New"/>
       </w:rPr>
     </w:lvl>
     <w:lvl w:ilvl="2" w:tplc="240A0005" w:tentative="1">
@@ -15851,7 +15984,7 @@
         <w:ind w:left="2520" w:hanging="360"/>
       </w:pPr>
       <w:rPr>
-        <w:rFonts w:ascii="Wingdings" w:hAnsi="Wingdings" w:hint="default"/>
+        <w:rFonts w:hint="default" w:ascii="Wingdings" w:hAnsi="Wingdings"/>
       </w:rPr>
     </w:lvl>
     <w:lvl w:ilvl="3" w:tplc="240A0001" w:tentative="1">
@@ -15863,7 +15996,7 @@
         <w:ind w:left="3240" w:hanging="360"/>
       </w:pPr>
       <w:rPr>
-        <w:rFonts w:ascii="Symbol" w:hAnsi="Symbol" w:hint="default"/>
+        <w:rFonts w:hint="default" w:ascii="Symbol" w:hAnsi="Symbol"/>
       </w:rPr>
     </w:lvl>
     <w:lvl w:ilvl="4" w:tplc="240A0003" w:tentative="1">
@@ -15875,7 +16008,7 @@
         <w:ind w:left="3960" w:hanging="360"/>
       </w:pPr>
       <w:rPr>
-        <w:rFonts w:ascii="Courier New" w:hAnsi="Courier New" w:cs="Courier New" w:hint="default"/>
+        <w:rFonts w:hint="default" w:ascii="Courier New" w:hAnsi="Courier New" w:cs="Courier New"/>
       </w:rPr>
     </w:lvl>
     <w:lvl w:ilvl="5" w:tplc="240A0005" w:tentative="1">
@@ -15887,7 +16020,7 @@
         <w:ind w:left="4680" w:hanging="360"/>
       </w:pPr>
       <w:rPr>
-        <w:rFonts w:ascii="Wingdings" w:hAnsi="Wingdings" w:hint="default"/>
+        <w:rFonts w:hint="default" w:ascii="Wingdings" w:hAnsi="Wingdings"/>
       </w:rPr>
     </w:lvl>
     <w:lvl w:ilvl="6" w:tplc="240A0001" w:tentative="1">
@@ -15899,7 +16032,7 @@
         <w:ind w:left="5400" w:hanging="360"/>
       </w:pPr>
       <w:rPr>
-        <w:rFonts w:ascii="Symbol" w:hAnsi="Symbol" w:hint="default"/>
+        <w:rFonts w:hint="default" w:ascii="Symbol" w:hAnsi="Symbol"/>
       </w:rPr>
     </w:lvl>
     <w:lvl w:ilvl="7" w:tplc="240A0003" w:tentative="1">
@@ -15911,7 +16044,7 @@
         <w:ind w:left="6120" w:hanging="360"/>
       </w:pPr>
       <w:rPr>
-        <w:rFonts w:ascii="Courier New" w:hAnsi="Courier New" w:cs="Courier New" w:hint="default"/>
+        <w:rFonts w:hint="default" w:ascii="Courier New" w:hAnsi="Courier New" w:cs="Courier New"/>
       </w:rPr>
     </w:lvl>
     <w:lvl w:ilvl="8" w:tplc="240A0005" w:tentative="1">
@@ -15923,7 +16056,7 @@
         <w:ind w:left="6840" w:hanging="360"/>
       </w:pPr>
       <w:rPr>
-        <w:rFonts w:ascii="Wingdings" w:hAnsi="Wingdings" w:hint="default"/>
+        <w:rFonts w:hint="default" w:ascii="Wingdings" w:hAnsi="Wingdings"/>
       </w:rPr>
     </w:lvl>
   </w:abstractNum>
@@ -15940,7 +16073,7 @@
         <w:ind w:left="1080" w:hanging="360"/>
       </w:pPr>
       <w:rPr>
-        <w:rFonts w:ascii="Symbol" w:hAnsi="Symbol" w:hint="default"/>
+        <w:rFonts w:hint="default" w:ascii="Symbol" w:hAnsi="Symbol"/>
       </w:rPr>
     </w:lvl>
     <w:lvl w:ilvl="1" w:tplc="240A0003" w:tentative="1">
@@ -15952,7 +16085,7 @@
         <w:ind w:left="1800" w:hanging="360"/>
       </w:pPr>
       <w:rPr>
-        <w:rFonts w:ascii="Courier New" w:hAnsi="Courier New" w:cs="Courier New" w:hint="default"/>
+        <w:rFonts w:hint="default" w:ascii="Courier New" w:hAnsi="Courier New" w:cs="Courier New"/>
       </w:rPr>
     </w:lvl>
     <w:lvl w:ilvl="2" w:tplc="240A0005" w:tentative="1">
@@ -15964,7 +16097,7 @@
         <w:ind w:left="2520" w:hanging="360"/>
       </w:pPr>
       <w:rPr>
-        <w:rFonts w:ascii="Wingdings" w:hAnsi="Wingdings" w:hint="default"/>
+        <w:rFonts w:hint="default" w:ascii="Wingdings" w:hAnsi="Wingdings"/>
       </w:rPr>
     </w:lvl>
     <w:lvl w:ilvl="3" w:tplc="240A0001" w:tentative="1">
@@ -15976,7 +16109,7 @@
         <w:ind w:left="3240" w:hanging="360"/>
       </w:pPr>
       <w:rPr>
-        <w:rFonts w:ascii="Symbol" w:hAnsi="Symbol" w:hint="default"/>
+        <w:rFonts w:hint="default" w:ascii="Symbol" w:hAnsi="Symbol"/>
       </w:rPr>
     </w:lvl>
     <w:lvl w:ilvl="4" w:tplc="240A0003" w:tentative="1">
@@ -15988,7 +16121,7 @@
         <w:ind w:left="3960" w:hanging="360"/>
       </w:pPr>
       <w:rPr>
-        <w:rFonts w:ascii="Courier New" w:hAnsi="Courier New" w:cs="Courier New" w:hint="default"/>
+        <w:rFonts w:hint="default" w:ascii="Courier New" w:hAnsi="Courier New" w:cs="Courier New"/>
       </w:rPr>
     </w:lvl>
     <w:lvl w:ilvl="5" w:tplc="240A0005" w:tentative="1">
@@ -16000,7 +16133,7 @@
         <w:ind w:left="4680" w:hanging="360"/>
       </w:pPr>
       <w:rPr>
-        <w:rFonts w:ascii="Wingdings" w:hAnsi="Wingdings" w:hint="default"/>
+        <w:rFonts w:hint="default" w:ascii="Wingdings" w:hAnsi="Wingdings"/>
       </w:rPr>
     </w:lvl>
     <w:lvl w:ilvl="6" w:tplc="240A0001" w:tentative="1">
@@ -16012,7 +16145,7 @@
         <w:ind w:left="5400" w:hanging="360"/>
       </w:pPr>
       <w:rPr>
-        <w:rFonts w:ascii="Symbol" w:hAnsi="Symbol" w:hint="default"/>
+        <w:rFonts w:hint="default" w:ascii="Symbol" w:hAnsi="Symbol"/>
       </w:rPr>
     </w:lvl>
     <w:lvl w:ilvl="7" w:tplc="240A0003" w:tentative="1">
@@ -16024,7 +16157,7 @@
         <w:ind w:left="6120" w:hanging="360"/>
       </w:pPr>
       <w:rPr>
-        <w:rFonts w:ascii="Courier New" w:hAnsi="Courier New" w:cs="Courier New" w:hint="default"/>
+        <w:rFonts w:hint="default" w:ascii="Courier New" w:hAnsi="Courier New" w:cs="Courier New"/>
       </w:rPr>
     </w:lvl>
     <w:lvl w:ilvl="8" w:tplc="240A0005" w:tentative="1">
@@ -16036,7 +16169,7 @@
         <w:ind w:left="6840" w:hanging="360"/>
       </w:pPr>
       <w:rPr>
-        <w:rFonts w:ascii="Wingdings" w:hAnsi="Wingdings" w:hint="default"/>
+        <w:rFonts w:hint="default" w:ascii="Wingdings" w:hAnsi="Wingdings"/>
       </w:rPr>
     </w:lvl>
   </w:abstractNum>
@@ -16056,7 +16189,7 @@
         <w:ind w:left="720" w:hanging="360"/>
       </w:pPr>
       <w:rPr>
-        <w:rFonts w:ascii="Symbol" w:hAnsi="Symbol" w:hint="default"/>
+        <w:rFonts w:hint="default" w:ascii="Symbol" w:hAnsi="Symbol"/>
         <w:sz w:val="28"/>
         <w:szCs w:val="28"/>
       </w:rPr>
@@ -16073,7 +16206,7 @@
         <w:ind w:left="1440" w:hanging="360"/>
       </w:pPr>
       <w:rPr>
-        <w:rFonts w:ascii="Symbol" w:hAnsi="Symbol" w:hint="default"/>
+        <w:rFonts w:hint="default" w:ascii="Symbol" w:hAnsi="Symbol"/>
         <w:sz w:val="20"/>
       </w:rPr>
     </w:lvl>
@@ -16089,7 +16222,7 @@
         <w:ind w:left="2160" w:hanging="360"/>
       </w:pPr>
       <w:rPr>
-        <w:rFonts w:ascii="Symbol" w:hAnsi="Symbol" w:hint="default"/>
+        <w:rFonts w:hint="default" w:ascii="Symbol" w:hAnsi="Symbol"/>
         <w:sz w:val="20"/>
       </w:rPr>
     </w:lvl>
@@ -16105,7 +16238,7 @@
         <w:ind w:left="2880" w:hanging="360"/>
       </w:pPr>
       <w:rPr>
-        <w:rFonts w:ascii="Symbol" w:hAnsi="Symbol" w:hint="default"/>
+        <w:rFonts w:hint="default" w:ascii="Symbol" w:hAnsi="Symbol"/>
         <w:sz w:val="20"/>
       </w:rPr>
     </w:lvl>
@@ -16121,7 +16254,7 @@
         <w:ind w:left="3600" w:hanging="360"/>
       </w:pPr>
       <w:rPr>
-        <w:rFonts w:ascii="Symbol" w:hAnsi="Symbol" w:hint="default"/>
+        <w:rFonts w:hint="default" w:ascii="Symbol" w:hAnsi="Symbol"/>
         <w:sz w:val="20"/>
       </w:rPr>
     </w:lvl>
@@ -16137,7 +16270,7 @@
         <w:ind w:left="4320" w:hanging="360"/>
       </w:pPr>
       <w:rPr>
-        <w:rFonts w:ascii="Symbol" w:hAnsi="Symbol" w:hint="default"/>
+        <w:rFonts w:hint="default" w:ascii="Symbol" w:hAnsi="Symbol"/>
         <w:sz w:val="20"/>
       </w:rPr>
     </w:lvl>
@@ -16153,7 +16286,7 @@
         <w:ind w:left="5040" w:hanging="360"/>
       </w:pPr>
       <w:rPr>
-        <w:rFonts w:ascii="Symbol" w:hAnsi="Symbol" w:hint="default"/>
+        <w:rFonts w:hint="default" w:ascii="Symbol" w:hAnsi="Symbol"/>
         <w:sz w:val="20"/>
       </w:rPr>
     </w:lvl>
@@ -16169,7 +16302,7 @@
         <w:ind w:left="5760" w:hanging="360"/>
       </w:pPr>
       <w:rPr>
-        <w:rFonts w:ascii="Symbol" w:hAnsi="Symbol" w:hint="default"/>
+        <w:rFonts w:hint="default" w:ascii="Symbol" w:hAnsi="Symbol"/>
         <w:sz w:val="20"/>
       </w:rPr>
     </w:lvl>
@@ -16185,7 +16318,7 @@
         <w:ind w:left="6480" w:hanging="360"/>
       </w:pPr>
       <w:rPr>
-        <w:rFonts w:ascii="Symbol" w:hAnsi="Symbol" w:hint="default"/>
+        <w:rFonts w:hint="default" w:ascii="Symbol" w:hAnsi="Symbol"/>
         <w:sz w:val="20"/>
       </w:rPr>
     </w:lvl>
@@ -16293,7 +16426,7 @@
         <w:ind w:left="1080" w:hanging="360"/>
       </w:pPr>
       <w:rPr>
-        <w:rFonts w:ascii="Symbol" w:hAnsi="Symbol" w:hint="default"/>
+        <w:rFonts w:hint="default" w:ascii="Symbol" w:hAnsi="Symbol"/>
       </w:rPr>
     </w:lvl>
     <w:lvl w:ilvl="1" w:tplc="240A0003" w:tentative="1">
@@ -16305,7 +16438,7 @@
         <w:ind w:left="1800" w:hanging="360"/>
       </w:pPr>
       <w:rPr>
-        <w:rFonts w:ascii="Courier New" w:hAnsi="Courier New" w:cs="Courier New" w:hint="default"/>
+        <w:rFonts w:hint="default" w:ascii="Courier New" w:hAnsi="Courier New" w:cs="Courier New"/>
       </w:rPr>
     </w:lvl>
     <w:lvl w:ilvl="2" w:tplc="240A0005" w:tentative="1">
@@ -16317,7 +16450,7 @@
         <w:ind w:left="2520" w:hanging="360"/>
       </w:pPr>
       <w:rPr>
-        <w:rFonts w:ascii="Wingdings" w:hAnsi="Wingdings" w:hint="default"/>
+        <w:rFonts w:hint="default" w:ascii="Wingdings" w:hAnsi="Wingdings"/>
       </w:rPr>
     </w:lvl>
     <w:lvl w:ilvl="3" w:tplc="240A0001" w:tentative="1">
@@ -16329,7 +16462,7 @@
         <w:ind w:left="3240" w:hanging="360"/>
       </w:pPr>
       <w:rPr>
-        <w:rFonts w:ascii="Symbol" w:hAnsi="Symbol" w:hint="default"/>
+        <w:rFonts w:hint="default" w:ascii="Symbol" w:hAnsi="Symbol"/>
       </w:rPr>
     </w:lvl>
     <w:lvl w:ilvl="4" w:tplc="240A0003" w:tentative="1">
@@ -16341,7 +16474,7 @@
         <w:ind w:left="3960" w:hanging="360"/>
       </w:pPr>
       <w:rPr>
-        <w:rFonts w:ascii="Courier New" w:hAnsi="Courier New" w:cs="Courier New" w:hint="default"/>
+        <w:rFonts w:hint="default" w:ascii="Courier New" w:hAnsi="Courier New" w:cs="Courier New"/>
       </w:rPr>
     </w:lvl>
     <w:lvl w:ilvl="5" w:tplc="240A0005" w:tentative="1">
@@ -16353,7 +16486,7 @@
         <w:ind w:left="4680" w:hanging="360"/>
       </w:pPr>
       <w:rPr>
-        <w:rFonts w:ascii="Wingdings" w:hAnsi="Wingdings" w:hint="default"/>
+        <w:rFonts w:hint="default" w:ascii="Wingdings" w:hAnsi="Wingdings"/>
       </w:rPr>
     </w:lvl>
     <w:lvl w:ilvl="6" w:tplc="240A0001" w:tentative="1">
@@ -16365,7 +16498,7 @@
         <w:ind w:left="5400" w:hanging="360"/>
       </w:pPr>
       <w:rPr>
-        <w:rFonts w:ascii="Symbol" w:hAnsi="Symbol" w:hint="default"/>
+        <w:rFonts w:hint="default" w:ascii="Symbol" w:hAnsi="Symbol"/>
       </w:rPr>
     </w:lvl>
     <w:lvl w:ilvl="7" w:tplc="240A0003" w:tentative="1">
@@ -16377,7 +16510,7 @@
         <w:ind w:left="6120" w:hanging="360"/>
       </w:pPr>
       <w:rPr>
-        <w:rFonts w:ascii="Courier New" w:hAnsi="Courier New" w:cs="Courier New" w:hint="default"/>
+        <w:rFonts w:hint="default" w:ascii="Courier New" w:hAnsi="Courier New" w:cs="Courier New"/>
       </w:rPr>
     </w:lvl>
     <w:lvl w:ilvl="8" w:tplc="240A0005" w:tentative="1">
@@ -16389,7 +16522,7 @@
         <w:ind w:left="6840" w:hanging="360"/>
       </w:pPr>
       <w:rPr>
-        <w:rFonts w:ascii="Wingdings" w:hAnsi="Wingdings" w:hint="default"/>
+        <w:rFonts w:hint="default" w:ascii="Wingdings" w:hAnsi="Wingdings"/>
       </w:rPr>
     </w:lvl>
   </w:abstractNum>
@@ -16409,7 +16542,7 @@
         <w:ind w:left="720" w:hanging="360"/>
       </w:pPr>
       <w:rPr>
-        <w:rFonts w:ascii="Symbol" w:hAnsi="Symbol" w:hint="default"/>
+        <w:rFonts w:hint="default" w:ascii="Symbol" w:hAnsi="Symbol"/>
         <w:sz w:val="28"/>
         <w:szCs w:val="28"/>
       </w:rPr>
@@ -16426,7 +16559,7 @@
         <w:ind w:left="1440" w:hanging="360"/>
       </w:pPr>
       <w:rPr>
-        <w:rFonts w:ascii="Symbol" w:hAnsi="Symbol" w:hint="default"/>
+        <w:rFonts w:hint="default" w:ascii="Symbol" w:hAnsi="Symbol"/>
         <w:sz w:val="20"/>
       </w:rPr>
     </w:lvl>
@@ -16442,7 +16575,7 @@
         <w:ind w:left="2160" w:hanging="360"/>
       </w:pPr>
       <w:rPr>
-        <w:rFonts w:ascii="Symbol" w:hAnsi="Symbol" w:hint="default"/>
+        <w:rFonts w:hint="default" w:ascii="Symbol" w:hAnsi="Symbol"/>
         <w:sz w:val="20"/>
       </w:rPr>
     </w:lvl>
@@ -16458,7 +16591,7 @@
         <w:ind w:left="2880" w:hanging="360"/>
       </w:pPr>
       <w:rPr>
-        <w:rFonts w:ascii="Symbol" w:hAnsi="Symbol" w:hint="default"/>
+        <w:rFonts w:hint="default" w:ascii="Symbol" w:hAnsi="Symbol"/>
         <w:sz w:val="20"/>
       </w:rPr>
     </w:lvl>
@@ -16474,7 +16607,7 @@
         <w:ind w:left="3600" w:hanging="360"/>
       </w:pPr>
       <w:rPr>
-        <w:rFonts w:ascii="Symbol" w:hAnsi="Symbol" w:hint="default"/>
+        <w:rFonts w:hint="default" w:ascii="Symbol" w:hAnsi="Symbol"/>
         <w:sz w:val="20"/>
       </w:rPr>
     </w:lvl>
@@ -16490,7 +16623,7 @@
         <w:ind w:left="4320" w:hanging="360"/>
       </w:pPr>
       <w:rPr>
-        <w:rFonts w:ascii="Symbol" w:hAnsi="Symbol" w:hint="default"/>
+        <w:rFonts w:hint="default" w:ascii="Symbol" w:hAnsi="Symbol"/>
         <w:sz w:val="20"/>
       </w:rPr>
     </w:lvl>
@@ -16506,7 +16639,7 @@
         <w:ind w:left="5040" w:hanging="360"/>
       </w:pPr>
       <w:rPr>
-        <w:rFonts w:ascii="Symbol" w:hAnsi="Symbol" w:hint="default"/>
+        <w:rFonts w:hint="default" w:ascii="Symbol" w:hAnsi="Symbol"/>
         <w:sz w:val="20"/>
       </w:rPr>
     </w:lvl>
@@ -16522,7 +16655,7 @@
         <w:ind w:left="5760" w:hanging="360"/>
       </w:pPr>
       <w:rPr>
-        <w:rFonts w:ascii="Symbol" w:hAnsi="Symbol" w:hint="default"/>
+        <w:rFonts w:hint="default" w:ascii="Symbol" w:hAnsi="Symbol"/>
         <w:sz w:val="20"/>
       </w:rPr>
     </w:lvl>
@@ -16538,7 +16671,7 @@
         <w:ind w:left="6480" w:hanging="360"/>
       </w:pPr>
       <w:rPr>
-        <w:rFonts w:ascii="Symbol" w:hAnsi="Symbol" w:hint="default"/>
+        <w:rFonts w:hint="default" w:ascii="Symbol" w:hAnsi="Symbol"/>
         <w:sz w:val="20"/>
       </w:rPr>
     </w:lvl>
@@ -16559,7 +16692,7 @@
         <w:ind w:left="720" w:hanging="360"/>
       </w:pPr>
       <w:rPr>
-        <w:rFonts w:ascii="Symbol" w:hAnsi="Symbol" w:hint="default"/>
+        <w:rFonts w:hint="default" w:ascii="Symbol" w:hAnsi="Symbol"/>
         <w:sz w:val="28"/>
         <w:szCs w:val="28"/>
       </w:rPr>
@@ -16576,7 +16709,7 @@
         <w:ind w:left="1440" w:hanging="360"/>
       </w:pPr>
       <w:rPr>
-        <w:rFonts w:ascii="Symbol" w:hAnsi="Symbol" w:hint="default"/>
+        <w:rFonts w:hint="default" w:ascii="Symbol" w:hAnsi="Symbol"/>
         <w:sz w:val="20"/>
       </w:rPr>
     </w:lvl>
@@ -16592,7 +16725,7 @@
         <w:ind w:left="2160" w:hanging="360"/>
       </w:pPr>
       <w:rPr>
-        <w:rFonts w:ascii="Symbol" w:hAnsi="Symbol" w:hint="default"/>
+        <w:rFonts w:hint="default" w:ascii="Symbol" w:hAnsi="Symbol"/>
         <w:sz w:val="20"/>
       </w:rPr>
     </w:lvl>
@@ -16608,7 +16741,7 @@
         <w:ind w:left="2880" w:hanging="360"/>
       </w:pPr>
       <w:rPr>
-        <w:rFonts w:ascii="Symbol" w:hAnsi="Symbol" w:hint="default"/>
+        <w:rFonts w:hint="default" w:ascii="Symbol" w:hAnsi="Symbol"/>
         <w:sz w:val="20"/>
       </w:rPr>
     </w:lvl>
@@ -16624,7 +16757,7 @@
         <w:ind w:left="3600" w:hanging="360"/>
       </w:pPr>
       <w:rPr>
-        <w:rFonts w:ascii="Symbol" w:hAnsi="Symbol" w:hint="default"/>
+        <w:rFonts w:hint="default" w:ascii="Symbol" w:hAnsi="Symbol"/>
         <w:sz w:val="20"/>
       </w:rPr>
     </w:lvl>
@@ -16640,7 +16773,7 @@
         <w:ind w:left="4320" w:hanging="360"/>
       </w:pPr>
       <w:rPr>
-        <w:rFonts w:ascii="Symbol" w:hAnsi="Symbol" w:hint="default"/>
+        <w:rFonts w:hint="default" w:ascii="Symbol" w:hAnsi="Symbol"/>
         <w:sz w:val="20"/>
       </w:rPr>
     </w:lvl>
@@ -16656,7 +16789,7 @@
         <w:ind w:left="5040" w:hanging="360"/>
       </w:pPr>
       <w:rPr>
-        <w:rFonts w:ascii="Symbol" w:hAnsi="Symbol" w:hint="default"/>
+        <w:rFonts w:hint="default" w:ascii="Symbol" w:hAnsi="Symbol"/>
         <w:sz w:val="20"/>
       </w:rPr>
     </w:lvl>
@@ -16672,7 +16805,7 @@
         <w:ind w:left="5760" w:hanging="360"/>
       </w:pPr>
       <w:rPr>
-        <w:rFonts w:ascii="Symbol" w:hAnsi="Symbol" w:hint="default"/>
+        <w:rFonts w:hint="default" w:ascii="Symbol" w:hAnsi="Symbol"/>
         <w:sz w:val="20"/>
       </w:rPr>
     </w:lvl>
@@ -16688,7 +16821,7 @@
         <w:ind w:left="6480" w:hanging="360"/>
       </w:pPr>
       <w:rPr>
-        <w:rFonts w:ascii="Symbol" w:hAnsi="Symbol" w:hint="default"/>
+        <w:rFonts w:hint="default" w:ascii="Symbol" w:hAnsi="Symbol"/>
         <w:sz w:val="20"/>
       </w:rPr>
     </w:lvl>
@@ -16709,7 +16842,7 @@
         <w:ind w:left="720" w:hanging="360"/>
       </w:pPr>
       <w:rPr>
-        <w:rFonts w:ascii="Symbol" w:hAnsi="Symbol" w:hint="default"/>
+        <w:rFonts w:hint="default" w:ascii="Symbol" w:hAnsi="Symbol"/>
         <w:sz w:val="28"/>
         <w:szCs w:val="28"/>
       </w:rPr>
@@ -16726,7 +16859,7 @@
         <w:ind w:left="1440" w:hanging="360"/>
       </w:pPr>
       <w:rPr>
-        <w:rFonts w:ascii="Symbol" w:hAnsi="Symbol" w:hint="default"/>
+        <w:rFonts w:hint="default" w:ascii="Symbol" w:hAnsi="Symbol"/>
         <w:sz w:val="20"/>
       </w:rPr>
     </w:lvl>
@@ -16742,7 +16875,7 @@
         <w:ind w:left="2160" w:hanging="360"/>
       </w:pPr>
       <w:rPr>
-        <w:rFonts w:ascii="Symbol" w:hAnsi="Symbol" w:hint="default"/>
+        <w:rFonts w:hint="default" w:ascii="Symbol" w:hAnsi="Symbol"/>
         <w:sz w:val="20"/>
       </w:rPr>
     </w:lvl>
@@ -16758,7 +16891,7 @@
         <w:ind w:left="2880" w:hanging="360"/>
       </w:pPr>
       <w:rPr>
-        <w:rFonts w:ascii="Symbol" w:hAnsi="Symbol" w:hint="default"/>
+        <w:rFonts w:hint="default" w:ascii="Symbol" w:hAnsi="Symbol"/>
         <w:sz w:val="20"/>
       </w:rPr>
     </w:lvl>
@@ -16774,7 +16907,7 @@
         <w:ind w:left="3600" w:hanging="360"/>
       </w:pPr>
       <w:rPr>
-        <w:rFonts w:ascii="Symbol" w:hAnsi="Symbol" w:hint="default"/>
+        <w:rFonts w:hint="default" w:ascii="Symbol" w:hAnsi="Symbol"/>
         <w:sz w:val="20"/>
       </w:rPr>
     </w:lvl>
@@ -16790,7 +16923,7 @@
         <w:ind w:left="4320" w:hanging="360"/>
       </w:pPr>
       <w:rPr>
-        <w:rFonts w:ascii="Symbol" w:hAnsi="Symbol" w:hint="default"/>
+        <w:rFonts w:hint="default" w:ascii="Symbol" w:hAnsi="Symbol"/>
         <w:sz w:val="20"/>
       </w:rPr>
     </w:lvl>
@@ -16806,7 +16939,7 @@
         <w:ind w:left="5040" w:hanging="360"/>
       </w:pPr>
       <w:rPr>
-        <w:rFonts w:ascii="Symbol" w:hAnsi="Symbol" w:hint="default"/>
+        <w:rFonts w:hint="default" w:ascii="Symbol" w:hAnsi="Symbol"/>
         <w:sz w:val="20"/>
       </w:rPr>
     </w:lvl>
@@ -16822,7 +16955,7 @@
         <w:ind w:left="5760" w:hanging="360"/>
       </w:pPr>
       <w:rPr>
-        <w:rFonts w:ascii="Symbol" w:hAnsi="Symbol" w:hint="default"/>
+        <w:rFonts w:hint="default" w:ascii="Symbol" w:hAnsi="Symbol"/>
         <w:sz w:val="20"/>
       </w:rPr>
     </w:lvl>
@@ -16838,7 +16971,7 @@
         <w:ind w:left="6480" w:hanging="360"/>
       </w:pPr>
       <w:rPr>
-        <w:rFonts w:ascii="Symbol" w:hAnsi="Symbol" w:hint="default"/>
+        <w:rFonts w:hint="default" w:ascii="Symbol" w:hAnsi="Symbol"/>
         <w:sz w:val="20"/>
       </w:rPr>
     </w:lvl>
@@ -17129,7 +17262,7 @@
         <w:ind w:left="1080" w:hanging="360"/>
       </w:pPr>
       <w:rPr>
-        <w:rFonts w:ascii="Symbol" w:hAnsi="Symbol" w:hint="default"/>
+        <w:rFonts w:hint="default" w:ascii="Symbol" w:hAnsi="Symbol"/>
       </w:rPr>
     </w:lvl>
     <w:lvl w:ilvl="1" w:tplc="240A0003" w:tentative="1">
@@ -17141,7 +17274,7 @@
         <w:ind w:left="1800" w:hanging="360"/>
       </w:pPr>
       <w:rPr>
-        <w:rFonts w:ascii="Courier New" w:hAnsi="Courier New" w:cs="Courier New" w:hint="default"/>
+        <w:rFonts w:hint="default" w:ascii="Courier New" w:hAnsi="Courier New" w:cs="Courier New"/>
       </w:rPr>
     </w:lvl>
     <w:lvl w:ilvl="2" w:tplc="240A0005" w:tentative="1">
@@ -17153,7 +17286,7 @@
         <w:ind w:left="2520" w:hanging="360"/>
       </w:pPr>
       <w:rPr>
-        <w:rFonts w:ascii="Wingdings" w:hAnsi="Wingdings" w:hint="default"/>
+        <w:rFonts w:hint="default" w:ascii="Wingdings" w:hAnsi="Wingdings"/>
       </w:rPr>
     </w:lvl>
     <w:lvl w:ilvl="3" w:tplc="240A0001" w:tentative="1">
@@ -17165,7 +17298,7 @@
         <w:ind w:left="3240" w:hanging="360"/>
       </w:pPr>
       <w:rPr>
-        <w:rFonts w:ascii="Symbol" w:hAnsi="Symbol" w:hint="default"/>
+        <w:rFonts w:hint="default" w:ascii="Symbol" w:hAnsi="Symbol"/>
       </w:rPr>
     </w:lvl>
     <w:lvl w:ilvl="4" w:tplc="240A0003" w:tentative="1">
@@ -17177,7 +17310,7 @@
         <w:ind w:left="3960" w:hanging="360"/>
       </w:pPr>
       <w:rPr>
-        <w:rFonts w:ascii="Courier New" w:hAnsi="Courier New" w:cs="Courier New" w:hint="default"/>
+        <w:rFonts w:hint="default" w:ascii="Courier New" w:hAnsi="Courier New" w:cs="Courier New"/>
       </w:rPr>
     </w:lvl>
     <w:lvl w:ilvl="5" w:tplc="240A0005" w:tentative="1">
@@ -17189,7 +17322,7 @@
         <w:ind w:left="4680" w:hanging="360"/>
       </w:pPr>
       <w:rPr>
-        <w:rFonts w:ascii="Wingdings" w:hAnsi="Wingdings" w:hint="default"/>
+        <w:rFonts w:hint="default" w:ascii="Wingdings" w:hAnsi="Wingdings"/>
       </w:rPr>
     </w:lvl>
     <w:lvl w:ilvl="6" w:tplc="240A0001" w:tentative="1">
@@ -17201,7 +17334,7 @@
         <w:ind w:left="5400" w:hanging="360"/>
       </w:pPr>
       <w:rPr>
-        <w:rFonts w:ascii="Symbol" w:hAnsi="Symbol" w:hint="default"/>
+        <w:rFonts w:hint="default" w:ascii="Symbol" w:hAnsi="Symbol"/>
       </w:rPr>
     </w:lvl>
     <w:lvl w:ilvl="7" w:tplc="240A0003" w:tentative="1">
@@ -17213,7 +17346,7 @@
         <w:ind w:left="6120" w:hanging="360"/>
       </w:pPr>
       <w:rPr>
-        <w:rFonts w:ascii="Courier New" w:hAnsi="Courier New" w:cs="Courier New" w:hint="default"/>
+        <w:rFonts w:hint="default" w:ascii="Courier New" w:hAnsi="Courier New" w:cs="Courier New"/>
       </w:rPr>
     </w:lvl>
     <w:lvl w:ilvl="8" w:tplc="240A0005" w:tentative="1">
@@ -17225,7 +17358,7 @@
         <w:ind w:left="6840" w:hanging="360"/>
       </w:pPr>
       <w:rPr>
-        <w:rFonts w:ascii="Wingdings" w:hAnsi="Wingdings" w:hint="default"/>
+        <w:rFonts w:hint="default" w:ascii="Wingdings" w:hAnsi="Wingdings"/>
       </w:rPr>
     </w:lvl>
   </w:abstractNum>
@@ -17245,7 +17378,7 @@
         <w:ind w:left="1429" w:hanging="360"/>
       </w:pPr>
       <w:rPr>
-        <w:rFonts w:ascii="Symbol" w:hAnsi="Symbol" w:hint="default"/>
+        <w:rFonts w:hint="default" w:ascii="Symbol" w:hAnsi="Symbol"/>
         <w:sz w:val="28"/>
         <w:szCs w:val="28"/>
       </w:rPr>
@@ -17262,7 +17395,7 @@
         <w:ind w:left="2149" w:hanging="360"/>
       </w:pPr>
       <w:rPr>
-        <w:rFonts w:ascii="Courier New" w:hAnsi="Courier New" w:hint="default"/>
+        <w:rFonts w:hint="default" w:ascii="Courier New" w:hAnsi="Courier New"/>
         <w:sz w:val="20"/>
       </w:rPr>
     </w:lvl>
@@ -17278,7 +17411,7 @@
         <w:ind w:left="2869" w:hanging="360"/>
       </w:pPr>
       <w:rPr>
-        <w:rFonts w:ascii="Wingdings" w:hAnsi="Wingdings" w:hint="default"/>
+        <w:rFonts w:hint="default" w:ascii="Wingdings" w:hAnsi="Wingdings"/>
         <w:sz w:val="20"/>
       </w:rPr>
     </w:lvl>
@@ -17294,7 +17427,7 @@
         <w:ind w:left="3589" w:hanging="360"/>
       </w:pPr>
       <w:rPr>
-        <w:rFonts w:ascii="Wingdings" w:hAnsi="Wingdings" w:hint="default"/>
+        <w:rFonts w:hint="default" w:ascii="Wingdings" w:hAnsi="Wingdings"/>
         <w:sz w:val="20"/>
       </w:rPr>
     </w:lvl>
@@ -17310,7 +17443,7 @@
         <w:ind w:left="4309" w:hanging="360"/>
       </w:pPr>
       <w:rPr>
-        <w:rFonts w:ascii="Wingdings" w:hAnsi="Wingdings" w:hint="default"/>
+        <w:rFonts w:hint="default" w:ascii="Wingdings" w:hAnsi="Wingdings"/>
         <w:sz w:val="20"/>
       </w:rPr>
     </w:lvl>
@@ -17326,7 +17459,7 @@
         <w:ind w:left="5029" w:hanging="360"/>
       </w:pPr>
       <w:rPr>
-        <w:rFonts w:ascii="Wingdings" w:hAnsi="Wingdings" w:hint="default"/>
+        <w:rFonts w:hint="default" w:ascii="Wingdings" w:hAnsi="Wingdings"/>
         <w:sz w:val="20"/>
       </w:rPr>
     </w:lvl>
@@ -17342,7 +17475,7 @@
         <w:ind w:left="5749" w:hanging="360"/>
       </w:pPr>
       <w:rPr>
-        <w:rFonts w:ascii="Wingdings" w:hAnsi="Wingdings" w:hint="default"/>
+        <w:rFonts w:hint="default" w:ascii="Wingdings" w:hAnsi="Wingdings"/>
         <w:sz w:val="20"/>
       </w:rPr>
     </w:lvl>
@@ -17358,7 +17491,7 @@
         <w:ind w:left="6469" w:hanging="360"/>
       </w:pPr>
       <w:rPr>
-        <w:rFonts w:ascii="Wingdings" w:hAnsi="Wingdings" w:hint="default"/>
+        <w:rFonts w:hint="default" w:ascii="Wingdings" w:hAnsi="Wingdings"/>
         <w:sz w:val="20"/>
       </w:rPr>
     </w:lvl>
@@ -17374,7 +17507,7 @@
         <w:ind w:left="7189" w:hanging="360"/>
       </w:pPr>
       <w:rPr>
-        <w:rFonts w:ascii="Wingdings" w:hAnsi="Wingdings" w:hint="default"/>
+        <w:rFonts w:hint="default" w:ascii="Wingdings" w:hAnsi="Wingdings"/>
         <w:sz w:val="20"/>
       </w:rPr>
     </w:lvl>
@@ -17392,7 +17525,7 @@
         <w:ind w:left="1429" w:hanging="360"/>
       </w:pPr>
       <w:rPr>
-        <w:rFonts w:ascii="Symbol" w:hAnsi="Symbol" w:hint="default"/>
+        <w:rFonts w:hint="default" w:ascii="Symbol" w:hAnsi="Symbol"/>
       </w:rPr>
     </w:lvl>
     <w:lvl w:ilvl="1" w:tplc="240A0003" w:tentative="1">
@@ -17404,7 +17537,7 @@
         <w:ind w:left="2149" w:hanging="360"/>
       </w:pPr>
       <w:rPr>
-        <w:rFonts w:ascii="Courier New" w:hAnsi="Courier New" w:cs="Courier New" w:hint="default"/>
+        <w:rFonts w:hint="default" w:ascii="Courier New" w:hAnsi="Courier New" w:cs="Courier New"/>
       </w:rPr>
     </w:lvl>
     <w:lvl w:ilvl="2" w:tplc="240A0005" w:tentative="1">
@@ -17416,7 +17549,7 @@
         <w:ind w:left="2869" w:hanging="360"/>
       </w:pPr>
       <w:rPr>
-        <w:rFonts w:ascii="Wingdings" w:hAnsi="Wingdings" w:hint="default"/>
+        <w:rFonts w:hint="default" w:ascii="Wingdings" w:hAnsi="Wingdings"/>
       </w:rPr>
     </w:lvl>
     <w:lvl w:ilvl="3" w:tplc="240A0001" w:tentative="1">
@@ -17428,7 +17561,7 @@
         <w:ind w:left="3589" w:hanging="360"/>
       </w:pPr>
       <w:rPr>
-        <w:rFonts w:ascii="Symbol" w:hAnsi="Symbol" w:hint="default"/>
+        <w:rFonts w:hint="default" w:ascii="Symbol" w:hAnsi="Symbol"/>
       </w:rPr>
     </w:lvl>
     <w:lvl w:ilvl="4" w:tplc="240A0003" w:tentative="1">
@@ -17440,7 +17573,7 @@
         <w:ind w:left="4309" w:hanging="360"/>
       </w:pPr>
       <w:rPr>
-        <w:rFonts w:ascii="Courier New" w:hAnsi="Courier New" w:cs="Courier New" w:hint="default"/>
+        <w:rFonts w:hint="default" w:ascii="Courier New" w:hAnsi="Courier New" w:cs="Courier New"/>
       </w:rPr>
     </w:lvl>
     <w:lvl w:ilvl="5" w:tplc="240A0005" w:tentative="1">
@@ -17452,7 +17585,7 @@
         <w:ind w:left="5029" w:hanging="360"/>
       </w:pPr>
       <w:rPr>
-        <w:rFonts w:ascii="Wingdings" w:hAnsi="Wingdings" w:hint="default"/>
+        <w:rFonts w:hint="default" w:ascii="Wingdings" w:hAnsi="Wingdings"/>
       </w:rPr>
     </w:lvl>
     <w:lvl w:ilvl="6" w:tplc="240A0001" w:tentative="1">
@@ -17464,7 +17597,7 @@
         <w:ind w:left="5749" w:hanging="360"/>
       </w:pPr>
       <w:rPr>
-        <w:rFonts w:ascii="Symbol" w:hAnsi="Symbol" w:hint="default"/>
+        <w:rFonts w:hint="default" w:ascii="Symbol" w:hAnsi="Symbol"/>
       </w:rPr>
     </w:lvl>
     <w:lvl w:ilvl="7" w:tplc="240A0003" w:tentative="1">
@@ -17476,7 +17609,7 @@
         <w:ind w:left="6469" w:hanging="360"/>
       </w:pPr>
       <w:rPr>
-        <w:rFonts w:ascii="Courier New" w:hAnsi="Courier New" w:cs="Courier New" w:hint="default"/>
+        <w:rFonts w:hint="default" w:ascii="Courier New" w:hAnsi="Courier New" w:cs="Courier New"/>
       </w:rPr>
     </w:lvl>
     <w:lvl w:ilvl="8" w:tplc="240A0005" w:tentative="1">
@@ -17488,7 +17621,7 @@
         <w:ind w:left="7189" w:hanging="360"/>
       </w:pPr>
       <w:rPr>
-        <w:rFonts w:ascii="Wingdings" w:hAnsi="Wingdings" w:hint="default"/>
+        <w:rFonts w:hint="default" w:ascii="Wingdings" w:hAnsi="Wingdings"/>
       </w:rPr>
     </w:lvl>
   </w:abstractNum>
@@ -17506,7 +17639,7 @@
         <w:ind w:left="1429" w:hanging="360"/>
       </w:pPr>
       <w:rPr>
-        <w:rFonts w:ascii="Arial" w:hAnsi="Arial" w:hint="default"/>
+        <w:rFonts w:hint="default" w:ascii="Arial" w:hAnsi="Arial"/>
         <w:b/>
         <w:i w:val="0"/>
         <w:caps w:val="0"/>
@@ -17692,7 +17825,7 @@
         <w:ind w:left="720" w:hanging="360"/>
       </w:pPr>
       <w:rPr>
-        <w:rFonts w:ascii="Symbol" w:hAnsi="Symbol" w:hint="default"/>
+        <w:rFonts w:hint="default" w:ascii="Symbol" w:hAnsi="Symbol"/>
         <w:sz w:val="28"/>
         <w:szCs w:val="28"/>
       </w:rPr>
@@ -17709,7 +17842,7 @@
         <w:ind w:left="1440" w:hanging="360"/>
       </w:pPr>
       <w:rPr>
-        <w:rFonts w:ascii="Symbol" w:hAnsi="Symbol" w:hint="default"/>
+        <w:rFonts w:hint="default" w:ascii="Symbol" w:hAnsi="Symbol"/>
         <w:sz w:val="20"/>
       </w:rPr>
     </w:lvl>
@@ -17725,7 +17858,7 @@
         <w:ind w:left="2160" w:hanging="360"/>
       </w:pPr>
       <w:rPr>
-        <w:rFonts w:ascii="Symbol" w:hAnsi="Symbol" w:hint="default"/>
+        <w:rFonts w:hint="default" w:ascii="Symbol" w:hAnsi="Symbol"/>
         <w:sz w:val="20"/>
       </w:rPr>
     </w:lvl>
@@ -17741,7 +17874,7 @@
         <w:ind w:left="2880" w:hanging="360"/>
       </w:pPr>
       <w:rPr>
-        <w:rFonts w:ascii="Symbol" w:hAnsi="Symbol" w:hint="default"/>
+        <w:rFonts w:hint="default" w:ascii="Symbol" w:hAnsi="Symbol"/>
         <w:sz w:val="20"/>
       </w:rPr>
     </w:lvl>
@@ -17757,7 +17890,7 @@
         <w:ind w:left="3600" w:hanging="360"/>
       </w:pPr>
       <w:rPr>
-        <w:rFonts w:ascii="Symbol" w:hAnsi="Symbol" w:hint="default"/>
+        <w:rFonts w:hint="default" w:ascii="Symbol" w:hAnsi="Symbol"/>
         <w:sz w:val="20"/>
       </w:rPr>
     </w:lvl>
@@ -17773,7 +17906,7 @@
         <w:ind w:left="4320" w:hanging="360"/>
       </w:pPr>
       <w:rPr>
-        <w:rFonts w:ascii="Symbol" w:hAnsi="Symbol" w:hint="default"/>
+        <w:rFonts w:hint="default" w:ascii="Symbol" w:hAnsi="Symbol"/>
         <w:sz w:val="20"/>
       </w:rPr>
     </w:lvl>
@@ -17789,7 +17922,7 @@
         <w:ind w:left="5040" w:hanging="360"/>
       </w:pPr>
       <w:rPr>
-        <w:rFonts w:ascii="Symbol" w:hAnsi="Symbol" w:hint="default"/>
+        <w:rFonts w:hint="default" w:ascii="Symbol" w:hAnsi="Symbol"/>
         <w:sz w:val="20"/>
       </w:rPr>
     </w:lvl>
@@ -17805,7 +17938,7 @@
         <w:ind w:left="5760" w:hanging="360"/>
       </w:pPr>
       <w:rPr>
-        <w:rFonts w:ascii="Symbol" w:hAnsi="Symbol" w:hint="default"/>
+        <w:rFonts w:hint="default" w:ascii="Symbol" w:hAnsi="Symbol"/>
         <w:sz w:val="20"/>
       </w:rPr>
     </w:lvl>
@@ -17821,7 +17954,7 @@
         <w:ind w:left="6480" w:hanging="360"/>
       </w:pPr>
       <w:rPr>
-        <w:rFonts w:ascii="Symbol" w:hAnsi="Symbol" w:hint="default"/>
+        <w:rFonts w:hint="default" w:ascii="Symbol" w:hAnsi="Symbol"/>
         <w:sz w:val="20"/>
       </w:rPr>
     </w:lvl>
@@ -17839,7 +17972,7 @@
         <w:ind w:left="1080" w:hanging="360"/>
       </w:pPr>
       <w:rPr>
-        <w:rFonts w:ascii="Symbol" w:hAnsi="Symbol" w:hint="default"/>
+        <w:rFonts w:hint="default" w:ascii="Symbol" w:hAnsi="Symbol"/>
       </w:rPr>
     </w:lvl>
     <w:lvl w:ilvl="1" w:tplc="240A0003" w:tentative="1">
@@ -17851,7 +17984,7 @@
         <w:ind w:left="1800" w:hanging="360"/>
       </w:pPr>
       <w:rPr>
-        <w:rFonts w:ascii="Courier New" w:hAnsi="Courier New" w:cs="Courier New" w:hint="default"/>
+        <w:rFonts w:hint="default" w:ascii="Courier New" w:hAnsi="Courier New" w:cs="Courier New"/>
       </w:rPr>
     </w:lvl>
     <w:lvl w:ilvl="2" w:tplc="240A0005" w:tentative="1">
@@ -17863,7 +17996,7 @@
         <w:ind w:left="2520" w:hanging="360"/>
       </w:pPr>
       <w:rPr>
-        <w:rFonts w:ascii="Wingdings" w:hAnsi="Wingdings" w:hint="default"/>
+        <w:rFonts w:hint="default" w:ascii="Wingdings" w:hAnsi="Wingdings"/>
       </w:rPr>
     </w:lvl>
     <w:lvl w:ilvl="3" w:tplc="240A0001" w:tentative="1">
@@ -17875,7 +18008,7 @@
         <w:ind w:left="3240" w:hanging="360"/>
       </w:pPr>
       <w:rPr>
-        <w:rFonts w:ascii="Symbol" w:hAnsi="Symbol" w:hint="default"/>
+        <w:rFonts w:hint="default" w:ascii="Symbol" w:hAnsi="Symbol"/>
       </w:rPr>
     </w:lvl>
     <w:lvl w:ilvl="4" w:tplc="240A0003" w:tentative="1">
@@ -17887,7 +18020,7 @@
         <w:ind w:left="3960" w:hanging="360"/>
       </w:pPr>
       <w:rPr>
-        <w:rFonts w:ascii="Courier New" w:hAnsi="Courier New" w:cs="Courier New" w:hint="default"/>
+        <w:rFonts w:hint="default" w:ascii="Courier New" w:hAnsi="Courier New" w:cs="Courier New"/>
       </w:rPr>
     </w:lvl>
     <w:lvl w:ilvl="5" w:tplc="240A0005" w:tentative="1">
@@ -17899,7 +18032,7 @@
         <w:ind w:left="4680" w:hanging="360"/>
       </w:pPr>
       <w:rPr>
-        <w:rFonts w:ascii="Wingdings" w:hAnsi="Wingdings" w:hint="default"/>
+        <w:rFonts w:hint="default" w:ascii="Wingdings" w:hAnsi="Wingdings"/>
       </w:rPr>
     </w:lvl>
     <w:lvl w:ilvl="6" w:tplc="240A0001" w:tentative="1">
@@ -17911,7 +18044,7 @@
         <w:ind w:left="5400" w:hanging="360"/>
       </w:pPr>
       <w:rPr>
-        <w:rFonts w:ascii="Symbol" w:hAnsi="Symbol" w:hint="default"/>
+        <w:rFonts w:hint="default" w:ascii="Symbol" w:hAnsi="Symbol"/>
       </w:rPr>
     </w:lvl>
     <w:lvl w:ilvl="7" w:tplc="240A0003" w:tentative="1">
@@ -17923,7 +18056,7 @@
         <w:ind w:left="6120" w:hanging="360"/>
       </w:pPr>
       <w:rPr>
-        <w:rFonts w:ascii="Courier New" w:hAnsi="Courier New" w:cs="Courier New" w:hint="default"/>
+        <w:rFonts w:hint="default" w:ascii="Courier New" w:hAnsi="Courier New" w:cs="Courier New"/>
       </w:rPr>
     </w:lvl>
     <w:lvl w:ilvl="8" w:tplc="240A0005" w:tentative="1">
@@ -17935,7 +18068,7 @@
         <w:ind w:left="6840" w:hanging="360"/>
       </w:pPr>
       <w:rPr>
-        <w:rFonts w:ascii="Wingdings" w:hAnsi="Wingdings" w:hint="default"/>
+        <w:rFonts w:hint="default" w:ascii="Wingdings" w:hAnsi="Wingdings"/>
       </w:rPr>
     </w:lvl>
   </w:abstractNum>
@@ -17955,7 +18088,7 @@
         <w:ind w:left="720" w:hanging="360"/>
       </w:pPr>
       <w:rPr>
-        <w:rFonts w:ascii="Symbol" w:hAnsi="Symbol" w:hint="default"/>
+        <w:rFonts w:hint="default" w:ascii="Symbol" w:hAnsi="Symbol"/>
         <w:sz w:val="28"/>
         <w:szCs w:val="28"/>
       </w:rPr>
@@ -17972,7 +18105,7 @@
         <w:ind w:left="1440" w:hanging="360"/>
       </w:pPr>
       <w:rPr>
-        <w:rFonts w:ascii="Symbol" w:hAnsi="Symbol" w:hint="default"/>
+        <w:rFonts w:hint="default" w:ascii="Symbol" w:hAnsi="Symbol"/>
         <w:sz w:val="20"/>
       </w:rPr>
     </w:lvl>
@@ -17988,7 +18121,7 @@
         <w:ind w:left="2160" w:hanging="360"/>
       </w:pPr>
       <w:rPr>
-        <w:rFonts w:ascii="Symbol" w:hAnsi="Symbol" w:hint="default"/>
+        <w:rFonts w:hint="default" w:ascii="Symbol" w:hAnsi="Symbol"/>
         <w:sz w:val="20"/>
       </w:rPr>
     </w:lvl>
@@ -18004,7 +18137,7 @@
         <w:ind w:left="2880" w:hanging="360"/>
       </w:pPr>
       <w:rPr>
-        <w:rFonts w:ascii="Symbol" w:hAnsi="Symbol" w:hint="default"/>
+        <w:rFonts w:hint="default" w:ascii="Symbol" w:hAnsi="Symbol"/>
         <w:sz w:val="20"/>
       </w:rPr>
     </w:lvl>
@@ -18020,7 +18153,7 @@
         <w:ind w:left="3600" w:hanging="360"/>
       </w:pPr>
       <w:rPr>
-        <w:rFonts w:ascii="Symbol" w:hAnsi="Symbol" w:hint="default"/>
+        <w:rFonts w:hint="default" w:ascii="Symbol" w:hAnsi="Symbol"/>
         <w:sz w:val="20"/>
       </w:rPr>
     </w:lvl>
@@ -18036,7 +18169,7 @@
         <w:ind w:left="4320" w:hanging="360"/>
       </w:pPr>
       <w:rPr>
-        <w:rFonts w:ascii="Symbol" w:hAnsi="Symbol" w:hint="default"/>
+        <w:rFonts w:hint="default" w:ascii="Symbol" w:hAnsi="Symbol"/>
         <w:sz w:val="20"/>
       </w:rPr>
     </w:lvl>
@@ -18052,7 +18185,7 @@
         <w:ind w:left="5040" w:hanging="360"/>
       </w:pPr>
       <w:rPr>
-        <w:rFonts w:ascii="Symbol" w:hAnsi="Symbol" w:hint="default"/>
+        <w:rFonts w:hint="default" w:ascii="Symbol" w:hAnsi="Symbol"/>
         <w:sz w:val="20"/>
       </w:rPr>
     </w:lvl>
@@ -18068,7 +18201,7 @@
         <w:ind w:left="5760" w:hanging="360"/>
       </w:pPr>
       <w:rPr>
-        <w:rFonts w:ascii="Symbol" w:hAnsi="Symbol" w:hint="default"/>
+        <w:rFonts w:hint="default" w:ascii="Symbol" w:hAnsi="Symbol"/>
         <w:sz w:val="20"/>
       </w:rPr>
     </w:lvl>
@@ -18084,7 +18217,7 @@
         <w:ind w:left="6480" w:hanging="360"/>
       </w:pPr>
       <w:rPr>
-        <w:rFonts w:ascii="Symbol" w:hAnsi="Symbol" w:hint="default"/>
+        <w:rFonts w:hint="default" w:ascii="Symbol" w:hAnsi="Symbol"/>
         <w:sz w:val="20"/>
       </w:rPr>
     </w:lvl>
@@ -18102,7 +18235,7 @@
         <w:ind w:left="1428" w:hanging="360"/>
       </w:pPr>
       <w:rPr>
-        <w:rFonts w:ascii="Symbol" w:hAnsi="Symbol" w:hint="default"/>
+        <w:rFonts w:hint="default" w:ascii="Symbol" w:hAnsi="Symbol"/>
       </w:rPr>
     </w:lvl>
     <w:lvl w:ilvl="1" w:tplc="240A0003" w:tentative="1">
@@ -18114,7 +18247,7 @@
         <w:ind w:left="2148" w:hanging="360"/>
       </w:pPr>
       <w:rPr>
-        <w:rFonts w:ascii="Courier New" w:hAnsi="Courier New" w:cs="Courier New" w:hint="default"/>
+        <w:rFonts w:hint="default" w:ascii="Courier New" w:hAnsi="Courier New" w:cs="Courier New"/>
       </w:rPr>
     </w:lvl>
     <w:lvl w:ilvl="2" w:tplc="240A0005" w:tentative="1">
@@ -18126,7 +18259,7 @@
         <w:ind w:left="2868" w:hanging="360"/>
       </w:pPr>
       <w:rPr>
-        <w:rFonts w:ascii="Wingdings" w:hAnsi="Wingdings" w:hint="default"/>
+        <w:rFonts w:hint="default" w:ascii="Wingdings" w:hAnsi="Wingdings"/>
       </w:rPr>
     </w:lvl>
     <w:lvl w:ilvl="3" w:tplc="240A0001" w:tentative="1">
@@ -18138,7 +18271,7 @@
         <w:ind w:left="3588" w:hanging="360"/>
       </w:pPr>
       <w:rPr>
-        <w:rFonts w:ascii="Symbol" w:hAnsi="Symbol" w:hint="default"/>
+        <w:rFonts w:hint="default" w:ascii="Symbol" w:hAnsi="Symbol"/>
       </w:rPr>
     </w:lvl>
     <w:lvl w:ilvl="4" w:tplc="240A0003" w:tentative="1">
@@ -18150,7 +18283,7 @@
         <w:ind w:left="4308" w:hanging="360"/>
       </w:pPr>
       <w:rPr>
-        <w:rFonts w:ascii="Courier New" w:hAnsi="Courier New" w:cs="Courier New" w:hint="default"/>
+        <w:rFonts w:hint="default" w:ascii="Courier New" w:hAnsi="Courier New" w:cs="Courier New"/>
       </w:rPr>
     </w:lvl>
     <w:lvl w:ilvl="5" w:tplc="240A0005" w:tentative="1">
@@ -18162,7 +18295,7 @@
         <w:ind w:left="5028" w:hanging="360"/>
       </w:pPr>
       <w:rPr>
-        <w:rFonts w:ascii="Wingdings" w:hAnsi="Wingdings" w:hint="default"/>
+        <w:rFonts w:hint="default" w:ascii="Wingdings" w:hAnsi="Wingdings"/>
       </w:rPr>
     </w:lvl>
     <w:lvl w:ilvl="6" w:tplc="240A0001" w:tentative="1">
@@ -18174,7 +18307,7 @@
         <w:ind w:left="5748" w:hanging="360"/>
       </w:pPr>
       <w:rPr>
-        <w:rFonts w:ascii="Symbol" w:hAnsi="Symbol" w:hint="default"/>
+        <w:rFonts w:hint="default" w:ascii="Symbol" w:hAnsi="Symbol"/>
       </w:rPr>
     </w:lvl>
     <w:lvl w:ilvl="7" w:tplc="240A0003" w:tentative="1">
@@ -18186,7 +18319,7 @@
         <w:ind w:left="6468" w:hanging="360"/>
       </w:pPr>
       <w:rPr>
-        <w:rFonts w:ascii="Courier New" w:hAnsi="Courier New" w:cs="Courier New" w:hint="default"/>
+        <w:rFonts w:hint="default" w:ascii="Courier New" w:hAnsi="Courier New" w:cs="Courier New"/>
       </w:rPr>
     </w:lvl>
     <w:lvl w:ilvl="8" w:tplc="240A0005" w:tentative="1">
@@ -18198,7 +18331,7 @@
         <w:ind w:left="7188" w:hanging="360"/>
       </w:pPr>
       <w:rPr>
-        <w:rFonts w:ascii="Wingdings" w:hAnsi="Wingdings" w:hint="default"/>
+        <w:rFonts w:hint="default" w:ascii="Wingdings" w:hAnsi="Wingdings"/>
       </w:rPr>
     </w:lvl>
   </w:abstractNum>
@@ -18215,7 +18348,7 @@
         <w:ind w:left="1080" w:hanging="360"/>
       </w:pPr>
       <w:rPr>
-        <w:rFonts w:ascii="Symbol" w:hAnsi="Symbol" w:hint="default"/>
+        <w:rFonts w:hint="default" w:ascii="Symbol" w:hAnsi="Symbol"/>
       </w:rPr>
     </w:lvl>
     <w:lvl w:ilvl="1" w:tplc="240A0003" w:tentative="1">
@@ -18227,7 +18360,7 @@
         <w:ind w:left="1800" w:hanging="360"/>
       </w:pPr>
       <w:rPr>
-        <w:rFonts w:ascii="Courier New" w:hAnsi="Courier New" w:cs="Courier New" w:hint="default"/>
+        <w:rFonts w:hint="default" w:ascii="Courier New" w:hAnsi="Courier New" w:cs="Courier New"/>
       </w:rPr>
     </w:lvl>
     <w:lvl w:ilvl="2" w:tplc="240A0005" w:tentative="1">
@@ -18239,7 +18372,7 @@
         <w:ind w:left="2520" w:hanging="360"/>
       </w:pPr>
       <w:rPr>
-        <w:rFonts w:ascii="Wingdings" w:hAnsi="Wingdings" w:hint="default"/>
+        <w:rFonts w:hint="default" w:ascii="Wingdings" w:hAnsi="Wingdings"/>
       </w:rPr>
     </w:lvl>
     <w:lvl w:ilvl="3" w:tplc="240A0001" w:tentative="1">
@@ -18251,7 +18384,7 @@
         <w:ind w:left="3240" w:hanging="360"/>
       </w:pPr>
       <w:rPr>
-        <w:rFonts w:ascii="Symbol" w:hAnsi="Symbol" w:hint="default"/>
+        <w:rFonts w:hint="default" w:ascii="Symbol" w:hAnsi="Symbol"/>
       </w:rPr>
     </w:lvl>
     <w:lvl w:ilvl="4" w:tplc="240A0003" w:tentative="1">
@@ -18263,7 +18396,7 @@
         <w:ind w:left="3960" w:hanging="360"/>
       </w:pPr>
       <w:rPr>
-        <w:rFonts w:ascii="Courier New" w:hAnsi="Courier New" w:cs="Courier New" w:hint="default"/>
+        <w:rFonts w:hint="default" w:ascii="Courier New" w:hAnsi="Courier New" w:cs="Courier New"/>
       </w:rPr>
     </w:lvl>
     <w:lvl w:ilvl="5" w:tplc="240A0005" w:tentative="1">
@@ -18275,7 +18408,7 @@
         <w:ind w:left="4680" w:hanging="360"/>
       </w:pPr>
       <w:rPr>
-        <w:rFonts w:ascii="Wingdings" w:hAnsi="Wingdings" w:hint="default"/>
+        <w:rFonts w:hint="default" w:ascii="Wingdings" w:hAnsi="Wingdings"/>
       </w:rPr>
     </w:lvl>
     <w:lvl w:ilvl="6" w:tplc="240A0001" w:tentative="1">
@@ -18287,7 +18420,7 @@
         <w:ind w:left="5400" w:hanging="360"/>
       </w:pPr>
       <w:rPr>
-        <w:rFonts w:ascii="Symbol" w:hAnsi="Symbol" w:hint="default"/>
+        <w:rFonts w:hint="default" w:ascii="Symbol" w:hAnsi="Symbol"/>
       </w:rPr>
     </w:lvl>
     <w:lvl w:ilvl="7" w:tplc="240A0003" w:tentative="1">
@@ -18299,7 +18432,7 @@
         <w:ind w:left="6120" w:hanging="360"/>
       </w:pPr>
       <w:rPr>
-        <w:rFonts w:ascii="Courier New" w:hAnsi="Courier New" w:cs="Courier New" w:hint="default"/>
+        <w:rFonts w:hint="default" w:ascii="Courier New" w:hAnsi="Courier New" w:cs="Courier New"/>
       </w:rPr>
     </w:lvl>
     <w:lvl w:ilvl="8" w:tplc="240A0005" w:tentative="1">
@@ -18311,7 +18444,7 @@
         <w:ind w:left="6840" w:hanging="360"/>
       </w:pPr>
       <w:rPr>
-        <w:rFonts w:ascii="Wingdings" w:hAnsi="Wingdings" w:hint="default"/>
+        <w:rFonts w:hint="default" w:ascii="Wingdings" w:hAnsi="Wingdings"/>
       </w:rPr>
     </w:lvl>
   </w:abstractNum>
@@ -18329,7 +18462,7 @@
         <w:ind w:left="360" w:hanging="360"/>
       </w:pPr>
       <w:rPr>
-        <w:rFonts w:ascii="Arial" w:hAnsi="Arial" w:hint="default"/>
+        <w:rFonts w:hint="default" w:ascii="Arial" w:hAnsi="Arial"/>
         <w:b/>
         <w:i w:val="0"/>
         <w:sz w:val="24"/>
@@ -18424,7 +18557,7 @@
         <w:ind w:left="720" w:hanging="360"/>
       </w:pPr>
       <w:rPr>
-        <w:rFonts w:ascii="Symbol" w:hAnsi="Symbol" w:hint="default"/>
+        <w:rFonts w:hint="default" w:ascii="Symbol" w:hAnsi="Symbol"/>
         <w:sz w:val="28"/>
         <w:szCs w:val="28"/>
       </w:rPr>
@@ -18441,7 +18574,7 @@
         <w:ind w:left="1440" w:hanging="360"/>
       </w:pPr>
       <w:rPr>
-        <w:rFonts w:ascii="Symbol" w:hAnsi="Symbol" w:hint="default"/>
+        <w:rFonts w:hint="default" w:ascii="Symbol" w:hAnsi="Symbol"/>
         <w:sz w:val="20"/>
       </w:rPr>
     </w:lvl>
@@ -18457,7 +18590,7 @@
         <w:ind w:left="2160" w:hanging="360"/>
       </w:pPr>
       <w:rPr>
-        <w:rFonts w:ascii="Symbol" w:hAnsi="Symbol" w:hint="default"/>
+        <w:rFonts w:hint="default" w:ascii="Symbol" w:hAnsi="Symbol"/>
         <w:sz w:val="20"/>
       </w:rPr>
     </w:lvl>
@@ -18473,7 +18606,7 @@
         <w:ind w:left="2880" w:hanging="360"/>
       </w:pPr>
       <w:rPr>
-        <w:rFonts w:ascii="Symbol" w:hAnsi="Symbol" w:hint="default"/>
+        <w:rFonts w:hint="default" w:ascii="Symbol" w:hAnsi="Symbol"/>
         <w:sz w:val="20"/>
       </w:rPr>
     </w:lvl>
@@ -18489,7 +18622,7 @@
         <w:ind w:left="3600" w:hanging="360"/>
       </w:pPr>
       <w:rPr>
-        <w:rFonts w:ascii="Symbol" w:hAnsi="Symbol" w:hint="default"/>
+        <w:rFonts w:hint="default" w:ascii="Symbol" w:hAnsi="Symbol"/>
         <w:sz w:val="20"/>
       </w:rPr>
     </w:lvl>
@@ -18505,7 +18638,7 @@
         <w:ind w:left="4320" w:hanging="360"/>
       </w:pPr>
       <w:rPr>
-        <w:rFonts w:ascii="Symbol" w:hAnsi="Symbol" w:hint="default"/>
+        <w:rFonts w:hint="default" w:ascii="Symbol" w:hAnsi="Symbol"/>
         <w:sz w:val="20"/>
       </w:rPr>
     </w:lvl>
@@ -18521,7 +18654,7 @@
         <w:ind w:left="5040" w:hanging="360"/>
       </w:pPr>
       <w:rPr>
-        <w:rFonts w:ascii="Symbol" w:hAnsi="Symbol" w:hint="default"/>
+        <w:rFonts w:hint="default" w:ascii="Symbol" w:hAnsi="Symbol"/>
         <w:sz w:val="20"/>
       </w:rPr>
     </w:lvl>
@@ -18537,7 +18670,7 @@
         <w:ind w:left="5760" w:hanging="360"/>
       </w:pPr>
       <w:rPr>
-        <w:rFonts w:ascii="Symbol" w:hAnsi="Symbol" w:hint="default"/>
+        <w:rFonts w:hint="default" w:ascii="Symbol" w:hAnsi="Symbol"/>
         <w:sz w:val="20"/>
       </w:rPr>
     </w:lvl>
@@ -18553,7 +18686,7 @@
         <w:ind w:left="6480" w:hanging="360"/>
       </w:pPr>
       <w:rPr>
-        <w:rFonts w:ascii="Symbol" w:hAnsi="Symbol" w:hint="default"/>
+        <w:rFonts w:hint="default" w:ascii="Symbol" w:hAnsi="Symbol"/>
         <w:sz w:val="20"/>
       </w:rPr>
     </w:lvl>
@@ -18747,7 +18880,7 @@
         <w:ind w:left="1080" w:hanging="360"/>
       </w:pPr>
       <w:rPr>
-        <w:rFonts w:ascii="Symbol" w:hAnsi="Symbol" w:hint="default"/>
+        <w:rFonts w:hint="default" w:ascii="Symbol" w:hAnsi="Symbol"/>
       </w:rPr>
     </w:lvl>
     <w:lvl w:ilvl="1" w:tplc="240A0003" w:tentative="1">
@@ -18759,7 +18892,7 @@
         <w:ind w:left="1800" w:hanging="360"/>
       </w:pPr>
       <w:rPr>
-        <w:rFonts w:ascii="Courier New" w:hAnsi="Courier New" w:cs="Courier New" w:hint="default"/>
+        <w:rFonts w:hint="default" w:ascii="Courier New" w:hAnsi="Courier New" w:cs="Courier New"/>
       </w:rPr>
     </w:lvl>
     <w:lvl w:ilvl="2" w:tplc="240A0005" w:tentative="1">
@@ -18771,7 +18904,7 @@
         <w:ind w:left="2520" w:hanging="360"/>
       </w:pPr>
       <w:rPr>
-        <w:rFonts w:ascii="Wingdings" w:hAnsi="Wingdings" w:hint="default"/>
+        <w:rFonts w:hint="default" w:ascii="Wingdings" w:hAnsi="Wingdings"/>
       </w:rPr>
     </w:lvl>
     <w:lvl w:ilvl="3" w:tplc="240A0001" w:tentative="1">
@@ -18783,7 +18916,7 @@
         <w:ind w:left="3240" w:hanging="360"/>
       </w:pPr>
       <w:rPr>
-        <w:rFonts w:ascii="Symbol" w:hAnsi="Symbol" w:hint="default"/>
+        <w:rFonts w:hint="default" w:ascii="Symbol" w:hAnsi="Symbol"/>
       </w:rPr>
     </w:lvl>
     <w:lvl w:ilvl="4" w:tplc="240A0003" w:tentative="1">
@@ -18795,7 +18928,7 @@
         <w:ind w:left="3960" w:hanging="360"/>
       </w:pPr>
       <w:rPr>
-        <w:rFonts w:ascii="Courier New" w:hAnsi="Courier New" w:cs="Courier New" w:hint="default"/>
+        <w:rFonts w:hint="default" w:ascii="Courier New" w:hAnsi="Courier New" w:cs="Courier New"/>
       </w:rPr>
     </w:lvl>
     <w:lvl w:ilvl="5" w:tplc="240A0005" w:tentative="1">
@@ -18807,7 +18940,7 @@
         <w:ind w:left="4680" w:hanging="360"/>
       </w:pPr>
       <w:rPr>
-        <w:rFonts w:ascii="Wingdings" w:hAnsi="Wingdings" w:hint="default"/>
+        <w:rFonts w:hint="default" w:ascii="Wingdings" w:hAnsi="Wingdings"/>
       </w:rPr>
     </w:lvl>
     <w:lvl w:ilvl="6" w:tplc="240A0001" w:tentative="1">
@@ -18819,7 +18952,7 @@
         <w:ind w:left="5400" w:hanging="360"/>
       </w:pPr>
       <w:rPr>
-        <w:rFonts w:ascii="Symbol" w:hAnsi="Symbol" w:hint="default"/>
+        <w:rFonts w:hint="default" w:ascii="Symbol" w:hAnsi="Symbol"/>
       </w:rPr>
     </w:lvl>
     <w:lvl w:ilvl="7" w:tplc="240A0003" w:tentative="1">
@@ -18831,7 +18964,7 @@
         <w:ind w:left="6120" w:hanging="360"/>
       </w:pPr>
       <w:rPr>
-        <w:rFonts w:ascii="Courier New" w:hAnsi="Courier New" w:cs="Courier New" w:hint="default"/>
+        <w:rFonts w:hint="default" w:ascii="Courier New" w:hAnsi="Courier New" w:cs="Courier New"/>
       </w:rPr>
     </w:lvl>
     <w:lvl w:ilvl="8" w:tplc="240A0005" w:tentative="1">
@@ -18843,7 +18976,7 @@
         <w:ind w:left="6840" w:hanging="360"/>
       </w:pPr>
       <w:rPr>
-        <w:rFonts w:ascii="Wingdings" w:hAnsi="Wingdings" w:hint="default"/>
+        <w:rFonts w:hint="default" w:ascii="Wingdings" w:hAnsi="Wingdings"/>
       </w:rPr>
     </w:lvl>
   </w:abstractNum>
@@ -18860,7 +18993,7 @@
         <w:ind w:left="1080" w:hanging="360"/>
       </w:pPr>
       <w:rPr>
-        <w:rFonts w:ascii="Symbol" w:hAnsi="Symbol" w:hint="default"/>
+        <w:rFonts w:hint="default" w:ascii="Symbol" w:hAnsi="Symbol"/>
       </w:rPr>
     </w:lvl>
     <w:lvl w:ilvl="1" w:tplc="240A0003" w:tentative="1">
@@ -18872,7 +19005,7 @@
         <w:ind w:left="1800" w:hanging="360"/>
       </w:pPr>
       <w:rPr>
-        <w:rFonts w:ascii="Courier New" w:hAnsi="Courier New" w:cs="Courier New" w:hint="default"/>
+        <w:rFonts w:hint="default" w:ascii="Courier New" w:hAnsi="Courier New" w:cs="Courier New"/>
       </w:rPr>
     </w:lvl>
     <w:lvl w:ilvl="2" w:tplc="240A0005" w:tentative="1">
@@ -18884,7 +19017,7 @@
         <w:ind w:left="2520" w:hanging="360"/>
       </w:pPr>
       <w:rPr>
-        <w:rFonts w:ascii="Wingdings" w:hAnsi="Wingdings" w:hint="default"/>
+        <w:rFonts w:hint="default" w:ascii="Wingdings" w:hAnsi="Wingdings"/>
       </w:rPr>
     </w:lvl>
     <w:lvl w:ilvl="3" w:tplc="240A0001" w:tentative="1">
@@ -18896,7 +19029,7 @@
         <w:ind w:left="3240" w:hanging="360"/>
       </w:pPr>
       <w:rPr>
-        <w:rFonts w:ascii="Symbol" w:hAnsi="Symbol" w:hint="default"/>
+        <w:rFonts w:hint="default" w:ascii="Symbol" w:hAnsi="Symbol"/>
       </w:rPr>
     </w:lvl>
     <w:lvl w:ilvl="4" w:tplc="240A0003" w:tentative="1">
@@ -18908,7 +19041,7 @@
         <w:ind w:left="3960" w:hanging="360"/>
       </w:pPr>
       <w:rPr>
-        <w:rFonts w:ascii="Courier New" w:hAnsi="Courier New" w:cs="Courier New" w:hint="default"/>
+        <w:rFonts w:hint="default" w:ascii="Courier New" w:hAnsi="Courier New" w:cs="Courier New"/>
       </w:rPr>
     </w:lvl>
     <w:lvl w:ilvl="5" w:tplc="240A0005" w:tentative="1">
@@ -18920,7 +19053,7 @@
         <w:ind w:left="4680" w:hanging="360"/>
       </w:pPr>
       <w:rPr>
-        <w:rFonts w:ascii="Wingdings" w:hAnsi="Wingdings" w:hint="default"/>
+        <w:rFonts w:hint="default" w:ascii="Wingdings" w:hAnsi="Wingdings"/>
       </w:rPr>
     </w:lvl>
     <w:lvl w:ilvl="6" w:tplc="240A0001" w:tentative="1">
@@ -18932,7 +19065,7 @@
         <w:ind w:left="5400" w:hanging="360"/>
       </w:pPr>
       <w:rPr>
-        <w:rFonts w:ascii="Symbol" w:hAnsi="Symbol" w:hint="default"/>
+        <w:rFonts w:hint="default" w:ascii="Symbol" w:hAnsi="Symbol"/>
       </w:rPr>
     </w:lvl>
     <w:lvl w:ilvl="7" w:tplc="240A0003" w:tentative="1">
@@ -18944,7 +19077,7 @@
         <w:ind w:left="6120" w:hanging="360"/>
       </w:pPr>
       <w:rPr>
-        <w:rFonts w:ascii="Courier New" w:hAnsi="Courier New" w:cs="Courier New" w:hint="default"/>
+        <w:rFonts w:hint="default" w:ascii="Courier New" w:hAnsi="Courier New" w:cs="Courier New"/>
       </w:rPr>
     </w:lvl>
     <w:lvl w:ilvl="8" w:tplc="240A0005" w:tentative="1">
@@ -18956,7 +19089,7 @@
         <w:ind w:left="6840" w:hanging="360"/>
       </w:pPr>
       <w:rPr>
-        <w:rFonts w:ascii="Wingdings" w:hAnsi="Wingdings" w:hint="default"/>
+        <w:rFonts w:hint="default" w:ascii="Wingdings" w:hAnsi="Wingdings"/>
       </w:rPr>
     </w:lvl>
   </w:abstractNum>
@@ -18973,7 +19106,7 @@
         <w:ind w:left="1428" w:hanging="360"/>
       </w:pPr>
       <w:rPr>
-        <w:rFonts w:ascii="Symbol" w:hAnsi="Symbol" w:hint="default"/>
+        <w:rFonts w:hint="default" w:ascii="Symbol" w:hAnsi="Symbol"/>
       </w:rPr>
     </w:lvl>
     <w:lvl w:ilvl="1" w:tplc="240A0003" w:tentative="1">
@@ -18985,7 +19118,7 @@
         <w:ind w:left="2148" w:hanging="360"/>
       </w:pPr>
       <w:rPr>
-        <w:rFonts w:ascii="Courier New" w:hAnsi="Courier New" w:cs="Courier New" w:hint="default"/>
+        <w:rFonts w:hint="default" w:ascii="Courier New" w:hAnsi="Courier New" w:cs="Courier New"/>
       </w:rPr>
     </w:lvl>
     <w:lvl w:ilvl="2" w:tplc="240A0005" w:tentative="1">
@@ -18997,7 +19130,7 @@
         <w:ind w:left="2868" w:hanging="360"/>
       </w:pPr>
       <w:rPr>
-        <w:rFonts w:ascii="Wingdings" w:hAnsi="Wingdings" w:hint="default"/>
+        <w:rFonts w:hint="default" w:ascii="Wingdings" w:hAnsi="Wingdings"/>
       </w:rPr>
     </w:lvl>
     <w:lvl w:ilvl="3" w:tplc="240A0001" w:tentative="1">
@@ -19009,7 +19142,7 @@
         <w:ind w:left="3588" w:hanging="360"/>
       </w:pPr>
       <w:rPr>
-        <w:rFonts w:ascii="Symbol" w:hAnsi="Symbol" w:hint="default"/>
+        <w:rFonts w:hint="default" w:ascii="Symbol" w:hAnsi="Symbol"/>
       </w:rPr>
     </w:lvl>
     <w:lvl w:ilvl="4" w:tplc="240A0003" w:tentative="1">
@@ -19021,7 +19154,7 @@
         <w:ind w:left="4308" w:hanging="360"/>
       </w:pPr>
       <w:rPr>
-        <w:rFonts w:ascii="Courier New" w:hAnsi="Courier New" w:cs="Courier New" w:hint="default"/>
+        <w:rFonts w:hint="default" w:ascii="Courier New" w:hAnsi="Courier New" w:cs="Courier New"/>
       </w:rPr>
     </w:lvl>
     <w:lvl w:ilvl="5" w:tplc="240A0005" w:tentative="1">
@@ -19033,7 +19166,7 @@
         <w:ind w:left="5028" w:hanging="360"/>
       </w:pPr>
       <w:rPr>
-        <w:rFonts w:ascii="Wingdings" w:hAnsi="Wingdings" w:hint="default"/>
+        <w:rFonts w:hint="default" w:ascii="Wingdings" w:hAnsi="Wingdings"/>
       </w:rPr>
     </w:lvl>
     <w:lvl w:ilvl="6" w:tplc="240A0001" w:tentative="1">
@@ -19045,7 +19178,7 @@
         <w:ind w:left="5748" w:hanging="360"/>
       </w:pPr>
       <w:rPr>
-        <w:rFonts w:ascii="Symbol" w:hAnsi="Symbol" w:hint="default"/>
+        <w:rFonts w:hint="default" w:ascii="Symbol" w:hAnsi="Symbol"/>
       </w:rPr>
     </w:lvl>
     <w:lvl w:ilvl="7" w:tplc="240A0003" w:tentative="1">
@@ -19057,7 +19190,7 @@
         <w:ind w:left="6468" w:hanging="360"/>
       </w:pPr>
       <w:rPr>
-        <w:rFonts w:ascii="Courier New" w:hAnsi="Courier New" w:cs="Courier New" w:hint="default"/>
+        <w:rFonts w:hint="default" w:ascii="Courier New" w:hAnsi="Courier New" w:cs="Courier New"/>
       </w:rPr>
     </w:lvl>
     <w:lvl w:ilvl="8" w:tplc="240A0005" w:tentative="1">
@@ -19069,7 +19202,7 @@
         <w:ind w:left="7188" w:hanging="360"/>
       </w:pPr>
       <w:rPr>
-        <w:rFonts w:ascii="Wingdings" w:hAnsi="Wingdings" w:hint="default"/>
+        <w:rFonts w:hint="default" w:ascii="Wingdings" w:hAnsi="Wingdings"/>
       </w:rPr>
     </w:lvl>
   </w:abstractNum>
@@ -19086,7 +19219,7 @@
         <w:ind w:left="1429" w:hanging="360"/>
       </w:pPr>
       <w:rPr>
-        <w:rFonts w:ascii="Symbol" w:hAnsi="Symbol" w:hint="default"/>
+        <w:rFonts w:hint="default" w:ascii="Symbol" w:hAnsi="Symbol"/>
       </w:rPr>
     </w:lvl>
     <w:lvl w:ilvl="1" w:tplc="240A0003" w:tentative="1">
@@ -19098,7 +19231,7 @@
         <w:ind w:left="2149" w:hanging="360"/>
       </w:pPr>
       <w:rPr>
-        <w:rFonts w:ascii="Courier New" w:hAnsi="Courier New" w:cs="Courier New" w:hint="default"/>
+        <w:rFonts w:hint="default" w:ascii="Courier New" w:hAnsi="Courier New" w:cs="Courier New"/>
       </w:rPr>
     </w:lvl>
     <w:lvl w:ilvl="2" w:tplc="240A0005" w:tentative="1">
@@ -19110,7 +19243,7 @@
         <w:ind w:left="2869" w:hanging="360"/>
       </w:pPr>
       <w:rPr>
-        <w:rFonts w:ascii="Wingdings" w:hAnsi="Wingdings" w:hint="default"/>
+        <w:rFonts w:hint="default" w:ascii="Wingdings" w:hAnsi="Wingdings"/>
       </w:rPr>
     </w:lvl>
     <w:lvl w:ilvl="3" w:tplc="240A0001" w:tentative="1">
@@ -19122,7 +19255,7 @@
         <w:ind w:left="3589" w:hanging="360"/>
       </w:pPr>
       <w:rPr>
-        <w:rFonts w:ascii="Symbol" w:hAnsi="Symbol" w:hint="default"/>
+        <w:rFonts w:hint="default" w:ascii="Symbol" w:hAnsi="Symbol"/>
       </w:rPr>
     </w:lvl>
     <w:lvl w:ilvl="4" w:tplc="240A0003" w:tentative="1">
@@ -19134,7 +19267,7 @@
         <w:ind w:left="4309" w:hanging="360"/>
       </w:pPr>
       <w:rPr>
-        <w:rFonts w:ascii="Courier New" w:hAnsi="Courier New" w:cs="Courier New" w:hint="default"/>
+        <w:rFonts w:hint="default" w:ascii="Courier New" w:hAnsi="Courier New" w:cs="Courier New"/>
       </w:rPr>
     </w:lvl>
     <w:lvl w:ilvl="5" w:tplc="240A0005" w:tentative="1">
@@ -19146,7 +19279,7 @@
         <w:ind w:left="5029" w:hanging="360"/>
       </w:pPr>
       <w:rPr>
-        <w:rFonts w:ascii="Wingdings" w:hAnsi="Wingdings" w:hint="default"/>
+        <w:rFonts w:hint="default" w:ascii="Wingdings" w:hAnsi="Wingdings"/>
       </w:rPr>
     </w:lvl>
     <w:lvl w:ilvl="6" w:tplc="240A0001" w:tentative="1">
@@ -19158,7 +19291,7 @@
         <w:ind w:left="5749" w:hanging="360"/>
       </w:pPr>
       <w:rPr>
-        <w:rFonts w:ascii="Symbol" w:hAnsi="Symbol" w:hint="default"/>
+        <w:rFonts w:hint="default" w:ascii="Symbol" w:hAnsi="Symbol"/>
       </w:rPr>
     </w:lvl>
     <w:lvl w:ilvl="7" w:tplc="240A0003" w:tentative="1">
@@ -19170,7 +19303,7 @@
         <w:ind w:left="6469" w:hanging="360"/>
       </w:pPr>
       <w:rPr>
-        <w:rFonts w:ascii="Courier New" w:hAnsi="Courier New" w:cs="Courier New" w:hint="default"/>
+        <w:rFonts w:hint="default" w:ascii="Courier New" w:hAnsi="Courier New" w:cs="Courier New"/>
       </w:rPr>
     </w:lvl>
     <w:lvl w:ilvl="8" w:tplc="240A0005" w:tentative="1">
@@ -19182,7 +19315,7 @@
         <w:ind w:left="7189" w:hanging="360"/>
       </w:pPr>
       <w:rPr>
-        <w:rFonts w:ascii="Wingdings" w:hAnsi="Wingdings" w:hint="default"/>
+        <w:rFonts w:hint="default" w:ascii="Wingdings" w:hAnsi="Wingdings"/>
       </w:rPr>
     </w:lvl>
   </w:abstractNum>
@@ -19199,7 +19332,7 @@
         <w:ind w:left="1080" w:hanging="360"/>
       </w:pPr>
       <w:rPr>
-        <w:rFonts w:ascii="Symbol" w:hAnsi="Symbol" w:hint="default"/>
+        <w:rFonts w:hint="default" w:ascii="Symbol" w:hAnsi="Symbol"/>
       </w:rPr>
     </w:lvl>
     <w:lvl w:ilvl="1" w:tplc="240A0003" w:tentative="1">
@@ -19211,7 +19344,7 @@
         <w:ind w:left="1800" w:hanging="360"/>
       </w:pPr>
       <w:rPr>
-        <w:rFonts w:ascii="Courier New" w:hAnsi="Courier New" w:cs="Courier New" w:hint="default"/>
+        <w:rFonts w:hint="default" w:ascii="Courier New" w:hAnsi="Courier New" w:cs="Courier New"/>
       </w:rPr>
     </w:lvl>
     <w:lvl w:ilvl="2" w:tplc="240A0005" w:tentative="1">
@@ -19223,7 +19356,7 @@
         <w:ind w:left="2520" w:hanging="360"/>
       </w:pPr>
       <w:rPr>
-        <w:rFonts w:ascii="Wingdings" w:hAnsi="Wingdings" w:hint="default"/>
+        <w:rFonts w:hint="default" w:ascii="Wingdings" w:hAnsi="Wingdings"/>
       </w:rPr>
     </w:lvl>
     <w:lvl w:ilvl="3" w:tplc="240A0001" w:tentative="1">
@@ -19235,7 +19368,7 @@
         <w:ind w:left="3240" w:hanging="360"/>
       </w:pPr>
       <w:rPr>
-        <w:rFonts w:ascii="Symbol" w:hAnsi="Symbol" w:hint="default"/>
+        <w:rFonts w:hint="default" w:ascii="Symbol" w:hAnsi="Symbol"/>
       </w:rPr>
     </w:lvl>
     <w:lvl w:ilvl="4" w:tplc="240A0003" w:tentative="1">
@@ -19247,7 +19380,7 @@
         <w:ind w:left="3960" w:hanging="360"/>
       </w:pPr>
       <w:rPr>
-        <w:rFonts w:ascii="Courier New" w:hAnsi="Courier New" w:cs="Courier New" w:hint="default"/>
+        <w:rFonts w:hint="default" w:ascii="Courier New" w:hAnsi="Courier New" w:cs="Courier New"/>
       </w:rPr>
     </w:lvl>
     <w:lvl w:ilvl="5" w:tplc="240A0005" w:tentative="1">
@@ -19259,7 +19392,7 @@
         <w:ind w:left="4680" w:hanging="360"/>
       </w:pPr>
       <w:rPr>
-        <w:rFonts w:ascii="Wingdings" w:hAnsi="Wingdings" w:hint="default"/>
+        <w:rFonts w:hint="default" w:ascii="Wingdings" w:hAnsi="Wingdings"/>
       </w:rPr>
     </w:lvl>
     <w:lvl w:ilvl="6" w:tplc="240A0001" w:tentative="1">
@@ -19271,7 +19404,7 @@
         <w:ind w:left="5400" w:hanging="360"/>
       </w:pPr>
       <w:rPr>
-        <w:rFonts w:ascii="Symbol" w:hAnsi="Symbol" w:hint="default"/>
+        <w:rFonts w:hint="default" w:ascii="Symbol" w:hAnsi="Symbol"/>
       </w:rPr>
     </w:lvl>
     <w:lvl w:ilvl="7" w:tplc="240A0003" w:tentative="1">
@@ -19283,7 +19416,7 @@
         <w:ind w:left="6120" w:hanging="360"/>
       </w:pPr>
       <w:rPr>
-        <w:rFonts w:ascii="Courier New" w:hAnsi="Courier New" w:cs="Courier New" w:hint="default"/>
+        <w:rFonts w:hint="default" w:ascii="Courier New" w:hAnsi="Courier New" w:cs="Courier New"/>
       </w:rPr>
     </w:lvl>
     <w:lvl w:ilvl="8" w:tplc="240A0005" w:tentative="1">
@@ -19295,7 +19428,7 @@
         <w:ind w:left="6840" w:hanging="360"/>
       </w:pPr>
       <w:rPr>
-        <w:rFonts w:ascii="Wingdings" w:hAnsi="Wingdings" w:hint="default"/>
+        <w:rFonts w:hint="default" w:ascii="Wingdings" w:hAnsi="Wingdings"/>
       </w:rPr>
     </w:lvl>
   </w:abstractNum>
@@ -19315,7 +19448,7 @@
         <w:ind w:left="720" w:hanging="360"/>
       </w:pPr>
       <w:rPr>
-        <w:rFonts w:ascii="Symbol" w:hAnsi="Symbol" w:hint="default"/>
+        <w:rFonts w:hint="default" w:ascii="Symbol" w:hAnsi="Symbol"/>
         <w:sz w:val="28"/>
         <w:szCs w:val="28"/>
       </w:rPr>
@@ -19332,7 +19465,7 @@
         <w:ind w:left="1440" w:hanging="360"/>
       </w:pPr>
       <w:rPr>
-        <w:rFonts w:ascii="Symbol" w:hAnsi="Symbol" w:hint="default"/>
+        <w:rFonts w:hint="default" w:ascii="Symbol" w:hAnsi="Symbol"/>
         <w:sz w:val="20"/>
       </w:rPr>
     </w:lvl>
@@ -19348,7 +19481,7 @@
         <w:ind w:left="2160" w:hanging="360"/>
       </w:pPr>
       <w:rPr>
-        <w:rFonts w:ascii="Symbol" w:hAnsi="Symbol" w:hint="default"/>
+        <w:rFonts w:hint="default" w:ascii="Symbol" w:hAnsi="Symbol"/>
         <w:sz w:val="20"/>
       </w:rPr>
     </w:lvl>
@@ -19364,7 +19497,7 @@
         <w:ind w:left="2880" w:hanging="360"/>
       </w:pPr>
       <w:rPr>
-        <w:rFonts w:ascii="Symbol" w:hAnsi="Symbol" w:hint="default"/>
+        <w:rFonts w:hint="default" w:ascii="Symbol" w:hAnsi="Symbol"/>
         <w:sz w:val="20"/>
       </w:rPr>
     </w:lvl>
@@ -19380,7 +19513,7 @@
         <w:ind w:left="3600" w:hanging="360"/>
       </w:pPr>
       <w:rPr>
-        <w:rFonts w:ascii="Symbol" w:hAnsi="Symbol" w:hint="default"/>
+        <w:rFonts w:hint="default" w:ascii="Symbol" w:hAnsi="Symbol"/>
         <w:sz w:val="20"/>
       </w:rPr>
     </w:lvl>
@@ -19396,7 +19529,7 @@
         <w:ind w:left="4320" w:hanging="360"/>
       </w:pPr>
       <w:rPr>
-        <w:rFonts w:ascii="Symbol" w:hAnsi="Symbol" w:hint="default"/>
+        <w:rFonts w:hint="default" w:ascii="Symbol" w:hAnsi="Symbol"/>
         <w:sz w:val="20"/>
       </w:rPr>
     </w:lvl>
@@ -19412,7 +19545,7 @@
         <w:ind w:left="5040" w:hanging="360"/>
       </w:pPr>
       <w:rPr>
-        <w:rFonts w:ascii="Symbol" w:hAnsi="Symbol" w:hint="default"/>
+        <w:rFonts w:hint="default" w:ascii="Symbol" w:hAnsi="Symbol"/>
         <w:sz w:val="20"/>
       </w:rPr>
     </w:lvl>
@@ -19428,7 +19561,7 @@
         <w:ind w:left="5760" w:hanging="360"/>
       </w:pPr>
       <w:rPr>
-        <w:rFonts w:ascii="Symbol" w:hAnsi="Symbol" w:hint="default"/>
+        <w:rFonts w:hint="default" w:ascii="Symbol" w:hAnsi="Symbol"/>
         <w:sz w:val="20"/>
       </w:rPr>
     </w:lvl>
@@ -19444,7 +19577,7 @@
         <w:ind w:left="6480" w:hanging="360"/>
       </w:pPr>
       <w:rPr>
-        <w:rFonts w:ascii="Symbol" w:hAnsi="Symbol" w:hint="default"/>
+        <w:rFonts w:hint="default" w:ascii="Symbol" w:hAnsi="Symbol"/>
         <w:sz w:val="20"/>
       </w:rPr>
     </w:lvl>
@@ -19462,7 +19595,7 @@
         <w:ind w:left="1080" w:hanging="360"/>
       </w:pPr>
       <w:rPr>
-        <w:rFonts w:ascii="Symbol" w:hAnsi="Symbol" w:hint="default"/>
+        <w:rFonts w:hint="default" w:ascii="Symbol" w:hAnsi="Symbol"/>
       </w:rPr>
     </w:lvl>
     <w:lvl w:ilvl="1" w:tplc="240A0003" w:tentative="1">
@@ -19474,7 +19607,7 @@
         <w:ind w:left="1800" w:hanging="360"/>
       </w:pPr>
       <w:rPr>
-        <w:rFonts w:ascii="Courier New" w:hAnsi="Courier New" w:cs="Courier New" w:hint="default"/>
+        <w:rFonts w:hint="default" w:ascii="Courier New" w:hAnsi="Courier New" w:cs="Courier New"/>
       </w:rPr>
     </w:lvl>
     <w:lvl w:ilvl="2" w:tplc="240A0005" w:tentative="1">
@@ -19486,7 +19619,7 @@
         <w:ind w:left="2520" w:hanging="360"/>
       </w:pPr>
       <w:rPr>
-        <w:rFonts w:ascii="Wingdings" w:hAnsi="Wingdings" w:hint="default"/>
+        <w:rFonts w:hint="default" w:ascii="Wingdings" w:hAnsi="Wingdings"/>
       </w:rPr>
     </w:lvl>
     <w:lvl w:ilvl="3" w:tplc="240A0001" w:tentative="1">
@@ -19498,7 +19631,7 @@
         <w:ind w:left="3240" w:hanging="360"/>
       </w:pPr>
       <w:rPr>
-        <w:rFonts w:ascii="Symbol" w:hAnsi="Symbol" w:hint="default"/>
+        <w:rFonts w:hint="default" w:ascii="Symbol" w:hAnsi="Symbol"/>
       </w:rPr>
     </w:lvl>
     <w:lvl w:ilvl="4" w:tplc="240A0003" w:tentative="1">
@@ -19510,7 +19643,7 @@
         <w:ind w:left="3960" w:hanging="360"/>
       </w:pPr>
       <w:rPr>
-        <w:rFonts w:ascii="Courier New" w:hAnsi="Courier New" w:cs="Courier New" w:hint="default"/>
+        <w:rFonts w:hint="default" w:ascii="Courier New" w:hAnsi="Courier New" w:cs="Courier New"/>
       </w:rPr>
     </w:lvl>
     <w:lvl w:ilvl="5" w:tplc="240A0005" w:tentative="1">
@@ -19522,7 +19655,7 @@
         <w:ind w:left="4680" w:hanging="360"/>
       </w:pPr>
       <w:rPr>
-        <w:rFonts w:ascii="Wingdings" w:hAnsi="Wingdings" w:hint="default"/>
+        <w:rFonts w:hint="default" w:ascii="Wingdings" w:hAnsi="Wingdings"/>
       </w:rPr>
     </w:lvl>
     <w:lvl w:ilvl="6" w:tplc="240A0001" w:tentative="1">
@@ -19534,7 +19667,7 @@
         <w:ind w:left="5400" w:hanging="360"/>
       </w:pPr>
       <w:rPr>
-        <w:rFonts w:ascii="Symbol" w:hAnsi="Symbol" w:hint="default"/>
+        <w:rFonts w:hint="default" w:ascii="Symbol" w:hAnsi="Symbol"/>
       </w:rPr>
     </w:lvl>
     <w:lvl w:ilvl="7" w:tplc="240A0003" w:tentative="1">
@@ -19546,7 +19679,7 @@
         <w:ind w:left="6120" w:hanging="360"/>
       </w:pPr>
       <w:rPr>
-        <w:rFonts w:ascii="Courier New" w:hAnsi="Courier New" w:cs="Courier New" w:hint="default"/>
+        <w:rFonts w:hint="default" w:ascii="Courier New" w:hAnsi="Courier New" w:cs="Courier New"/>
       </w:rPr>
     </w:lvl>
     <w:lvl w:ilvl="8" w:tplc="240A0005" w:tentative="1">
@@ -19558,7 +19691,7 @@
         <w:ind w:left="6840" w:hanging="360"/>
       </w:pPr>
       <w:rPr>
-        <w:rFonts w:ascii="Wingdings" w:hAnsi="Wingdings" w:hint="default"/>
+        <w:rFonts w:hint="default" w:ascii="Wingdings" w:hAnsi="Wingdings"/>
       </w:rPr>
     </w:lvl>
   </w:abstractNum>
@@ -19575,7 +19708,7 @@
         <w:ind w:left="1080" w:hanging="360"/>
       </w:pPr>
       <w:rPr>
-        <w:rFonts w:ascii="Symbol" w:hAnsi="Symbol" w:hint="default"/>
+        <w:rFonts w:hint="default" w:ascii="Symbol" w:hAnsi="Symbol"/>
       </w:rPr>
     </w:lvl>
     <w:lvl w:ilvl="1" w:tplc="240A0003" w:tentative="1">
@@ -19587,7 +19720,7 @@
         <w:ind w:left="1800" w:hanging="360"/>
       </w:pPr>
       <w:rPr>
-        <w:rFonts w:ascii="Courier New" w:hAnsi="Courier New" w:cs="Courier New" w:hint="default"/>
+        <w:rFonts w:hint="default" w:ascii="Courier New" w:hAnsi="Courier New" w:cs="Courier New"/>
       </w:rPr>
     </w:lvl>
     <w:lvl w:ilvl="2" w:tplc="240A0005" w:tentative="1">
@@ -19599,7 +19732,7 @@
         <w:ind w:left="2520" w:hanging="360"/>
       </w:pPr>
       <w:rPr>
-        <w:rFonts w:ascii="Wingdings" w:hAnsi="Wingdings" w:hint="default"/>
+        <w:rFonts w:hint="default" w:ascii="Wingdings" w:hAnsi="Wingdings"/>
       </w:rPr>
     </w:lvl>
     <w:lvl w:ilvl="3" w:tplc="240A0001" w:tentative="1">
@@ -19611,7 +19744,7 @@
         <w:ind w:left="3240" w:hanging="360"/>
       </w:pPr>
       <w:rPr>
-        <w:rFonts w:ascii="Symbol" w:hAnsi="Symbol" w:hint="default"/>
+        <w:rFonts w:hint="default" w:ascii="Symbol" w:hAnsi="Symbol"/>
       </w:rPr>
     </w:lvl>
     <w:lvl w:ilvl="4" w:tplc="240A0003" w:tentative="1">
@@ -19623,7 +19756,7 @@
         <w:ind w:left="3960" w:hanging="360"/>
       </w:pPr>
       <w:rPr>
-        <w:rFonts w:ascii="Courier New" w:hAnsi="Courier New" w:cs="Courier New" w:hint="default"/>
+        <w:rFonts w:hint="default" w:ascii="Courier New" w:hAnsi="Courier New" w:cs="Courier New"/>
       </w:rPr>
     </w:lvl>
     <w:lvl w:ilvl="5" w:tplc="240A0005" w:tentative="1">
@@ -19635,7 +19768,7 @@
         <w:ind w:left="4680" w:hanging="360"/>
       </w:pPr>
       <w:rPr>
-        <w:rFonts w:ascii="Wingdings" w:hAnsi="Wingdings" w:hint="default"/>
+        <w:rFonts w:hint="default" w:ascii="Wingdings" w:hAnsi="Wingdings"/>
       </w:rPr>
     </w:lvl>
     <w:lvl w:ilvl="6" w:tplc="240A0001" w:tentative="1">
@@ -19647,7 +19780,7 @@
         <w:ind w:left="5400" w:hanging="360"/>
       </w:pPr>
       <w:rPr>
-        <w:rFonts w:ascii="Symbol" w:hAnsi="Symbol" w:hint="default"/>
+        <w:rFonts w:hint="default" w:ascii="Symbol" w:hAnsi="Symbol"/>
       </w:rPr>
     </w:lvl>
     <w:lvl w:ilvl="7" w:tplc="240A0003" w:tentative="1">
@@ -19659,7 +19792,7 @@
         <w:ind w:left="6120" w:hanging="360"/>
       </w:pPr>
       <w:rPr>
-        <w:rFonts w:ascii="Courier New" w:hAnsi="Courier New" w:cs="Courier New" w:hint="default"/>
+        <w:rFonts w:hint="default" w:ascii="Courier New" w:hAnsi="Courier New" w:cs="Courier New"/>
       </w:rPr>
     </w:lvl>
     <w:lvl w:ilvl="8" w:tplc="240A0005" w:tentative="1">
@@ -19671,7 +19804,7 @@
         <w:ind w:left="6840" w:hanging="360"/>
       </w:pPr>
       <w:rPr>
-        <w:rFonts w:ascii="Wingdings" w:hAnsi="Wingdings" w:hint="default"/>
+        <w:rFonts w:hint="default" w:ascii="Wingdings" w:hAnsi="Wingdings"/>
       </w:rPr>
     </w:lvl>
   </w:abstractNum>
@@ -19688,7 +19821,7 @@
         <w:ind w:left="1428" w:hanging="360"/>
       </w:pPr>
       <w:rPr>
-        <w:rFonts w:ascii="Symbol" w:hAnsi="Symbol" w:hint="default"/>
+        <w:rFonts w:hint="default" w:ascii="Symbol" w:hAnsi="Symbol"/>
       </w:rPr>
     </w:lvl>
     <w:lvl w:ilvl="1" w:tplc="240A0003" w:tentative="1">
@@ -19700,7 +19833,7 @@
         <w:ind w:left="2148" w:hanging="360"/>
       </w:pPr>
       <w:rPr>
-        <w:rFonts w:ascii="Courier New" w:hAnsi="Courier New" w:cs="Courier New" w:hint="default"/>
+        <w:rFonts w:hint="default" w:ascii="Courier New" w:hAnsi="Courier New" w:cs="Courier New"/>
       </w:rPr>
     </w:lvl>
     <w:lvl w:ilvl="2" w:tplc="240A0005" w:tentative="1">
@@ -19712,7 +19845,7 @@
         <w:ind w:left="2868" w:hanging="360"/>
       </w:pPr>
       <w:rPr>
-        <w:rFonts w:ascii="Wingdings" w:hAnsi="Wingdings" w:hint="default"/>
+        <w:rFonts w:hint="default" w:ascii="Wingdings" w:hAnsi="Wingdings"/>
       </w:rPr>
     </w:lvl>
     <w:lvl w:ilvl="3" w:tplc="240A0001" w:tentative="1">
@@ -19724,7 +19857,7 @@
         <w:ind w:left="3588" w:hanging="360"/>
       </w:pPr>
       <w:rPr>
-        <w:rFonts w:ascii="Symbol" w:hAnsi="Symbol" w:hint="default"/>
+        <w:rFonts w:hint="default" w:ascii="Symbol" w:hAnsi="Symbol"/>
       </w:rPr>
     </w:lvl>
     <w:lvl w:ilvl="4" w:tplc="240A0003" w:tentative="1">
@@ -19736,7 +19869,7 @@
         <w:ind w:left="4308" w:hanging="360"/>
       </w:pPr>
       <w:rPr>
-        <w:rFonts w:ascii="Courier New" w:hAnsi="Courier New" w:cs="Courier New" w:hint="default"/>
+        <w:rFonts w:hint="default" w:ascii="Courier New" w:hAnsi="Courier New" w:cs="Courier New"/>
       </w:rPr>
     </w:lvl>
     <w:lvl w:ilvl="5" w:tplc="240A0005" w:tentative="1">
@@ -19748,7 +19881,7 @@
         <w:ind w:left="5028" w:hanging="360"/>
       </w:pPr>
       <w:rPr>
-        <w:rFonts w:ascii="Wingdings" w:hAnsi="Wingdings" w:hint="default"/>
+        <w:rFonts w:hint="default" w:ascii="Wingdings" w:hAnsi="Wingdings"/>
       </w:rPr>
     </w:lvl>
     <w:lvl w:ilvl="6" w:tplc="240A0001" w:tentative="1">
@@ -19760,7 +19893,7 @@
         <w:ind w:left="5748" w:hanging="360"/>
       </w:pPr>
       <w:rPr>
-        <w:rFonts w:ascii="Symbol" w:hAnsi="Symbol" w:hint="default"/>
+        <w:rFonts w:hint="default" w:ascii="Symbol" w:hAnsi="Symbol"/>
       </w:rPr>
     </w:lvl>
     <w:lvl w:ilvl="7" w:tplc="240A0003" w:tentative="1">
@@ -19772,7 +19905,7 @@
         <w:ind w:left="6468" w:hanging="360"/>
       </w:pPr>
       <w:rPr>
-        <w:rFonts w:ascii="Courier New" w:hAnsi="Courier New" w:cs="Courier New" w:hint="default"/>
+        <w:rFonts w:hint="default" w:ascii="Courier New" w:hAnsi="Courier New" w:cs="Courier New"/>
       </w:rPr>
     </w:lvl>
     <w:lvl w:ilvl="8" w:tplc="240A0005" w:tentative="1">
@@ -19784,7 +19917,7 @@
         <w:ind w:left="7188" w:hanging="360"/>
       </w:pPr>
       <w:rPr>
-        <w:rFonts w:ascii="Wingdings" w:hAnsi="Wingdings" w:hint="default"/>
+        <w:rFonts w:hint="default" w:ascii="Wingdings" w:hAnsi="Wingdings"/>
       </w:rPr>
     </w:lvl>
   </w:abstractNum>
@@ -19801,7 +19934,7 @@
         <w:ind w:left="1429" w:hanging="360"/>
       </w:pPr>
       <w:rPr>
-        <w:rFonts w:ascii="Symbol" w:hAnsi="Symbol" w:hint="default"/>
+        <w:rFonts w:hint="default" w:ascii="Symbol" w:hAnsi="Symbol"/>
       </w:rPr>
     </w:lvl>
     <w:lvl w:ilvl="1" w:tplc="240A0003" w:tentative="1">
@@ -19813,7 +19946,7 @@
         <w:ind w:left="2149" w:hanging="360"/>
       </w:pPr>
       <w:rPr>
-        <w:rFonts w:ascii="Courier New" w:hAnsi="Courier New" w:cs="Courier New" w:hint="default"/>
+        <w:rFonts w:hint="default" w:ascii="Courier New" w:hAnsi="Courier New" w:cs="Courier New"/>
       </w:rPr>
     </w:lvl>
     <w:lvl w:ilvl="2" w:tplc="240A0005" w:tentative="1">
@@ -19825,7 +19958,7 @@
         <w:ind w:left="2869" w:hanging="360"/>
       </w:pPr>
       <w:rPr>
-        <w:rFonts w:ascii="Wingdings" w:hAnsi="Wingdings" w:hint="default"/>
+        <w:rFonts w:hint="default" w:ascii="Wingdings" w:hAnsi="Wingdings"/>
       </w:rPr>
     </w:lvl>
     <w:lvl w:ilvl="3" w:tplc="240A0001" w:tentative="1">
@@ -19837,7 +19970,7 @@
         <w:ind w:left="3589" w:hanging="360"/>
       </w:pPr>
       <w:rPr>
-        <w:rFonts w:ascii="Symbol" w:hAnsi="Symbol" w:hint="default"/>
+        <w:rFonts w:hint="default" w:ascii="Symbol" w:hAnsi="Symbol"/>
       </w:rPr>
     </w:lvl>
     <w:lvl w:ilvl="4" w:tplc="240A0003" w:tentative="1">
@@ -19849,7 +19982,7 @@
         <w:ind w:left="4309" w:hanging="360"/>
       </w:pPr>
       <w:rPr>
-        <w:rFonts w:ascii="Courier New" w:hAnsi="Courier New" w:cs="Courier New" w:hint="default"/>
+        <w:rFonts w:hint="default" w:ascii="Courier New" w:hAnsi="Courier New" w:cs="Courier New"/>
       </w:rPr>
     </w:lvl>
     <w:lvl w:ilvl="5" w:tplc="240A0005" w:tentative="1">
@@ -19861,7 +19994,7 @@
         <w:ind w:left="5029" w:hanging="360"/>
       </w:pPr>
       <w:rPr>
-        <w:rFonts w:ascii="Wingdings" w:hAnsi="Wingdings" w:hint="default"/>
+        <w:rFonts w:hint="default" w:ascii="Wingdings" w:hAnsi="Wingdings"/>
       </w:rPr>
     </w:lvl>
     <w:lvl w:ilvl="6" w:tplc="240A0001" w:tentative="1">
@@ -19873,7 +20006,7 @@
         <w:ind w:left="5749" w:hanging="360"/>
       </w:pPr>
       <w:rPr>
-        <w:rFonts w:ascii="Symbol" w:hAnsi="Symbol" w:hint="default"/>
+        <w:rFonts w:hint="default" w:ascii="Symbol" w:hAnsi="Symbol"/>
       </w:rPr>
     </w:lvl>
     <w:lvl w:ilvl="7" w:tplc="240A0003" w:tentative="1">
@@ -19885,7 +20018,7 @@
         <w:ind w:left="6469" w:hanging="360"/>
       </w:pPr>
       <w:rPr>
-        <w:rFonts w:ascii="Courier New" w:hAnsi="Courier New" w:cs="Courier New" w:hint="default"/>
+        <w:rFonts w:hint="default" w:ascii="Courier New" w:hAnsi="Courier New" w:cs="Courier New"/>
       </w:rPr>
     </w:lvl>
     <w:lvl w:ilvl="8" w:tplc="240A0005" w:tentative="1">
@@ -19897,7 +20030,7 @@
         <w:ind w:left="7189" w:hanging="360"/>
       </w:pPr>
       <w:rPr>
-        <w:rFonts w:ascii="Wingdings" w:hAnsi="Wingdings" w:hint="default"/>
+        <w:rFonts w:hint="default" w:ascii="Wingdings" w:hAnsi="Wingdings"/>
       </w:rPr>
     </w:lvl>
   </w:abstractNum>
@@ -20005,7 +20138,7 @@
         <w:ind w:left="1068" w:hanging="360"/>
       </w:pPr>
       <w:rPr>
-        <w:rFonts w:ascii="Calibri" w:hAnsi="Calibri" w:hint="default"/>
+        <w:rFonts w:hint="default" w:ascii="Calibri" w:hAnsi="Calibri"/>
         <w:b/>
         <w:bCs/>
         <w:i w:val="0"/>
@@ -20119,7 +20252,7 @@
         <w:ind w:left="1080" w:hanging="360"/>
       </w:pPr>
       <w:rPr>
-        <w:rFonts w:ascii="Symbol" w:hAnsi="Symbol" w:hint="default"/>
+        <w:rFonts w:hint="default" w:ascii="Symbol" w:hAnsi="Symbol"/>
       </w:rPr>
     </w:lvl>
     <w:lvl w:ilvl="1" w:tplc="240A0003" w:tentative="1">
@@ -20131,7 +20264,7 @@
         <w:ind w:left="1800" w:hanging="360"/>
       </w:pPr>
       <w:rPr>
-        <w:rFonts w:ascii="Courier New" w:hAnsi="Courier New" w:cs="Courier New" w:hint="default"/>
+        <w:rFonts w:hint="default" w:ascii="Courier New" w:hAnsi="Courier New" w:cs="Courier New"/>
       </w:rPr>
     </w:lvl>
     <w:lvl w:ilvl="2" w:tplc="240A0005" w:tentative="1">
@@ -20143,7 +20276,7 @@
         <w:ind w:left="2520" w:hanging="360"/>
       </w:pPr>
       <w:rPr>
-        <w:rFonts w:ascii="Wingdings" w:hAnsi="Wingdings" w:hint="default"/>
+        <w:rFonts w:hint="default" w:ascii="Wingdings" w:hAnsi="Wingdings"/>
       </w:rPr>
     </w:lvl>
     <w:lvl w:ilvl="3" w:tplc="240A0001" w:tentative="1">
@@ -20155,7 +20288,7 @@
         <w:ind w:left="3240" w:hanging="360"/>
       </w:pPr>
       <w:rPr>
-        <w:rFonts w:ascii="Symbol" w:hAnsi="Symbol" w:hint="default"/>
+        <w:rFonts w:hint="default" w:ascii="Symbol" w:hAnsi="Symbol"/>
       </w:rPr>
     </w:lvl>
     <w:lvl w:ilvl="4" w:tplc="240A0003" w:tentative="1">
@@ -20167,7 +20300,7 @@
         <w:ind w:left="3960" w:hanging="360"/>
       </w:pPr>
       <w:rPr>
-        <w:rFonts w:ascii="Courier New" w:hAnsi="Courier New" w:cs="Courier New" w:hint="default"/>
+        <w:rFonts w:hint="default" w:ascii="Courier New" w:hAnsi="Courier New" w:cs="Courier New"/>
       </w:rPr>
     </w:lvl>
     <w:lvl w:ilvl="5" w:tplc="240A0005" w:tentative="1">
@@ -20179,7 +20312,7 @@
         <w:ind w:left="4680" w:hanging="360"/>
       </w:pPr>
       <w:rPr>
-        <w:rFonts w:ascii="Wingdings" w:hAnsi="Wingdings" w:hint="default"/>
+        <w:rFonts w:hint="default" w:ascii="Wingdings" w:hAnsi="Wingdings"/>
       </w:rPr>
     </w:lvl>
     <w:lvl w:ilvl="6" w:tplc="240A0001" w:tentative="1">
@@ -20191,7 +20324,7 @@
         <w:ind w:left="5400" w:hanging="360"/>
       </w:pPr>
       <w:rPr>
-        <w:rFonts w:ascii="Symbol" w:hAnsi="Symbol" w:hint="default"/>
+        <w:rFonts w:hint="default" w:ascii="Symbol" w:hAnsi="Symbol"/>
       </w:rPr>
     </w:lvl>
     <w:lvl w:ilvl="7" w:tplc="240A0003" w:tentative="1">
@@ -20203,7 +20336,7 @@
         <w:ind w:left="6120" w:hanging="360"/>
       </w:pPr>
       <w:rPr>
-        <w:rFonts w:ascii="Courier New" w:hAnsi="Courier New" w:cs="Courier New" w:hint="default"/>
+        <w:rFonts w:hint="default" w:ascii="Courier New" w:hAnsi="Courier New" w:cs="Courier New"/>
       </w:rPr>
     </w:lvl>
     <w:lvl w:ilvl="8" w:tplc="240A0005" w:tentative="1">
@@ -20215,7 +20348,7 @@
         <w:ind w:left="6840" w:hanging="360"/>
       </w:pPr>
       <w:rPr>
-        <w:rFonts w:ascii="Wingdings" w:hAnsi="Wingdings" w:hint="default"/>
+        <w:rFonts w:hint="default" w:ascii="Wingdings" w:hAnsi="Wingdings"/>
       </w:rPr>
     </w:lvl>
   </w:abstractNum>
@@ -20232,7 +20365,7 @@
         <w:ind w:left="1080" w:hanging="360"/>
       </w:pPr>
       <w:rPr>
-        <w:rFonts w:ascii="Symbol" w:hAnsi="Symbol" w:hint="default"/>
+        <w:rFonts w:hint="default" w:ascii="Symbol" w:hAnsi="Symbol"/>
       </w:rPr>
     </w:lvl>
     <w:lvl w:ilvl="1" w:tplc="240A0003" w:tentative="1">
@@ -20244,7 +20377,7 @@
         <w:ind w:left="1800" w:hanging="360"/>
       </w:pPr>
       <w:rPr>
-        <w:rFonts w:ascii="Courier New" w:hAnsi="Courier New" w:cs="Courier New" w:hint="default"/>
+        <w:rFonts w:hint="default" w:ascii="Courier New" w:hAnsi="Courier New" w:cs="Courier New"/>
       </w:rPr>
     </w:lvl>
     <w:lvl w:ilvl="2" w:tplc="240A0005" w:tentative="1">
@@ -20256,7 +20389,7 @@
         <w:ind w:left="2520" w:hanging="360"/>
       </w:pPr>
       <w:rPr>
-        <w:rFonts w:ascii="Wingdings" w:hAnsi="Wingdings" w:hint="default"/>
+        <w:rFonts w:hint="default" w:ascii="Wingdings" w:hAnsi="Wingdings"/>
       </w:rPr>
     </w:lvl>
     <w:lvl w:ilvl="3" w:tplc="240A0001" w:tentative="1">
@@ -20268,7 +20401,7 @@
         <w:ind w:left="3240" w:hanging="360"/>
       </w:pPr>
       <w:rPr>
-        <w:rFonts w:ascii="Symbol" w:hAnsi="Symbol" w:hint="default"/>
+        <w:rFonts w:hint="default" w:ascii="Symbol" w:hAnsi="Symbol"/>
       </w:rPr>
     </w:lvl>
     <w:lvl w:ilvl="4" w:tplc="240A0003" w:tentative="1">
@@ -20280,7 +20413,7 @@
         <w:ind w:left="3960" w:hanging="360"/>
       </w:pPr>
       <w:rPr>
-        <w:rFonts w:ascii="Courier New" w:hAnsi="Courier New" w:cs="Courier New" w:hint="default"/>
+        <w:rFonts w:hint="default" w:ascii="Courier New" w:hAnsi="Courier New" w:cs="Courier New"/>
       </w:rPr>
     </w:lvl>
     <w:lvl w:ilvl="5" w:tplc="240A0005" w:tentative="1">
@@ -20292,7 +20425,7 @@
         <w:ind w:left="4680" w:hanging="360"/>
       </w:pPr>
       <w:rPr>
-        <w:rFonts w:ascii="Wingdings" w:hAnsi="Wingdings" w:hint="default"/>
+        <w:rFonts w:hint="default" w:ascii="Wingdings" w:hAnsi="Wingdings"/>
       </w:rPr>
     </w:lvl>
     <w:lvl w:ilvl="6" w:tplc="240A0001" w:tentative="1">
@@ -20304,7 +20437,7 @@
         <w:ind w:left="5400" w:hanging="360"/>
       </w:pPr>
       <w:rPr>
-        <w:rFonts w:ascii="Symbol" w:hAnsi="Symbol" w:hint="default"/>
+        <w:rFonts w:hint="default" w:ascii="Symbol" w:hAnsi="Symbol"/>
       </w:rPr>
     </w:lvl>
     <w:lvl w:ilvl="7" w:tplc="240A0003" w:tentative="1">
@@ -20316,7 +20449,7 @@
         <w:ind w:left="6120" w:hanging="360"/>
       </w:pPr>
       <w:rPr>
-        <w:rFonts w:ascii="Courier New" w:hAnsi="Courier New" w:cs="Courier New" w:hint="default"/>
+        <w:rFonts w:hint="default" w:ascii="Courier New" w:hAnsi="Courier New" w:cs="Courier New"/>
       </w:rPr>
     </w:lvl>
     <w:lvl w:ilvl="8" w:tplc="240A0005" w:tentative="1">
@@ -20328,7 +20461,7 @@
         <w:ind w:left="6840" w:hanging="360"/>
       </w:pPr>
       <w:rPr>
-        <w:rFonts w:ascii="Wingdings" w:hAnsi="Wingdings" w:hint="default"/>
+        <w:rFonts w:hint="default" w:ascii="Wingdings" w:hAnsi="Wingdings"/>
       </w:rPr>
     </w:lvl>
   </w:abstractNum>
@@ -20345,7 +20478,7 @@
         <w:ind w:left="1080" w:hanging="360"/>
       </w:pPr>
       <w:rPr>
-        <w:rFonts w:ascii="Symbol" w:hAnsi="Symbol" w:hint="default"/>
+        <w:rFonts w:hint="default" w:ascii="Symbol" w:hAnsi="Symbol"/>
       </w:rPr>
     </w:lvl>
     <w:lvl w:ilvl="1" w:tplc="240A0003" w:tentative="1">
@@ -20357,7 +20490,7 @@
         <w:ind w:left="1800" w:hanging="360"/>
       </w:pPr>
       <w:rPr>
-        <w:rFonts w:ascii="Courier New" w:hAnsi="Courier New" w:cs="Courier New" w:hint="default"/>
+        <w:rFonts w:hint="default" w:ascii="Courier New" w:hAnsi="Courier New" w:cs="Courier New"/>
       </w:rPr>
     </w:lvl>
     <w:lvl w:ilvl="2" w:tplc="240A0005" w:tentative="1">
@@ -20369,7 +20502,7 @@
         <w:ind w:left="2520" w:hanging="360"/>
       </w:pPr>
       <w:rPr>
-        <w:rFonts w:ascii="Wingdings" w:hAnsi="Wingdings" w:hint="default"/>
+        <w:rFonts w:hint="default" w:ascii="Wingdings" w:hAnsi="Wingdings"/>
       </w:rPr>
     </w:lvl>
     <w:lvl w:ilvl="3" w:tplc="240A0001" w:tentative="1">
@@ -20381,7 +20514,7 @@
         <w:ind w:left="3240" w:hanging="360"/>
       </w:pPr>
       <w:rPr>
-        <w:rFonts w:ascii="Symbol" w:hAnsi="Symbol" w:hint="default"/>
+        <w:rFonts w:hint="default" w:ascii="Symbol" w:hAnsi="Symbol"/>
       </w:rPr>
     </w:lvl>
     <w:lvl w:ilvl="4" w:tplc="240A0003" w:tentative="1">
@@ -20393,7 +20526,7 @@
         <w:ind w:left="3960" w:hanging="360"/>
       </w:pPr>
       <w:rPr>
-        <w:rFonts w:ascii="Courier New" w:hAnsi="Courier New" w:cs="Courier New" w:hint="default"/>
+        <w:rFonts w:hint="default" w:ascii="Courier New" w:hAnsi="Courier New" w:cs="Courier New"/>
       </w:rPr>
     </w:lvl>
     <w:lvl w:ilvl="5" w:tplc="240A0005" w:tentative="1">
@@ -20405,7 +20538,7 @@
         <w:ind w:left="4680" w:hanging="360"/>
       </w:pPr>
       <w:rPr>
-        <w:rFonts w:ascii="Wingdings" w:hAnsi="Wingdings" w:hint="default"/>
+        <w:rFonts w:hint="default" w:ascii="Wingdings" w:hAnsi="Wingdings"/>
       </w:rPr>
     </w:lvl>
     <w:lvl w:ilvl="6" w:tplc="240A0001" w:tentative="1">
@@ -20417,7 +20550,7 @@
         <w:ind w:left="5400" w:hanging="360"/>
       </w:pPr>
       <w:rPr>
-        <w:rFonts w:ascii="Symbol" w:hAnsi="Symbol" w:hint="default"/>
+        <w:rFonts w:hint="default" w:ascii="Symbol" w:hAnsi="Symbol"/>
       </w:rPr>
     </w:lvl>
     <w:lvl w:ilvl="7" w:tplc="240A0003" w:tentative="1">
@@ -20429,7 +20562,7 @@
         <w:ind w:left="6120" w:hanging="360"/>
       </w:pPr>
       <w:rPr>
-        <w:rFonts w:ascii="Courier New" w:hAnsi="Courier New" w:cs="Courier New" w:hint="default"/>
+        <w:rFonts w:hint="default" w:ascii="Courier New" w:hAnsi="Courier New" w:cs="Courier New"/>
       </w:rPr>
     </w:lvl>
     <w:lvl w:ilvl="8" w:tplc="240A0005" w:tentative="1">
@@ -20441,7 +20574,7 @@
         <w:ind w:left="6840" w:hanging="360"/>
       </w:pPr>
       <w:rPr>
-        <w:rFonts w:ascii="Wingdings" w:hAnsi="Wingdings" w:hint="default"/>
+        <w:rFonts w:hint="default" w:ascii="Wingdings" w:hAnsi="Wingdings"/>
       </w:rPr>
     </w:lvl>
   </w:abstractNum>
@@ -20715,7 +20848,7 @@
   <w:docDefaults>
     <w:rPrDefault>
       <w:rPr>
-        <w:rFonts w:asciiTheme="minorHAnsi" w:eastAsiaTheme="minorHAnsi" w:hAnsiTheme="minorHAnsi" w:cstheme="minorBidi"/>
+        <w:rFonts w:asciiTheme="minorHAnsi" w:hAnsiTheme="minorHAnsi" w:eastAsiaTheme="minorHAnsi" w:cstheme="minorBidi"/>
         <w:kern w:val="2"/>
         <w:sz w:val="22"/>
         <w:szCs w:val="22"/>
@@ -20732,14 +20865,14 @@
   <w:latentStyles w:defLockedState="0" w:defUIPriority="99" w:defSemiHidden="0" w:defUnhideWhenUsed="0" w:defQFormat="0" w:count="376">
     <w:lsdException w:name="Normal" w:uiPriority="0" w:qFormat="1"/>
     <w:lsdException w:name="heading 1" w:uiPriority="9" w:qFormat="1"/>
-    <w:lsdException w:name="heading 2" w:semiHidden="1" w:uiPriority="9" w:unhideWhenUsed="1" w:qFormat="1"/>
-    <w:lsdException w:name="heading 3" w:semiHidden="1" w:uiPriority="9" w:unhideWhenUsed="1" w:qFormat="1"/>
-    <w:lsdException w:name="heading 4" w:semiHidden="1" w:uiPriority="9" w:unhideWhenUsed="1" w:qFormat="1"/>
-    <w:lsdException w:name="heading 5" w:semiHidden="1" w:uiPriority="9" w:unhideWhenUsed="1" w:qFormat="1"/>
-    <w:lsdException w:name="heading 6" w:semiHidden="1" w:uiPriority="9" w:unhideWhenUsed="1"/>
-    <w:lsdException w:name="heading 7" w:semiHidden="1" w:uiPriority="9" w:unhideWhenUsed="1" w:qFormat="1"/>
-    <w:lsdException w:name="heading 8" w:semiHidden="1" w:uiPriority="9" w:unhideWhenUsed="1" w:qFormat="1"/>
-    <w:lsdException w:name="heading 9" w:semiHidden="1" w:uiPriority="9" w:unhideWhenUsed="1" w:qFormat="1"/>
+    <w:lsdException w:name="heading 2" w:uiPriority="9" w:semiHidden="1" w:unhideWhenUsed="1" w:qFormat="1"/>
+    <w:lsdException w:name="heading 3" w:uiPriority="9" w:semiHidden="1" w:unhideWhenUsed="1" w:qFormat="1"/>
+    <w:lsdException w:name="heading 4" w:uiPriority="9" w:semiHidden="1" w:unhideWhenUsed="1" w:qFormat="1"/>
+    <w:lsdException w:name="heading 5" w:uiPriority="9" w:semiHidden="1" w:unhideWhenUsed="1" w:qFormat="1"/>
+    <w:lsdException w:name="heading 6" w:uiPriority="9" w:semiHidden="1" w:unhideWhenUsed="1"/>
+    <w:lsdException w:name="heading 7" w:uiPriority="9" w:semiHidden="1" w:unhideWhenUsed="1" w:qFormat="1"/>
+    <w:lsdException w:name="heading 8" w:uiPriority="9" w:semiHidden="1" w:unhideWhenUsed="1" w:qFormat="1"/>
+    <w:lsdException w:name="heading 9" w:uiPriority="9" w:semiHidden="1" w:unhideWhenUsed="1" w:qFormat="1"/>
     <w:lsdException w:name="index 1" w:semiHidden="1" w:unhideWhenUsed="1"/>
     <w:lsdException w:name="index 2" w:semiHidden="1" w:unhideWhenUsed="1"/>
     <w:lsdException w:name="index 3" w:semiHidden="1" w:unhideWhenUsed="1"/>
@@ -20749,22 +20882,22 @@
     <w:lsdException w:name="index 7" w:semiHidden="1" w:unhideWhenUsed="1"/>
     <w:lsdException w:name="index 8" w:semiHidden="1" w:unhideWhenUsed="1"/>
     <w:lsdException w:name="index 9" w:semiHidden="1" w:unhideWhenUsed="1"/>
-    <w:lsdException w:name="toc 1" w:semiHidden="1" w:uiPriority="39" w:unhideWhenUsed="1"/>
-    <w:lsdException w:name="toc 2" w:semiHidden="1" w:uiPriority="39" w:unhideWhenUsed="1"/>
-    <w:lsdException w:name="toc 3" w:semiHidden="1" w:uiPriority="39" w:unhideWhenUsed="1"/>
-    <w:lsdException w:name="toc 4" w:semiHidden="1" w:uiPriority="39" w:unhideWhenUsed="1"/>
-    <w:lsdException w:name="toc 5" w:semiHidden="1" w:uiPriority="39" w:unhideWhenUsed="1"/>
-    <w:lsdException w:name="toc 6" w:semiHidden="1" w:uiPriority="39" w:unhideWhenUsed="1"/>
-    <w:lsdException w:name="toc 7" w:semiHidden="1" w:uiPriority="39" w:unhideWhenUsed="1"/>
-    <w:lsdException w:name="toc 8" w:semiHidden="1" w:uiPriority="39" w:unhideWhenUsed="1"/>
-    <w:lsdException w:name="toc 9" w:semiHidden="1" w:uiPriority="39" w:unhideWhenUsed="1"/>
+    <w:lsdException w:name="toc 1" w:uiPriority="39" w:semiHidden="1" w:unhideWhenUsed="1"/>
+    <w:lsdException w:name="toc 2" w:uiPriority="39" w:semiHidden="1" w:unhideWhenUsed="1"/>
+    <w:lsdException w:name="toc 3" w:uiPriority="39" w:semiHidden="1" w:unhideWhenUsed="1"/>
+    <w:lsdException w:name="toc 4" w:uiPriority="39" w:semiHidden="1" w:unhideWhenUsed="1"/>
+    <w:lsdException w:name="toc 5" w:uiPriority="39" w:semiHidden="1" w:unhideWhenUsed="1"/>
+    <w:lsdException w:name="toc 6" w:uiPriority="39" w:semiHidden="1" w:unhideWhenUsed="1"/>
+    <w:lsdException w:name="toc 7" w:uiPriority="39" w:semiHidden="1" w:unhideWhenUsed="1"/>
+    <w:lsdException w:name="toc 8" w:uiPriority="39" w:semiHidden="1" w:unhideWhenUsed="1"/>
+    <w:lsdException w:name="toc 9" w:uiPriority="39" w:semiHidden="1" w:unhideWhenUsed="1"/>
     <w:lsdException w:name="Normal Indent" w:semiHidden="1" w:unhideWhenUsed="1"/>
     <w:lsdException w:name="footnote text" w:semiHidden="1" w:unhideWhenUsed="1"/>
     <w:lsdException w:name="annotation text" w:semiHidden="1" w:unhideWhenUsed="1"/>
     <w:lsdException w:name="header" w:semiHidden="1" w:unhideWhenUsed="1"/>
     <w:lsdException w:name="footer" w:semiHidden="1" w:unhideWhenUsed="1"/>
     <w:lsdException w:name="index heading" w:semiHidden="1" w:unhideWhenUsed="1"/>
-    <w:lsdException w:name="caption" w:semiHidden="1" w:uiPriority="35" w:unhideWhenUsed="1" w:qFormat="1"/>
+    <w:lsdException w:name="caption" w:uiPriority="35" w:semiHidden="1" w:unhideWhenUsed="1" w:qFormat="1"/>
     <w:lsdException w:name="table of figures" w:semiHidden="1" w:unhideWhenUsed="1"/>
     <w:lsdException w:name="envelope address" w:semiHidden="1" w:unhideWhenUsed="1"/>
     <w:lsdException w:name="envelope return" w:semiHidden="1" w:unhideWhenUsed="1"/>
@@ -20795,7 +20928,7 @@
     <w:lsdException w:name="Title" w:uiPriority="10" w:qFormat="1"/>
     <w:lsdException w:name="Closing" w:semiHidden="1" w:unhideWhenUsed="1"/>
     <w:lsdException w:name="Signature" w:semiHidden="1" w:unhideWhenUsed="1"/>
-    <w:lsdException w:name="Default Paragraph Font" w:semiHidden="1" w:uiPriority="1" w:unhideWhenUsed="1"/>
+    <w:lsdException w:name="Default Paragraph Font" w:uiPriority="1" w:semiHidden="1" w:unhideWhenUsed="1"/>
     <w:lsdException w:name="Body Text" w:semiHidden="1" w:unhideWhenUsed="1"/>
     <w:lsdException w:name="Body Text Indent" w:semiHidden="1" w:unhideWhenUsed="1"/>
     <w:lsdException w:name="List Continue" w:semiHidden="1" w:unhideWhenUsed="1"/>
@@ -20995,8 +21128,8 @@
     <w:lsdException w:name="Subtle Reference" w:uiPriority="31" w:qFormat="1"/>
     <w:lsdException w:name="Intense Reference" w:uiPriority="32" w:qFormat="1"/>
     <w:lsdException w:name="Book Title" w:uiPriority="33" w:qFormat="1"/>
-    <w:lsdException w:name="Bibliography" w:semiHidden="1" w:uiPriority="37" w:unhideWhenUsed="1"/>
-    <w:lsdException w:name="TOC Heading" w:semiHidden="1" w:uiPriority="39" w:unhideWhenUsed="1" w:qFormat="1"/>
+    <w:lsdException w:name="Bibliography" w:uiPriority="37" w:semiHidden="1" w:unhideWhenUsed="1"/>
+    <w:lsdException w:name="TOC Heading" w:uiPriority="39" w:semiHidden="1" w:unhideWhenUsed="1" w:qFormat="1"/>
     <w:lsdException w:name="Plain Table 1" w:uiPriority="41"/>
     <w:lsdException w:name="Plain Table 2" w:uiPriority="42"/>
     <w:lsdException w:name="Plain Table 3" w:uiPriority="43"/>
@@ -21107,7 +21240,7 @@
     <w:lsdException w:name="Unresolved Mention" w:semiHidden="1" w:unhideWhenUsed="1"/>
     <w:lsdException w:name="Smart Link" w:semiHidden="1" w:unhideWhenUsed="1"/>
   </w:latentStyles>
-  <w:style w:type="paragraph" w:default="1" w:styleId="Normal">
+  <w:style w:type="paragraph" w:styleId="Normal" w:default="1">
     <w:name w:val="Normal"/>
     <w:qFormat/>
     <w:rsid w:val="00A4145D"/>
@@ -21138,7 +21271,7 @@
       <w:outlineLvl w:val="0"/>
     </w:pPr>
     <w:rPr>
-      <w:rFonts w:ascii="Calibri" w:eastAsia="Times New Roman" w:hAnsi="Calibri" w:cs="Times New Roman (Títulos en alf"/>
+      <w:rFonts w:ascii="Calibri" w:hAnsi="Calibri" w:eastAsia="Times New Roman" w:cs="Times New Roman (Títulos en alf"/>
       <w:b/>
       <w:color w:val="000000" w:themeColor="text1"/>
       <w:kern w:val="0"/>
@@ -21172,7 +21305,7 @@
       <w:outlineLvl w:val="1"/>
     </w:pPr>
     <w:rPr>
-      <w:rFonts w:ascii="Calibri" w:eastAsiaTheme="majorEastAsia" w:hAnsi="Calibri" w:cs="Calibri"/>
+      <w:rFonts w:ascii="Calibri" w:hAnsi="Calibri" w:cs="Calibri" w:eastAsiaTheme="majorEastAsia"/>
       <w:b/>
       <w:bCs/>
       <w:color w:val="000000"/>
@@ -21252,12 +21385,12 @@
       <w:outlineLvl w:val="5"/>
     </w:pPr>
   </w:style>
-  <w:style w:type="character" w:default="1" w:styleId="Fuentedeprrafopredeter">
+  <w:style w:type="character" w:styleId="Fuentedeprrafopredeter" w:default="1">
     <w:name w:val="Default Paragraph Font"/>
     <w:uiPriority w:val="1"/>
     <w:unhideWhenUsed/>
   </w:style>
-  <w:style w:type="table" w:default="1" w:styleId="Tablanormal">
+  <w:style w:type="table" w:styleId="Tablanormal" w:default="1">
     <w:name w:val="Normal Table"/>
     <w:uiPriority w:val="99"/>
     <w:semiHidden/>
@@ -21272,7 +21405,7 @@
       </w:tblCellMar>
     </w:tblPr>
   </w:style>
-  <w:style w:type="numbering" w:default="1" w:styleId="Sinlista">
+  <w:style w:type="numbering" w:styleId="Sinlista" w:default="1">
     <w:name w:val="No List"/>
     <w:uiPriority w:val="99"/>
     <w:semiHidden/>
@@ -21289,7 +21422,7 @@
       <w:contextualSpacing/>
     </w:pPr>
   </w:style>
-  <w:style w:type="paragraph" w:customStyle="1" w:styleId="TituloPortada">
+  <w:style w:type="paragraph" w:styleId="TituloPortada" w:customStyle="1">
     <w:name w:val="Titulo Portada"/>
     <w:basedOn w:val="Normal"/>
     <w:rsid w:val="00C407C1"/>
@@ -21303,14 +21436,14 @@
       <w:lang w:val="es-419"/>
     </w:rPr>
   </w:style>
-  <w:style w:type="character" w:customStyle="1" w:styleId="Ttulo1Car">
+  <w:style w:type="character" w:styleId="Ttulo1Car" w:customStyle="1">
     <w:name w:val="Título 1 Car"/>
     <w:basedOn w:val="Fuentedeprrafopredeter"/>
     <w:link w:val="Ttulo1"/>
     <w:uiPriority w:val="9"/>
     <w:rsid w:val="004701C9"/>
     <w:rPr>
-      <w:rFonts w:ascii="Calibri" w:eastAsia="Times New Roman" w:hAnsi="Calibri" w:cs="Times New Roman (Títulos en alf"/>
+      <w:rFonts w:ascii="Calibri" w:hAnsi="Calibri" w:eastAsia="Times New Roman" w:cs="Times New Roman (Títulos en alf"/>
       <w:b/>
       <w:color w:val="000000" w:themeColor="text1"/>
       <w:spacing w:val="-10"/>
@@ -21322,14 +21455,14 @@
       <w14:ligatures w14:val="none"/>
     </w:rPr>
   </w:style>
-  <w:style w:type="character" w:customStyle="1" w:styleId="Ttulo2Car">
+  <w:style w:type="character" w:styleId="Ttulo2Car" w:customStyle="1">
     <w:name w:val="Título 2 Car"/>
     <w:basedOn w:val="Fuentedeprrafopredeter"/>
     <w:link w:val="Ttulo2"/>
     <w:uiPriority w:val="9"/>
     <w:rsid w:val="00121C7A"/>
     <w:rPr>
-      <w:rFonts w:ascii="Calibri" w:eastAsiaTheme="majorEastAsia" w:hAnsi="Calibri" w:cs="Calibri"/>
+      <w:rFonts w:ascii="Calibri" w:hAnsi="Calibri" w:cs="Calibri" w:eastAsiaTheme="majorEastAsia"/>
       <w:b/>
       <w:bCs/>
       <w:color w:val="000000"/>
@@ -21341,14 +21474,14 @@
       <w14:ligatures w14:val="none"/>
     </w:rPr>
   </w:style>
-  <w:style w:type="character" w:customStyle="1" w:styleId="Ttulo3Car">
+  <w:style w:type="character" w:styleId="Ttulo3Car" w:customStyle="1">
     <w:name w:val="Título 3 Car"/>
     <w:basedOn w:val="Fuentedeprrafopredeter"/>
     <w:link w:val="Ttulo3"/>
     <w:uiPriority w:val="9"/>
     <w:rsid w:val="00203367"/>
     <w:rPr>
-      <w:rFonts w:ascii="Calibri" w:eastAsiaTheme="majorEastAsia" w:hAnsi="Calibri" w:cstheme="majorBidi"/>
+      <w:rFonts w:ascii="Calibri" w:hAnsi="Calibri" w:eastAsiaTheme="majorEastAsia" w:cstheme="majorBidi"/>
       <w:b/>
       <w:iCs/>
       <w:color w:val="3B3838" w:themeColor="background2" w:themeShade="40"/>
@@ -21379,7 +21512,7 @@
       <w14:ligatures w14:val="none"/>
     </w:rPr>
   </w:style>
-  <w:style w:type="character" w:customStyle="1" w:styleId="Extranjerismo">
+  <w:style w:type="character" w:styleId="Extranjerismo" w:customStyle="1">
     <w:name w:val="Extranjerismo"/>
     <w:basedOn w:val="Fuentedeprrafopredeter"/>
     <w:uiPriority w:val="1"/>
@@ -21390,7 +21523,7 @@
       <w:lang w:val="en-US"/>
     </w:rPr>
   </w:style>
-  <w:style w:type="paragraph" w:customStyle="1" w:styleId="Figura">
+  <w:style w:type="paragraph" w:styleId="Figura" w:customStyle="1">
     <w:name w:val="Figura"/>
     <w:basedOn w:val="Normal"/>
     <w:next w:val="Normal"/>
@@ -21419,7 +21552,7 @@
       <w14:ligatures w14:val="none"/>
     </w:rPr>
   </w:style>
-  <w:style w:type="character" w:customStyle="1" w:styleId="FiguraCar">
+  <w:style w:type="character" w:styleId="FiguraCar" w:customStyle="1">
     <w:name w:val="Figura Car"/>
     <w:basedOn w:val="Fuentedeprrafopredeter"/>
     <w:link w:val="Figura"/>
@@ -21435,14 +21568,14 @@
       <w14:ligatures w14:val="none"/>
     </w:rPr>
   </w:style>
-  <w:style w:type="character" w:customStyle="1" w:styleId="Ttulo4Car">
+  <w:style w:type="character" w:styleId="Ttulo4Car" w:customStyle="1">
     <w:name w:val="Título 4 Car"/>
     <w:basedOn w:val="Fuentedeprrafopredeter"/>
     <w:link w:val="Ttulo4"/>
     <w:uiPriority w:val="9"/>
     <w:rsid w:val="001B57A6"/>
     <w:rPr>
-      <w:rFonts w:ascii="Calibri" w:eastAsiaTheme="majorEastAsia" w:hAnsi="Calibri" w:cstheme="majorBidi"/>
+      <w:rFonts w:ascii="Calibri" w:hAnsi="Calibri" w:eastAsiaTheme="majorEastAsia" w:cstheme="majorBidi"/>
       <w:b/>
       <w:color w:val="000000" w:themeColor="text1"/>
       <w:kern w:val="0"/>
@@ -21452,14 +21585,14 @@
       <w14:ligatures w14:val="none"/>
     </w:rPr>
   </w:style>
-  <w:style w:type="character" w:customStyle="1" w:styleId="Ttulo5Car">
+  <w:style w:type="character" w:styleId="Ttulo5Car" w:customStyle="1">
     <w:name w:val="Título 5 Car"/>
     <w:basedOn w:val="Fuentedeprrafopredeter"/>
     <w:link w:val="Ttulo5"/>
     <w:uiPriority w:val="9"/>
     <w:rsid w:val="00746AD1"/>
     <w:rPr>
-      <w:rFonts w:ascii="Calibri" w:eastAsiaTheme="majorEastAsia" w:hAnsi="Calibri" w:cstheme="majorBidi"/>
+      <w:rFonts w:ascii="Calibri" w:hAnsi="Calibri" w:eastAsiaTheme="majorEastAsia" w:cstheme="majorBidi"/>
       <w:b/>
       <w:color w:val="000000" w:themeColor="text1"/>
       <w:kern w:val="0"/>
@@ -21469,7 +21602,7 @@
       <w14:ligatures w14:val="none"/>
     </w:rPr>
   </w:style>
-  <w:style w:type="paragraph" w:customStyle="1" w:styleId="Tabla">
+  <w:style w:type="paragraph" w:styleId="Tabla" w:customStyle="1">
     <w:name w:val="Tabla"/>
     <w:basedOn w:val="Normal"/>
     <w:next w:val="Normal"/>
@@ -21505,28 +21638,28 @@
       <w:contextualSpacing/>
     </w:pPr>
     <w:rPr>
-      <w:rFonts w:asciiTheme="majorHAnsi" w:eastAsiaTheme="majorEastAsia" w:hAnsiTheme="majorHAnsi" w:cstheme="majorBidi"/>
+      <w:rFonts w:asciiTheme="majorHAnsi" w:hAnsiTheme="majorHAnsi" w:eastAsiaTheme="majorEastAsia" w:cstheme="majorBidi"/>
       <w:spacing w:val="-10"/>
       <w:kern w:val="28"/>
       <w:sz w:val="56"/>
       <w:szCs w:val="56"/>
     </w:rPr>
   </w:style>
-  <w:style w:type="character" w:customStyle="1" w:styleId="TtuloCar">
+  <w:style w:type="character" w:styleId="TtuloCar" w:customStyle="1">
     <w:name w:val="Título Car"/>
     <w:basedOn w:val="Fuentedeprrafopredeter"/>
     <w:link w:val="Ttulo"/>
     <w:uiPriority w:val="10"/>
     <w:rsid w:val="00590D20"/>
     <w:rPr>
-      <w:rFonts w:asciiTheme="majorHAnsi" w:eastAsiaTheme="majorEastAsia" w:hAnsiTheme="majorHAnsi" w:cstheme="majorBidi"/>
+      <w:rFonts w:asciiTheme="majorHAnsi" w:hAnsiTheme="majorHAnsi" w:eastAsiaTheme="majorEastAsia" w:cstheme="majorBidi"/>
       <w:spacing w:val="-10"/>
       <w:kern w:val="28"/>
       <w:sz w:val="56"/>
       <w:szCs w:val="56"/>
     </w:rPr>
   </w:style>
-  <w:style w:type="character" w:customStyle="1" w:styleId="TablaCar">
+  <w:style w:type="character" w:styleId="TablaCar" w:customStyle="1">
     <w:name w:val="Tabla Car"/>
     <w:basedOn w:val="Fuentedeprrafopredeter"/>
     <w:link w:val="Tabla"/>
@@ -21541,7 +21674,7 @@
       <w14:ligatures w14:val="none"/>
     </w:rPr>
   </w:style>
-  <w:style w:type="table" w:customStyle="1" w:styleId="SENA">
+  <w:style w:type="table" w:styleId="SENA" w:customStyle="1">
     <w:name w:val="SENA"/>
     <w:basedOn w:val="Tablanormal"/>
     <w:uiPriority w:val="99"/>
@@ -21558,18 +21691,18 @@
     <w:tblPr>
       <w:tblStyleRowBandSize w:val="1"/>
       <w:tblBorders>
-        <w:top w:val="single" w:sz="4" w:space="0" w:color="D9D9D9" w:themeColor="background1" w:themeShade="D9"/>
-        <w:left w:val="single" w:sz="4" w:space="0" w:color="D9D9D9" w:themeColor="background1" w:themeShade="D9"/>
-        <w:bottom w:val="single" w:sz="4" w:space="0" w:color="D9D9D9" w:themeColor="background1" w:themeShade="D9"/>
-        <w:right w:val="single" w:sz="4" w:space="0" w:color="D9D9D9" w:themeColor="background1" w:themeShade="D9"/>
-        <w:insideH w:val="single" w:sz="4" w:space="0" w:color="D9D9D9" w:themeColor="background1" w:themeShade="D9"/>
-        <w:insideV w:val="single" w:sz="4" w:space="0" w:color="D9D9D9" w:themeColor="background1" w:themeShade="D9"/>
+        <w:top w:val="single" w:color="D9D9D9" w:themeColor="background1" w:themeShade="D9" w:sz="4" w:space="0"/>
+        <w:left w:val="single" w:color="D9D9D9" w:themeColor="background1" w:themeShade="D9" w:sz="4" w:space="0"/>
+        <w:bottom w:val="single" w:color="D9D9D9" w:themeColor="background1" w:themeShade="D9" w:sz="4" w:space="0"/>
+        <w:right w:val="single" w:color="D9D9D9" w:themeColor="background1" w:themeShade="D9" w:sz="4" w:space="0"/>
+        <w:insideH w:val="single" w:color="D9D9D9" w:themeColor="background1" w:themeShade="D9" w:sz="4" w:space="0"/>
+        <w:insideV w:val="single" w:color="D9D9D9" w:themeColor="background1" w:themeShade="D9" w:sz="4" w:space="0"/>
       </w:tblBorders>
     </w:tblPr>
     <w:tblStylePr w:type="firstRow">
       <w:pPr>
         <w:wordWrap/>
-        <w:spacing w:beforeLines="0" w:before="120" w:beforeAutospacing="0" w:afterLines="0" w:after="120" w:afterAutospacing="0"/>
+        <w:spacing w:before="120" w:beforeLines="0" w:beforeAutospacing="0" w:after="120" w:afterLines="0" w:afterAutospacing="0"/>
       </w:pPr>
       <w:rPr>
         <w:b/>
@@ -21596,12 +21729,12 @@
     </w:pPr>
     <w:tblPr>
       <w:tblBorders>
-        <w:top w:val="single" w:sz="4" w:space="0" w:color="auto"/>
-        <w:left w:val="single" w:sz="4" w:space="0" w:color="auto"/>
-        <w:bottom w:val="single" w:sz="4" w:space="0" w:color="auto"/>
-        <w:right w:val="single" w:sz="4" w:space="0" w:color="auto"/>
-        <w:insideH w:val="single" w:sz="4" w:space="0" w:color="auto"/>
-        <w:insideV w:val="single" w:sz="4" w:space="0" w:color="auto"/>
+        <w:top w:val="single" w:color="auto" w:sz="4" w:space="0"/>
+        <w:left w:val="single" w:color="auto" w:sz="4" w:space="0"/>
+        <w:bottom w:val="single" w:color="auto" w:sz="4" w:space="0"/>
+        <w:right w:val="single" w:color="auto" w:sz="4" w:space="0"/>
+        <w:insideH w:val="single" w:color="auto" w:sz="4" w:space="0"/>
+        <w:insideV w:val="single" w:color="auto" w:sz="4" w:space="0"/>
       </w:tblBorders>
     </w:tblPr>
   </w:style>
@@ -21616,7 +21749,7 @@
       <w:u w:val="single"/>
     </w:rPr>
   </w:style>
-  <w:style w:type="paragraph" w:customStyle="1" w:styleId="Video">
+  <w:style w:type="paragraph" w:styleId="Video" w:customStyle="1">
     <w:name w:val="Video"/>
     <w:basedOn w:val="Normal"/>
     <w:next w:val="Normal"/>
@@ -21638,7 +21771,7 @@
       <w14:ligatures w14:val="none"/>
     </w:rPr>
   </w:style>
-  <w:style w:type="character" w:customStyle="1" w:styleId="VideoCar">
+  <w:style w:type="character" w:styleId="VideoCar" w:customStyle="1">
     <w:name w:val="Video Car"/>
     <w:basedOn w:val="Fuentedeprrafopredeter"/>
     <w:link w:val="Video"/>
@@ -21651,7 +21784,7 @@
       <w14:ligatures w14:val="none"/>
     </w:rPr>
   </w:style>
-  <w:style w:type="character" w:customStyle="1" w:styleId="Mencinsinresolver1">
+  <w:style w:type="character" w:styleId="Mencinsinresolver1" w:customStyle="1">
     <w:name w:val="Mención sin resolver1"/>
     <w:basedOn w:val="Fuentedeprrafopredeter"/>
     <w:uiPriority w:val="99"/>
@@ -21679,12 +21812,12 @@
       <w:tblStyleRowBandSize w:val="1"/>
       <w:tblStyleColBandSize w:val="1"/>
       <w:tblBorders>
-        <w:top w:val="single" w:sz="4" w:space="0" w:color="C9C9C9" w:themeColor="accent3" w:themeTint="99"/>
-        <w:left w:val="single" w:sz="4" w:space="0" w:color="C9C9C9" w:themeColor="accent3" w:themeTint="99"/>
-        <w:bottom w:val="single" w:sz="4" w:space="0" w:color="C9C9C9" w:themeColor="accent3" w:themeTint="99"/>
-        <w:right w:val="single" w:sz="4" w:space="0" w:color="C9C9C9" w:themeColor="accent3" w:themeTint="99"/>
-        <w:insideH w:val="single" w:sz="4" w:space="0" w:color="C9C9C9" w:themeColor="accent3" w:themeTint="99"/>
-        <w:insideV w:val="single" w:sz="4" w:space="0" w:color="C9C9C9" w:themeColor="accent3" w:themeTint="99"/>
+        <w:top w:val="single" w:color="C9C9C9" w:themeColor="accent3" w:themeTint="99" w:sz="4" w:space="0"/>
+        <w:left w:val="single" w:color="C9C9C9" w:themeColor="accent3" w:themeTint="99" w:sz="4" w:space="0"/>
+        <w:bottom w:val="single" w:color="C9C9C9" w:themeColor="accent3" w:themeTint="99" w:sz="4" w:space="0"/>
+        <w:right w:val="single" w:color="C9C9C9" w:themeColor="accent3" w:themeTint="99" w:sz="4" w:space="0"/>
+        <w:insideH w:val="single" w:color="C9C9C9" w:themeColor="accent3" w:themeTint="99" w:sz="4" w:space="0"/>
+        <w:insideV w:val="single" w:color="C9C9C9" w:themeColor="accent3" w:themeTint="99" w:sz="4" w:space="0"/>
       </w:tblBorders>
     </w:tblPr>
     <w:tblStylePr w:type="firstRow">
@@ -21696,10 +21829,10 @@
       <w:tblPr/>
       <w:tcPr>
         <w:tcBorders>
-          <w:top w:val="single" w:sz="4" w:space="0" w:color="A5A5A5" w:themeColor="accent3"/>
-          <w:left w:val="single" w:sz="4" w:space="0" w:color="A5A5A5" w:themeColor="accent3"/>
-          <w:bottom w:val="single" w:sz="4" w:space="0" w:color="A5A5A5" w:themeColor="accent3"/>
-          <w:right w:val="single" w:sz="4" w:space="0" w:color="A5A5A5" w:themeColor="accent3"/>
+          <w:top w:val="single" w:color="A5A5A5" w:themeColor="accent3" w:sz="4" w:space="0"/>
+          <w:left w:val="single" w:color="A5A5A5" w:themeColor="accent3" w:sz="4" w:space="0"/>
+          <w:bottom w:val="single" w:color="A5A5A5" w:themeColor="accent3" w:sz="4" w:space="0"/>
+          <w:right w:val="single" w:color="A5A5A5" w:themeColor="accent3" w:sz="4" w:space="0"/>
           <w:insideH w:val="nil"/>
           <w:insideV w:val="nil"/>
         </w:tcBorders>
@@ -21714,7 +21847,7 @@
       <w:tblPr/>
       <w:tcPr>
         <w:tcBorders>
-          <w:top w:val="double" w:sz="4" w:space="0" w:color="A5A5A5" w:themeColor="accent3"/>
+          <w:top w:val="double" w:color="A5A5A5" w:themeColor="accent3" w:sz="4" w:space="0"/>
         </w:tcBorders>
       </w:tcPr>
     </w:tblStylePr>
@@ -21743,7 +21876,7 @@
       </w:tcPr>
     </w:tblStylePr>
   </w:style>
-  <w:style w:type="paragraph" w:customStyle="1" w:styleId="Tablas">
+  <w:style w:type="paragraph" w:styleId="Tablas" w:customStyle="1">
     <w:name w:val="Tablas"/>
     <w:qFormat/>
     <w:rsid w:val="00CE2C4A"/>
@@ -21760,7 +21893,7 @@
       <w14:ligatures w14:val="none"/>
     </w:rPr>
   </w:style>
-  <w:style w:type="paragraph" w:customStyle="1" w:styleId="TextoTablas">
+  <w:style w:type="paragraph" w:styleId="TextoTablas" w:customStyle="1">
     <w:name w:val="Texto_Tablas"/>
     <w:basedOn w:val="Normal"/>
     <w:qFormat/>
@@ -21863,7 +21996,7 @@
       <w:spacing w:before="0" w:after="0" w:line="240" w:lineRule="auto"/>
     </w:pPr>
   </w:style>
-  <w:style w:type="character" w:customStyle="1" w:styleId="EncabezadoCar">
+  <w:style w:type="character" w:styleId="EncabezadoCar" w:customStyle="1">
     <w:name w:val="Encabezado Car"/>
     <w:basedOn w:val="Fuentedeprrafopredeter"/>
     <w:link w:val="Encabezado"/>
@@ -21888,7 +22021,7 @@
       <w:spacing w:before="0" w:after="0" w:line="240" w:lineRule="auto"/>
     </w:pPr>
   </w:style>
-  <w:style w:type="character" w:customStyle="1" w:styleId="PiedepginaCar">
+  <w:style w:type="character" w:styleId="PiedepginaCar" w:customStyle="1">
     <w:name w:val="Pie de página Car"/>
     <w:basedOn w:val="Fuentedeprrafopredeter"/>
     <w:link w:val="Piedepgina"/>
@@ -21898,7 +22031,7 @@
       <w:sz w:val="28"/>
     </w:rPr>
   </w:style>
-  <w:style w:type="character" w:customStyle="1" w:styleId="Ttulo6Car">
+  <w:style w:type="character" w:styleId="Ttulo6Car" w:customStyle="1">
     <w:name w:val="Título 6 Car"/>
     <w:basedOn w:val="Fuentedeprrafopredeter"/>
     <w:link w:val="Ttulo6"/>
@@ -21906,7 +22039,7 @@
     <w:semiHidden/>
     <w:rsid w:val="00C7377B"/>
     <w:rPr>
-      <w:rFonts w:ascii="Calibri" w:eastAsiaTheme="majorEastAsia" w:hAnsi="Calibri" w:cstheme="majorBidi"/>
+      <w:rFonts w:ascii="Calibri" w:hAnsi="Calibri" w:eastAsiaTheme="majorEastAsia" w:cstheme="majorBidi"/>
       <w:b/>
       <w:color w:val="000000" w:themeColor="text1"/>
       <w:kern w:val="0"/>
@@ -21927,7 +22060,7 @@
       <w:ind w:firstLine="0"/>
     </w:pPr>
     <w:rPr>
-      <w:rFonts w:ascii="Times New Roman" w:eastAsia="Times New Roman" w:hAnsi="Times New Roman" w:cs="Times New Roman"/>
+      <w:rFonts w:ascii="Times New Roman" w:hAnsi="Times New Roman" w:eastAsia="Times New Roman" w:cs="Times New Roman"/>
       <w:kern w:val="0"/>
       <w:sz w:val="24"/>
       <w:szCs w:val="24"/>
@@ -21935,7 +22068,7 @@
       <w14:ligatures w14:val="none"/>
     </w:rPr>
   </w:style>
-  <w:style w:type="paragraph" w:customStyle="1" w:styleId="TITULO2">
+  <w:style w:type="paragraph" w:styleId="TITULO2" w:customStyle="1">
     <w:name w:val="TITULO 2"/>
     <w:basedOn w:val="Normal"/>
     <w:next w:val="Normal"/>
@@ -21951,7 +22084,7 @@
       <w:b/>
     </w:rPr>
   </w:style>
-  <w:style w:type="character" w:customStyle="1" w:styleId="TITULO2Car">
+  <w:style w:type="character" w:styleId="TITULO2Car" w:customStyle="1">
     <w:name w:val="TITULO 2 Car"/>
     <w:basedOn w:val="Fuentedeprrafopredeter"/>
     <w:link w:val="TITULO2"/>
@@ -21961,12 +22094,12 @@
       <w:sz w:val="28"/>
     </w:rPr>
   </w:style>
-  <w:style w:type="character" w:customStyle="1" w:styleId="normaltextrun">
+  <w:style w:type="character" w:styleId="normaltextrun" w:customStyle="1">
     <w:name w:val="normaltextrun"/>
     <w:basedOn w:val="Fuentedeprrafopredeter"/>
     <w:rsid w:val="002B060B"/>
   </w:style>
-  <w:style w:type="paragraph" w:customStyle="1" w:styleId="paragraph">
+  <w:style w:type="paragraph" w:styleId="paragraph" w:customStyle="1">
     <w:name w:val="paragraph"/>
     <w:basedOn w:val="Normal"/>
     <w:rsid w:val="002B060B"/>
@@ -21975,7 +22108,7 @@
       <w:ind w:firstLine="0"/>
     </w:pPr>
     <w:rPr>
-      <w:rFonts w:ascii="Times New Roman" w:eastAsia="Times New Roman" w:hAnsi="Times New Roman" w:cs="Times New Roman"/>
+      <w:rFonts w:ascii="Times New Roman" w:hAnsi="Times New Roman" w:eastAsia="Times New Roman" w:cs="Times New Roman"/>
       <w:kern w:val="0"/>
       <w:sz w:val="24"/>
       <w:szCs w:val="24"/>
@@ -21983,7 +22116,7 @@
       <w14:ligatures w14:val="none"/>
     </w:rPr>
   </w:style>
-  <w:style w:type="character" w:customStyle="1" w:styleId="eop">
+  <w:style w:type="character" w:styleId="eop" w:customStyle="1">
     <w:name w:val="eop"/>
     <w:basedOn w:val="Fuentedeprrafopredeter"/>
     <w:rsid w:val="002B060B"/>
@@ -22012,7 +22145,7 @@
       <w:u w:val="single"/>
     </w:rPr>
   </w:style>
-  <w:style w:type="paragraph" w:customStyle="1" w:styleId="numero3">
+  <w:style w:type="paragraph" w:styleId="numero3" w:customStyle="1">
     <w:name w:val="numero 3"/>
     <w:basedOn w:val="Ttulo2"/>
     <w:link w:val="numero3Car"/>
@@ -22025,13 +22158,13 @@
       </w:numPr>
     </w:pPr>
   </w:style>
-  <w:style w:type="character" w:customStyle="1" w:styleId="numero3Car">
+  <w:style w:type="character" w:styleId="numero3Car" w:customStyle="1">
     <w:name w:val="numero 3 Car"/>
     <w:basedOn w:val="Ttulo2Car"/>
     <w:link w:val="numero3"/>
     <w:rsid w:val="00905315"/>
     <w:rPr>
-      <w:rFonts w:ascii="Calibri" w:eastAsiaTheme="majorEastAsia" w:hAnsi="Calibri" w:cs="Calibri"/>
+      <w:rFonts w:ascii="Calibri" w:hAnsi="Calibri" w:cs="Calibri" w:eastAsiaTheme="majorEastAsia"/>
       <w:b/>
       <w:bCs/>
       <w:color w:val="000000"/>
@@ -22043,7 +22176,7 @@
       <w14:ligatures w14:val="none"/>
     </w:rPr>
   </w:style>
-  <w:style w:type="table" w:customStyle="1" w:styleId="SENA2">
+  <w:style w:type="table" w:styleId="SENA2" w:customStyle="1">
     <w:name w:val="SENA2"/>
     <w:basedOn w:val="Tablanormal"/>
     <w:uiPriority w:val="99"/>
@@ -22060,18 +22193,18 @@
     <w:tblPr>
       <w:tblStyleRowBandSize w:val="1"/>
       <w:tblBorders>
-        <w:top w:val="single" w:sz="4" w:space="0" w:color="D9D9D9" w:themeColor="background1" w:themeShade="D9"/>
-        <w:left w:val="single" w:sz="4" w:space="0" w:color="D9D9D9" w:themeColor="background1" w:themeShade="D9"/>
-        <w:bottom w:val="single" w:sz="4" w:space="0" w:color="D9D9D9" w:themeColor="background1" w:themeShade="D9"/>
-        <w:right w:val="single" w:sz="4" w:space="0" w:color="D9D9D9" w:themeColor="background1" w:themeShade="D9"/>
-        <w:insideH w:val="single" w:sz="4" w:space="0" w:color="D9D9D9" w:themeColor="background1" w:themeShade="D9"/>
-        <w:insideV w:val="single" w:sz="4" w:space="0" w:color="D9D9D9" w:themeColor="background1" w:themeShade="D9"/>
+        <w:top w:val="single" w:color="D9D9D9" w:themeColor="background1" w:themeShade="D9" w:sz="4" w:space="0"/>
+        <w:left w:val="single" w:color="D9D9D9" w:themeColor="background1" w:themeShade="D9" w:sz="4" w:space="0"/>
+        <w:bottom w:val="single" w:color="D9D9D9" w:themeColor="background1" w:themeShade="D9" w:sz="4" w:space="0"/>
+        <w:right w:val="single" w:color="D9D9D9" w:themeColor="background1" w:themeShade="D9" w:sz="4" w:space="0"/>
+        <w:insideH w:val="single" w:color="D9D9D9" w:themeColor="background1" w:themeShade="D9" w:sz="4" w:space="0"/>
+        <w:insideV w:val="single" w:color="D9D9D9" w:themeColor="background1" w:themeShade="D9" w:sz="4" w:space="0"/>
       </w:tblBorders>
     </w:tblPr>
     <w:tblStylePr w:type="firstRow">
       <w:pPr>
         <w:wordWrap/>
-        <w:spacing w:beforeLines="0" w:before="120" w:beforeAutospacing="0" w:afterLines="0" w:after="120" w:afterAutospacing="0"/>
+        <w:spacing w:before="120" w:beforeLines="0" w:beforeAutospacing="0" w:after="120" w:afterLines="0" w:afterAutospacing="0"/>
       </w:pPr>
       <w:rPr>
         <w:b/>
@@ -22088,7 +22221,7 @@
       </w:tcPr>
     </w:tblStylePr>
   </w:style>
-  <w:style w:type="table" w:customStyle="1" w:styleId="SENA1">
+  <w:style w:type="table" w:styleId="SENA1" w:customStyle="1">
     <w:name w:val="SENA1"/>
     <w:basedOn w:val="Tablanormal"/>
     <w:uiPriority w:val="99"/>
@@ -22105,18 +22238,18 @@
     <w:tblPr>
       <w:tblStyleRowBandSize w:val="1"/>
       <w:tblBorders>
-        <w:top w:val="single" w:sz="4" w:space="0" w:color="D9D9D9" w:themeColor="background1" w:themeShade="D9"/>
-        <w:left w:val="single" w:sz="4" w:space="0" w:color="D9D9D9" w:themeColor="background1" w:themeShade="D9"/>
-        <w:bottom w:val="single" w:sz="4" w:space="0" w:color="D9D9D9" w:themeColor="background1" w:themeShade="D9"/>
-        <w:right w:val="single" w:sz="4" w:space="0" w:color="D9D9D9" w:themeColor="background1" w:themeShade="D9"/>
-        <w:insideH w:val="single" w:sz="4" w:space="0" w:color="D9D9D9" w:themeColor="background1" w:themeShade="D9"/>
-        <w:insideV w:val="single" w:sz="4" w:space="0" w:color="D9D9D9" w:themeColor="background1" w:themeShade="D9"/>
+        <w:top w:val="single" w:color="D9D9D9" w:themeColor="background1" w:themeShade="D9" w:sz="4" w:space="0"/>
+        <w:left w:val="single" w:color="D9D9D9" w:themeColor="background1" w:themeShade="D9" w:sz="4" w:space="0"/>
+        <w:bottom w:val="single" w:color="D9D9D9" w:themeColor="background1" w:themeShade="D9" w:sz="4" w:space="0"/>
+        <w:right w:val="single" w:color="D9D9D9" w:themeColor="background1" w:themeShade="D9" w:sz="4" w:space="0"/>
+        <w:insideH w:val="single" w:color="D9D9D9" w:themeColor="background1" w:themeShade="D9" w:sz="4" w:space="0"/>
+        <w:insideV w:val="single" w:color="D9D9D9" w:themeColor="background1" w:themeShade="D9" w:sz="4" w:space="0"/>
       </w:tblBorders>
     </w:tblPr>
     <w:tblStylePr w:type="firstRow">
       <w:pPr>
         <w:wordWrap/>
-        <w:spacing w:beforeLines="0" w:before="120" w:beforeAutospacing="0" w:afterLines="0" w:after="120" w:afterAutospacing="0"/>
+        <w:spacing w:before="120" w:beforeLines="0" w:beforeAutospacing="0" w:after="120" w:afterLines="0" w:afterAutospacing="0"/>
       </w:pPr>
       <w:rPr>
         <w:b/>
@@ -22137,7 +22270,7 @@
 </file>
 
 <file path=word/theme/theme1.xml><?xml version="1.0" encoding="utf-8"?>
-<a:theme xmlns:a="http://schemas.openxmlformats.org/drawingml/2006/main" name="Tema de Office">
+<a:theme xmlns:a="http://schemas.openxmlformats.org/drawingml/2006/main" xmlns:thm15="http://schemas.microsoft.com/office/thememl/2012/main" name="Tema de Office">
   <a:themeElements>
     <a:clrScheme name="Office">
       <a:dk1>
@@ -22456,8 +22589,8 @@
 </file>
 
 <file path=customXml/item4.xml><?xml version="1.0" encoding="utf-8"?>
-<ct:contentTypeSchema xmlns:ct="http://schemas.microsoft.com/office/2006/metadata/contentType" xmlns:ma="http://schemas.microsoft.com/office/2006/metadata/properties/metaAttributes" ct:_="" ma:_="" ma:contentTypeName="Documento" ma:contentTypeID="0x0101005D7421CBAB376F47AC1876466873BE0C" ma:contentTypeVersion="11" ma:contentTypeDescription="Crear nuevo documento." ma:contentTypeScope="" ma:versionID="c355e60b4cde5dbb71daba652f90dcaf">
-  <xsd:schema xmlns:xsd="http://www.w3.org/2001/XMLSchema" xmlns:xs="http://www.w3.org/2001/XMLSchema" xmlns:p="http://schemas.microsoft.com/office/2006/metadata/properties" xmlns:ns2="55abea07-cd72-4a95-add0-1082a24cf9e9" xmlns:ns3="285d351f-f218-493a-825f-85a9dfbde315" targetNamespace="http://schemas.microsoft.com/office/2006/metadata/properties" ma:root="true" ma:fieldsID="af45bf235921137d7bf462656222ea5a" ns2:_="" ns3:_="">
+<ct:contentTypeSchema xmlns:ct="http://schemas.microsoft.com/office/2006/metadata/contentType" xmlns:ma="http://schemas.microsoft.com/office/2006/metadata/properties/metaAttributes" ct:_="" ma:_="" ma:contentTypeName="Documento" ma:contentTypeID="0x0101005D7421CBAB376F47AC1876466873BE0C" ma:contentTypeVersion="11" ma:contentTypeDescription="Crear nuevo documento." ma:contentTypeScope="" ma:versionID="f360f8b6fb6f4c8bd21c6a7e407e2e16">
+  <xsd:schema xmlns:xsd="http://www.w3.org/2001/XMLSchema" xmlns:xs="http://www.w3.org/2001/XMLSchema" xmlns:p="http://schemas.microsoft.com/office/2006/metadata/properties" xmlns:ns2="55abea07-cd72-4a95-add0-1082a24cf9e9" xmlns:ns3="285d351f-f218-493a-825f-85a9dfbde315" targetNamespace="http://schemas.microsoft.com/office/2006/metadata/properties" ma:root="true" ma:fieldsID="45e32b76c8e436055369618aac27ad35" ns2:_="" ns3:_="">
     <xsd:import namespace="55abea07-cd72-4a95-add0-1082a24cf9e9"/>
     <xsd:import namespace="285d351f-f218-493a-825f-85a9dfbde315"/>
     <xsd:element name="properties">
@@ -22678,20 +22811,5 @@
 </file>
 
 <file path=customXml/itemProps4.xml><?xml version="1.0" encoding="utf-8"?>
-<ds:datastoreItem xmlns:ds="http://schemas.openxmlformats.org/officeDocument/2006/customXml" ds:itemID="{48FCF90B-C704-4E11-B413-315BC9A375B3}">
-  <ds:schemaRefs>
-    <ds:schemaRef ds:uri="http://schemas.microsoft.com/office/2006/metadata/contentType"/>
-    <ds:schemaRef ds:uri="http://schemas.microsoft.com/office/2006/metadata/properties/metaAttributes"/>
-    <ds:schemaRef ds:uri="http://www.w3.org/2001/XMLSchema"/>
-    <ds:schemaRef ds:uri="http://schemas.microsoft.com/office/2006/metadata/properties"/>
-    <ds:schemaRef ds:uri="55abea07-cd72-4a95-add0-1082a24cf9e9"/>
-    <ds:schemaRef ds:uri="285d351f-f218-493a-825f-85a9dfbde315"/>
-    <ds:schemaRef ds:uri="http://schemas.microsoft.com/office/2006/documentManagement/types"/>
-    <ds:schemaRef ds:uri="http://schemas.microsoft.com/office/infopath/2007/PartnerControls"/>
-    <ds:schemaRef ds:uri="http://schemas.openxmlformats.org/package/2006/metadata/core-properties"/>
-    <ds:schemaRef ds:uri="http://purl.org/dc/elements/1.1/"/>
-    <ds:schemaRef ds:uri="http://purl.org/dc/terms/"/>
-    <ds:schemaRef ds:uri="http://schemas.microsoft.com/internal/obd"/>
-  </ds:schemaRefs>
-</ds:datastoreItem>
+<ds:datastoreItem xmlns:ds="http://schemas.openxmlformats.org/officeDocument/2006/customXml" ds:itemID="{139F60C6-8D38-45AC-8FF4-AD5066CE0EED}"/>
 </file>
</xml_diff>